<commit_message>
feat: deploy admin dashboard v1.2 analytics and grants
</commit_message>
<xml_diff>
--- a/docs/ADMIN_ANALYTICS_DASHBOARD_DESIGN.docx
+++ b/docs/ADMIN_ANALYTICS_DASHBOARD_DESIGN.docx
@@ -31,7 +31,7 @@
           <w:color w:val="205C8E"/>
           <w:sz w:val="28"/>
         </w:rPr>
-        <w:t>F-ZC-ADMIN-001 · v1.1.2</w:t>
+        <w:t>F-ZC-ADMIN-001 · v1.2.0</w:t>
       </w:r>
     </w:p>
     <w:tbl>
@@ -267,7 +267,7 @@
                 <w:color w:val="183652"/>
                 <w:sz w:val="17"/>
               </w:rPr>
-              <w:t>v1.1.2</w:t>
+              <w:t>v1.2.0</w:t>
             </w:r>
           </w:p>
         </w:tc>
@@ -383,7 +383,7 @@
                 <w:color w:val="183652"/>
                 <w:sz w:val="17"/>
               </w:rPr>
-              <w:t>2026-08-14</w:t>
+              <w:t>2026-08-22</w:t>
             </w:r>
           </w:p>
         </w:tc>
@@ -1282,6 +1282,141 @@
           </w:p>
         </w:tc>
       </w:tr>
+      <w:tr>
+        <w:trPr>
+          <w:cantSplit/>
+        </w:trPr>
+        <w:tc>
+          <w:tcPr>
+            <w:tcW w:type="dxa" w:w="966"/>
+            <w:vAlign w:val="center"/>
+            <w:tcMar>
+              <w:top w:w="90" w:type="dxa"/>
+              <w:start w:w="90" w:type="dxa"/>
+              <w:bottom w:w="90" w:type="dxa"/>
+              <w:end w:w="90" w:type="dxa"/>
+            </w:tcMar>
+          </w:tcPr>
+          <w:p>
+            <w:pPr>
+              <w:spacing w:after="0" w:line="276" w:lineRule="auto"/>
+            </w:pPr>
+            <w:r>
+              <w:rPr>
+                <w:rFonts w:ascii="Microsoft YaHei" w:hAnsi="Microsoft YaHei" w:eastAsia="Microsoft YaHei" w:cs="Microsoft YaHei"/>
+                <w:b/>
+                <w:color w:val="183652"/>
+                <w:sz w:val="17"/>
+              </w:rPr>
+              <w:t>v1.2.0</w:t>
+            </w:r>
+          </w:p>
+        </w:tc>
+        <w:tc>
+          <w:tcPr>
+            <w:tcW w:type="dxa" w:w="1208"/>
+            <w:vAlign w:val="center"/>
+            <w:tcMar>
+              <w:top w:w="90" w:type="dxa"/>
+              <w:start w:w="90" w:type="dxa"/>
+              <w:bottom w:w="90" w:type="dxa"/>
+              <w:end w:w="90" w:type="dxa"/>
+            </w:tcMar>
+          </w:tcPr>
+          <w:p>
+            <w:pPr>
+              <w:spacing w:after="0" w:line="276" w:lineRule="auto"/>
+            </w:pPr>
+            <w:r>
+              <w:rPr>
+                <w:rFonts w:ascii="Microsoft YaHei" w:hAnsi="Microsoft YaHei" w:eastAsia="Microsoft YaHei" w:cs="Microsoft YaHei"/>
+                <w:b w:val="0"/>
+                <w:color w:val="183652"/>
+                <w:sz w:val="17"/>
+              </w:rPr>
+              <w:t>2026-08-22</w:t>
+            </w:r>
+          </w:p>
+        </w:tc>
+        <w:tc>
+          <w:tcPr>
+            <w:tcW w:type="dxa" w:w="1751"/>
+            <w:vAlign w:val="center"/>
+            <w:tcMar>
+              <w:top w:w="90" w:type="dxa"/>
+              <w:start w:w="90" w:type="dxa"/>
+              <w:bottom w:w="90" w:type="dxa"/>
+              <w:end w:w="90" w:type="dxa"/>
+            </w:tcMar>
+          </w:tcPr>
+          <w:p>
+            <w:pPr>
+              <w:spacing w:after="0" w:line="276" w:lineRule="auto"/>
+            </w:pPr>
+            <w:r>
+              <w:rPr>
+                <w:rFonts w:ascii="Microsoft YaHei" w:hAnsi="Microsoft YaHei" w:eastAsia="Microsoft YaHei" w:cs="Microsoft YaHei"/>
+                <w:b w:val="0"/>
+                <w:color w:val="183652"/>
+                <w:sz w:val="17"/>
+              </w:rPr>
+              <w:t>MATERIAL / IMPLEMENTATION_CONTRACT</w:t>
+            </w:r>
+          </w:p>
+        </w:tc>
+        <w:tc>
+          <w:tcPr>
+            <w:tcW w:type="dxa" w:w="3744"/>
+            <w:vAlign w:val="center"/>
+            <w:tcMar>
+              <w:top w:w="90" w:type="dxa"/>
+              <w:start w:w="90" w:type="dxa"/>
+              <w:bottom w:w="90" w:type="dxa"/>
+              <w:end w:w="90" w:type="dxa"/>
+            </w:tcMar>
+          </w:tcPr>
+          <w:p>
+            <w:pPr>
+              <w:spacing w:after="0" w:line="276" w:lineRule="auto"/>
+            </w:pPr>
+            <w:r>
+              <w:rPr>
+                <w:rFonts w:ascii="Microsoft YaHei" w:hAnsi="Microsoft YaHei" w:eastAsia="Microsoft YaHei" w:cs="Microsoft YaHei"/>
+                <w:b w:val="0"/>
+                <w:color w:val="183652"/>
+                <w:sz w:val="17"/>
+              </w:rPr>
+              <w:t>所有可上报的已完成战斗按 battle_type 入库；新增角色页与账号直达发放；阵容改为中文名段位列表；指定账号收敛为一次提交并修复跨服务 pending。</w:t>
+            </w:r>
+          </w:p>
+        </w:tc>
+        <w:tc>
+          <w:tcPr>
+            <w:tcW w:type="dxa" w:w="2536"/>
+            <w:vAlign w:val="center"/>
+            <w:tcMar>
+              <w:top w:w="90" w:type="dxa"/>
+              <w:start w:w="90" w:type="dxa"/>
+              <w:bottom w:w="90" w:type="dxa"/>
+              <w:end w:w="90" w:type="dxa"/>
+            </w:tcMar>
+          </w:tcPr>
+          <w:p>
+            <w:pPr>
+              <w:spacing w:after="0" w:line="276" w:lineRule="auto"/>
+            </w:pPr>
+            <w:r>
+              <w:rPr>
+                <w:rFonts w:ascii="Microsoft YaHei" w:hAnsi="Microsoft YaHei" w:eastAsia="Microsoft YaHei" w:cs="Microsoft YaHei"/>
+                <w:b w:val="0"/>
+                <w:color w:val="183652"/>
+                <w:sz w:val="17"/>
+              </w:rPr>
+              <w:t>沿用 v1.1.2 深色暖金组件体系；全账号群发继续保留强确认。</w:t>
+            </w:r>
+          </w:p>
+        </w:tc>
+      </w:tr>
     </w:tbl>
     <w:p>
       <w:pPr>
@@ -1314,7 +1449,7 @@
           <w:color w:val="183652"/>
           <w:sz w:val="21"/>
         </w:rPr>
-        <w:t>本文件是 F-ZC-ADMIN-001 v1.1.2 的 MATERIAL / IMPLEMENTATION_CONTRACT。它约束产品、前端、后台 API、资源命令执行器、阿里云部署和 QA；实现与本文件冲突时，必须先完成正式变更评审并同步本文与可编辑 Figma 源。</w:t>
+        <w:t>本文件是 F-ZC-ADMIN-001 v1.2.0 的 MATERIAL / IMPLEMENTATION_CONTRACT。它约束产品、前端、后台 API、战斗统计采集、资源命令执行器、阿里云部署和 QA；实现与本文件冲突时，必须先完成正式变更评审并同步本文与可编辑设计源。</w:t>
       </w:r>
     </w:p>
     <w:p>
@@ -1344,7 +1479,37 @@
           <w:color w:val="183652"/>
           <w:sz w:val="21"/>
         </w:rPr>
-        <w:t>查看当前投影中所有保存账号的阵容、卡牌等级、段位镜像、段位和资源摘要。</w:t>
+        <w:t>把全部已完成且具有在线认证会话、能够上报的经典、组队和六人乱斗战斗纳入统计，并为每条记录标记 battle_type 与 analytics_authority。</w:t>
+      </w:r>
+    </w:p>
+    <w:p>
+      <w:pPr>
+        <w:pStyle w:val="ListBullet"/>
+        <w:spacing w:after="100" w:line="307" w:lineRule="auto"/>
+      </w:pPr>
+      <w:r>
+        <w:rPr>
+          <w:rFonts w:ascii="Microsoft YaHei" w:hAnsi="Microsoft YaHei" w:eastAsia="Microsoft YaHei" w:cs="Microsoft YaHei"/>
+          <w:b w:val="0"/>
+          <w:color w:val="183652"/>
+          <w:sz w:val="21"/>
+        </w:rPr>
+        <w:t>角色页显示当前脱敏投影中的所有账号；Owner 可点击账号直接进入该账号的资源发放。</w:t>
+      </w:r>
+    </w:p>
+    <w:p>
+      <w:pPr>
+        <w:pStyle w:val="ListBullet"/>
+        <w:spacing w:after="100" w:line="307" w:lineRule="auto"/>
+      </w:pPr>
+      <w:r>
+        <w:rPr>
+          <w:rFonts w:ascii="Microsoft YaHei" w:hAnsi="Microsoft YaHei" w:eastAsia="Microsoft YaHei" w:cs="Microsoft YaHei"/>
+          <w:b w:val="0"/>
+          <w:color w:val="183652"/>
+          <w:sz w:val="21"/>
+        </w:rPr>
+        <w:t>阵容库以紧凑列表展示全部保存阵容，使用正式卡牌配置中的中文名，并按存储段位从高到低稳定排序。</w:t>
       </w:r>
     </w:p>
     <w:p>
@@ -1374,7 +1539,7 @@
           <w:color w:val="183652"/>
           <w:sz w:val="21"/>
         </w:rPr>
-        <w:t>把高风险资源操作限制为预览、重新认证、二次确认、提交四步，并显示目标数、不可撤销说明和状态回执。</w:t>
+        <w:t>指定账号资源发放只保留一次明确提交；全账号群发仍强制 Owner 密码与 SEND TO ALL，所有发放继续强制同源/CSRF、签名预览、冻结目标、幂等、审计与终态回执。</w:t>
       </w:r>
     </w:p>
     <w:p>
@@ -2295,7 +2460,7 @@
           <w:color w:val="183652"/>
           <w:sz w:val="21"/>
         </w:rPr>
-        <w:t>阵容库：当前投影内全部账号，本地搜索、分页、窄屏卡片、当前阵容和段位镜像。</w:t>
+        <w:t>角色：当前投影内全部账号、本地搜索和账号行直达发放，不做客户端分页截断。</w:t>
       </w:r>
     </w:p>
     <w:p>
@@ -2310,7 +2475,22 @@
           <w:color w:val="183652"/>
           <w:sz w:val="21"/>
         </w:rPr>
-        <w:t>Owner 资源发放：指定账号或全部账号，抽卡券或卡牌副本，原因、重新认证、二次确认、幂等键与命令回执。</w:t>
+        <w:t>阵容库：全部保存阵容的紧凑列表、中文卡牌名、等级与存储段位降序。</w:t>
+      </w:r>
+    </w:p>
+    <w:p>
+      <w:pPr>
+        <w:pStyle w:val="ListBullet"/>
+        <w:spacing w:after="100" w:line="307" w:lineRule="auto"/>
+      </w:pPr>
+      <w:r>
+        <w:rPr>
+          <w:rFonts w:ascii="Microsoft YaHei" w:hAnsi="Microsoft YaHei" w:eastAsia="Microsoft YaHei" w:cs="Microsoft YaHei"/>
+          <w:b w:val="0"/>
+          <w:color w:val="183652"/>
+          <w:sz w:val="21"/>
+        </w:rPr>
+        <w:t>Owner 资源发放：指定账号一次提交；全部账号保留密码重认证与 SEND TO ALL；两者均含原因、幂等键与终态回执。</w:t>
       </w:r>
     </w:p>
     <w:p>
@@ -2641,7 +2821,7 @@
                 <w:color w:val="183652"/>
                 <w:sz w:val="17"/>
               </w:rPr>
-              <w:t>总览、动物平衡、阵容库</w:t>
+              <w:t>总览、动物平衡、角色、阵容库</w:t>
             </w:r>
           </w:p>
         </w:tc>
@@ -2667,7 +2847,7 @@
                 <w:color w:val="183652"/>
                 <w:sz w:val="17"/>
               </w:rPr>
-              <w:t>能解释指标口径并提出有样本依据的调整建议。</w:t>
+              <w:t>能按战斗类型解释指标口径并提出有样本依据的调整建议。</w:t>
             </w:r>
           </w:p>
         </w:tc>
@@ -2753,7 +2933,7 @@
                 <w:color w:val="183652"/>
                 <w:sz w:val="17"/>
               </w:rPr>
-              <w:t>全部六页</w:t>
+              <w:t>全部七页</w:t>
             </w:r>
           </w:p>
         </w:tc>
@@ -2780,7 +2960,7 @@
                 <w:color w:val="183652"/>
                 <w:sz w:val="17"/>
               </w:rPr>
-              <w:t>资源指令有明确目标、原因、重新认证、二次确认、幂等键和终态回执。</w:t>
+              <w:t>指定账号一次提交；全账号强确认；所有指令有明确目标、原因、幂等键和终态回执。</w:t>
             </w:r>
           </w:p>
         </w:tc>
@@ -3085,6 +3265,21 @@
           <w:color w:val="183652"/>
           <w:sz w:val="21"/>
         </w:rPr>
+        <w:t>角色</w:t>
+      </w:r>
+    </w:p>
+    <w:p>
+      <w:pPr>
+        <w:pStyle w:val="ListNumber"/>
+        <w:spacing w:after="100" w:line="307" w:lineRule="auto"/>
+      </w:pPr>
+      <w:r>
+        <w:rPr>
+          <w:rFonts w:ascii="Microsoft YaHei" w:hAnsi="Microsoft YaHei" w:eastAsia="Microsoft YaHei" w:cs="Microsoft YaHei"/>
+          <w:b w:val="0"/>
+          <w:color w:val="183652"/>
+          <w:sz w:val="21"/>
+        </w:rPr>
         <w:t>阵容库</w:t>
       </w:r>
     </w:p>
@@ -3144,7 +3339,7 @@
           <w:color w:val="183652"/>
           <w:sz w:val="21"/>
         </w:rPr>
-        <w:t>前三页对 Analyst 与 Owner 可见；后三页只向 Owner 渲染，但隐藏导航不是权限边界，API 必须再次校验 Owner。主导航使用 ARIA tablist / tab / tabpanel，支持左右方向键、Home、End 与焦点迁移。</w:t>
+        <w:t>前四页对 Analyst 与 Owner 可见；后三页只向 Owner 渲染，但隐藏导航不是权限边界，API 必须再次校验 Owner。主导航使用 ARIA tablist / tab / tabpanel，支持左右方向键、Home、End 与焦点迁移。</w:t>
       </w:r>
     </w:p>
     <w:p>
@@ -3204,7 +3399,7 @@
           <w:color w:val="183652"/>
           <w:sz w:val="21"/>
         </w:rPr>
-        <w:t>默认进入总览；用户可通过鼠标或键盘切换动物平衡与阵容库。</w:t>
+        <w:t>默认进入总览；用户可通过鼠标或键盘切换动物平衡、角色与阵容库。</w:t>
       </w:r>
     </w:p>
     <w:p>
@@ -3393,7 +3588,7 @@
                 <w:color w:val="183652"/>
                 <w:sz w:val="17"/>
               </w:rPr>
-              <w:t>1 预览</w:t>
+              <w:t>1 填写</w:t>
             </w:r>
           </w:p>
         </w:tc>
@@ -3419,7 +3614,7 @@
                 <w:color w:val="183652"/>
                 <w:sz w:val="17"/>
               </w:rPr>
-              <w:t>选择指定账号/全部账号、资源类型、数量、卡牌 ID、原因。</w:t>
+              <w:t>从角色行进入指定账号，或在资源页选择指定/全部账号；填写资源、数量和原因。</w:t>
             </w:r>
           </w:p>
         </w:tc>
@@ -3445,7 +3640,7 @@
                 <w:color w:val="183652"/>
                 <w:sz w:val="17"/>
               </w:rPr>
-              <w:t>显示目标数、资源摘要、原因与本次 idempotency_key。</w:t>
+              <w:t>页面明确显示目标与影响范围。</w:t>
             </w:r>
           </w:p>
         </w:tc>
@@ -3471,7 +3666,7 @@
                 <w:color w:val="183652"/>
                 <w:sz w:val="17"/>
               </w:rPr>
-              <w:t>不得在此步创建命令。</w:t>
+              <w:t>不得在字段不完整时请求服务器预览。</w:t>
             </w:r>
           </w:p>
         </w:tc>
@@ -3503,7 +3698,7 @@
                 <w:color w:val="183652"/>
                 <w:sz w:val="17"/>
               </w:rPr>
-              <w:t>2 重新认证</w:t>
+              <w:t>2 指定账号</w:t>
             </w:r>
           </w:p>
         </w:tc>
@@ -3530,7 +3725,7 @@
                 <w:color w:val="183652"/>
                 <w:sz w:val="17"/>
               </w:rPr>
-              <w:t>输入当前 Owner 密码。</w:t>
+              <w:t>点击一次“确认发放”；前端取得服务器签名预览后，用同一幂等键立即提交。</w:t>
             </w:r>
           </w:p>
         </w:tc>
@@ -3557,7 +3752,7 @@
                 <w:color w:val="183652"/>
                 <w:sz w:val="17"/>
               </w:rPr>
-              <w:t>密码仅进入本次 HTTPS 请求，不进入前端 state、日志或回显。</w:t>
+              <w:t>服务器冻结单一 user_id 并返回 command_id；不再要求第二次输入密码或 SEND。</w:t>
             </w:r>
           </w:p>
         </w:tc>
@@ -3584,7 +3779,7 @@
                 <w:color w:val="183652"/>
                 <w:sz w:val="17"/>
               </w:rPr>
-              <w:t>不得复用登录表单缓存或保存密码。</w:t>
+              <w:t>不得绕过 Owner、同源/CSRF、预览签名、幂等与审计。</w:t>
             </w:r>
           </w:p>
         </w:tc>
@@ -3615,7 +3810,7 @@
                 <w:color w:val="183652"/>
                 <w:sz w:val="17"/>
               </w:rPr>
-              <w:t>3 二次确认</w:t>
+              <w:t>3 全部账号</w:t>
             </w:r>
           </w:p>
         </w:tc>
@@ -3641,7 +3836,7 @@
                 <w:color w:val="183652"/>
                 <w:sz w:val="17"/>
               </w:rPr>
-              <w:t>指定账号输入 SEND；全部账号准确输入 SEND TO ALL。</w:t>
+              <w:t>生成服务器预览后显示冻结目标数；Owner 输入当前密码和 SEND TO ALL 再提交。</w:t>
             </w:r>
           </w:p>
         </w:tc>
@@ -3667,7 +3862,7 @@
                 <w:color w:val="183652"/>
                 <w:sz w:val="17"/>
               </w:rPr>
-              <w:t>全服再次显示快照目标数和不可撤销警告。</w:t>
+              <w:t>密码错误、确认文本错误或目标集合变化均拒绝，且不入队。</w:t>
             </w:r>
           </w:p>
         </w:tc>
@@ -3693,7 +3888,7 @@
                 <w:color w:val="183652"/>
                 <w:sz w:val="17"/>
               </w:rPr>
-              <w:t>大小写或空格不匹配时不得提交。</w:t>
+              <w:t>不得把单账号的一次提交规则扩展成无保护群发。</w:t>
             </w:r>
           </w:p>
         </w:tc>
@@ -3725,7 +3920,7 @@
                 <w:color w:val="183652"/>
                 <w:sz w:val="17"/>
               </w:rPr>
-              <w:t>4 提交</w:t>
+              <w:t>4 终态回执</w:t>
             </w:r>
           </w:p>
         </w:tc>
@@ -3752,7 +3947,7 @@
                 <w:color w:val="183652"/>
                 <w:sz w:val="17"/>
               </w:rPr>
-              <w:t>POST /api/resource-grants。</w:t>
+              <w:t>自动短轮询同一 command_id，直到 processed/failed 或超时。</w:t>
             </w:r>
           </w:p>
         </w:tc>
@@ -3779,7 +3974,7 @@
                 <w:color w:val="183652"/>
                 <w:sz w:val="17"/>
               </w:rPr>
-              <w:t>显示 command_id、status、target_count、idempotency_key 和创建时间。</w:t>
+              <w:t>processed 才显示已到账；短暂 pending 只显示一条处理中状态。</w:t>
             </w:r>
           </w:p>
         </w:tc>
@@ -3806,7 +4001,7 @@
                 <w:color w:val="183652"/>
                 <w:sz w:val="17"/>
               </w:rPr>
-              <w:t>不得把 pending 当成到账；不得因超时生成新幂等键。</w:t>
+              <w:t>不得把 pending/queued 当成功，也不得堆叠重复状态卡。</w:t>
             </w:r>
           </w:p>
         </w:tc>
@@ -4330,6 +4525,90 @@
                 <w:color w:val="183652"/>
                 <w:sz w:val="17"/>
               </w:rPr>
+              <w:t>战斗类型</w:t>
+            </w:r>
+          </w:p>
+        </w:tc>
+        <w:tc>
+          <w:tcPr>
+            <w:tcW w:type="dxa" w:w="3911"/>
+            <w:vAlign w:val="center"/>
+            <w:tcMar>
+              <w:top w:w="90" w:type="dxa"/>
+              <w:start w:w="90" w:type="dxa"/>
+              <w:bottom w:w="90" w:type="dxa"/>
+              <w:end w:w="90" w:type="dxa"/>
+            </w:tcMar>
+          </w:tcPr>
+          <w:p>
+            <w:pPr>
+              <w:spacing w:after="0" w:line="276" w:lineRule="auto"/>
+            </w:pPr>
+            <w:r>
+              <w:rPr>
+                <w:rFonts w:ascii="Microsoft YaHei" w:hAnsi="Microsoft YaHei" w:eastAsia="Microsoft YaHei" w:cs="Microsoft YaHei"/>
+                <w:b w:val="0"/>
+                <w:color w:val="183652"/>
+                <w:sz w:val="17"/>
+              </w:rPr>
+              <w:t>按 classic_ranked_ai、multiplayer_1v1/2v2/3v3、free_for_all_6、legacy_unknown 汇总。</w:t>
+            </w:r>
+          </w:p>
+        </w:tc>
+        <w:tc>
+          <w:tcPr>
+            <w:tcW w:type="dxa" w:w="4827"/>
+            <w:vAlign w:val="center"/>
+            <w:tcMar>
+              <w:top w:w="90" w:type="dxa"/>
+              <w:start w:w="90" w:type="dxa"/>
+              <w:bottom w:w="90" w:type="dxa"/>
+              <w:end w:w="90" w:type="dxa"/>
+            </w:tcMar>
+          </w:tcPr>
+          <w:p>
+            <w:pPr>
+              <w:spacing w:after="0" w:line="276" w:lineRule="auto"/>
+            </w:pPr>
+            <w:r>
+              <w:rPr>
+                <w:rFonts w:ascii="Microsoft YaHei" w:hAnsi="Microsoft YaHei" w:eastAsia="Microsoft YaHei" w:cs="Microsoft YaHei"/>
+                <w:b w:val="0"/>
+                <w:color w:val="183652"/>
+                <w:sz w:val="17"/>
+              </w:rPr>
+              <w:t>总数等于各类型之和；旧记录不伪造类型。</w:t>
+            </w:r>
+          </w:p>
+        </w:tc>
+      </w:tr>
+      <w:tr>
+        <w:trPr>
+          <w:cantSplit/>
+        </w:trPr>
+        <w:tc>
+          <w:tcPr>
+            <w:tcW w:type="dxa" w:w="1467"/>
+            <w:vAlign w:val="center"/>
+            <w:shd w:fill="F8FAFC"/>
+            <w:tcMar>
+              <w:top w:w="90" w:type="dxa"/>
+              <w:start w:w="90" w:type="dxa"/>
+              <w:bottom w:w="90" w:type="dxa"/>
+              <w:end w:w="90" w:type="dxa"/>
+            </w:tcMar>
+          </w:tcPr>
+          <w:p>
+            <w:pPr>
+              <w:spacing w:after="0" w:line="276" w:lineRule="auto"/>
+            </w:pPr>
+            <w:r>
+              <w:rPr>
+                <w:rFonts w:ascii="Microsoft YaHei" w:hAnsi="Microsoft YaHei" w:eastAsia="Microsoft YaHei" w:cs="Microsoft YaHei"/>
+                <w:b/>
+                <w:color w:val="183652"/>
+                <w:sz w:val="17"/>
+              </w:rPr>
               <w:t>最近对局</w:t>
             </w:r>
           </w:p>
@@ -4338,6 +4617,7 @@
           <w:tcPr>
             <w:tcW w:type="dxa" w:w="3911"/>
             <w:vAlign w:val="center"/>
+            <w:shd w:fill="F8FAFC"/>
             <w:tcMar>
               <w:top w:w="90" w:type="dxa"/>
               <w:start w:w="90" w:type="dxa"/>
@@ -4356,7 +4636,7 @@
                 <w:color w:val="183652"/>
                 <w:sz w:val="17"/>
               </w:rPr>
-              <w:t>地图、时间、参赛者与胜负。</w:t>
+              <w:t>战斗类型、采集权威、地图、时间、参赛者与胜负。</w:t>
             </w:r>
           </w:p>
         </w:tc>
@@ -4364,6 +4644,7 @@
           <w:tcPr>
             <w:tcW w:type="dxa" w:w="4827"/>
             <w:vAlign w:val="center"/>
+            <w:shd w:fill="F8FAFC"/>
             <w:tcMar>
               <w:top w:w="90" w:type="dxa"/>
               <w:start w:w="90" w:type="dxa"/>
@@ -4419,7 +4700,7 @@
           <w:color w:val="183652"/>
           <w:sz w:val="21"/>
         </w:rPr>
-        <w:t>动物按 average_placement 升序展示；无排名样本的动物置后。信号和置信度由服务端计算，前端只翻译与呈现，不在浏览器内重新判定增强/削弱。所有建议都必须回到正式配置评审、验证、导出和发布流程。</w:t>
+        <w:t>动物可按全部战斗或单一 battle_type 查看，并按 average_placement 升序展示；无排名样本的动物置后。不同规则模式不混作同质样本：每个类型独立给出样本、区间与建议，总计只用于覆盖观察。信号和置信度由服务端计算，前端只翻译与呈现，不在浏览器内重新判定增强/削弱。</w:t>
       </w:r>
     </w:p>
     <w:p>
@@ -4495,7 +4776,7 @@
           <w:color w:val="205C8E"/>
           <w:sz w:val="27"/>
         </w:rPr>
-        <w:t>4.3 阵容库</w:t>
+        <w:t>4.3 角色</w:t>
       </w:r>
     </w:p>
     <w:p>
@@ -4509,7 +4790,36 @@
           <w:color w:val="183652"/>
           <w:sz w:val="21"/>
         </w:rPr>
-        <w:t>阵容库展示 admin_accounts_snapshot.json 中全部保存账号。搜索只在当前脱敏投影中执行，分页不改变服务端数据；完整 user_id 仅供授权运营核对，masked_account 作为主要显示身份。卡组、等级、段位镜像、段位与资源摘要缺失时显示空状态。</w:t>
+        <w:t>角色页展示 admin_accounts_snapshot.json 中全部脱敏账号，不以是否有战斗样本或是否保存非空阵容作为过滤条件。支持本地搜索且不做客户端分页截断；Owner 可从任一账号行点击“发放资源”，资源页随即预选该 user_id。Analyst 只能查看，服务端仍拒绝其资源写请求。</w:t>
+      </w:r>
+    </w:p>
+    <w:p>
+      <w:pPr>
+        <w:pStyle w:val="Heading2"/>
+        <w:pageBreakBefore w:val="0"/>
+      </w:pPr>
+      <w:r>
+        <w:rPr>
+          <w:rFonts w:ascii="Microsoft YaHei" w:hAnsi="Microsoft YaHei" w:eastAsia="Microsoft YaHei" w:cs="Microsoft YaHei"/>
+          <w:b/>
+          <w:color w:val="205C8E"/>
+          <w:sz w:val="27"/>
+        </w:rPr>
+        <w:t>4.4 阵容库</w:t>
+      </w:r>
+    </w:p>
+    <w:p>
+      <w:pPr>
+        <w:spacing w:after="100" w:line="307" w:lineRule="auto"/>
+      </w:pPr>
+      <w:r>
+        <w:rPr>
+          <w:rFonts w:ascii="Microsoft YaHei" w:hAnsi="Microsoft YaHei" w:eastAsia="Microsoft YaHei" w:cs="Microsoft YaHei"/>
+          <w:b w:val="0"/>
+          <w:color w:val="183652"/>
+          <w:sz w:val="21"/>
+        </w:rPr>
+        <w:t>阵容库使用紧凑表格/列表展示投影中的全部非空保存阵容，不再使用大卡片墙。排序固定为存储段位等级降序、rank_stars 降序、elo 降序、user_id 升序；每张卡牌优先由 admin_accounts_snapshot.json 的 card_names 正式目录映射中文名，并同时保留 card_id 与等级供核对。未知 ID 明确显示 card_id，不伪造中文名。</w:t>
       </w:r>
     </w:p>
     <w:p>
@@ -4585,7 +4895,7 @@
           <w:color w:val="205C8E"/>
           <w:sz w:val="27"/>
         </w:rPr>
-        <w:t>4.4 Owner 资源发放</w:t>
+        <w:t>4.5 Owner 资源发放</w:t>
       </w:r>
     </w:p>
     <w:p>
@@ -4599,7 +4909,7 @@
           <w:color w:val="183652"/>
           <w:sz w:val="21"/>
         </w:rPr>
-        <w:t>资源页首先加载账号投影以得到可选择目标和全服目标数。账号投影不是 ready 或账号数为 0 时，全服和指定发放都 fail closed。提交后的状态卡属于命令接收回执，不是资源到账证明。</w:t>
+        <w:t>资源页首先加载账号投影以得到可选择目标和全服目标数。账号投影不是 ready 或账号数为 0 时，全服和指定发放都 fail closed。指定账号只需一次明确提交，页面内部取得短期签名预览后立即提交冻结负载；全账号预览则必须显示冻结目标数，并要求 Owner 密码重认证和 SEND TO ALL。提交后自动查询同一 command_id：processed 才显示已到账，failed 显示安全错误，pending 只保留单一处理中摘要。</w:t>
       </w:r>
     </w:p>
     <w:p>
@@ -4675,7 +4985,7 @@
           <w:color w:val="205C8E"/>
           <w:sz w:val="27"/>
         </w:rPr>
-        <w:t>4.5 Owner 任务与审计</w:t>
+        <w:t>4.6 Owner 任务与审计</w:t>
       </w:r>
     </w:p>
     <w:p>
@@ -4690,7 +5000,7 @@
           <w:color w:val="183652"/>
           <w:sz w:val="21"/>
         </w:rPr>
-        <w:t>资源任务表显示 command_id、pending/processed/failed、目标、资源、目标数、创建者、时间和错误摘要。</w:t>
+        <w:t>资源任务默认显示最近终态；仍未终结的 pending 单独置顶且每个 command_id 只出现一次，不堆叠重复状态。</w:t>
       </w:r>
     </w:p>
     <w:p>
@@ -4750,7 +5060,7 @@
           <w:color w:val="205C8E"/>
           <w:sz w:val="27"/>
         </w:rPr>
-        <w:t>4.6 Owner 权限</w:t>
+        <w:t>4.7 Owner 权限</w:t>
       </w:r>
     </w:p>
     <w:p>
@@ -4825,7 +5135,7 @@
           <w:color w:val="205C8E"/>
           <w:sz w:val="27"/>
         </w:rPr>
-        <w:t>4.7 Figma 同步登记</w:t>
+        <w:t>4.8 Figma 同步登记</w:t>
       </w:r>
     </w:p>
     <w:p>
@@ -5659,6 +5969,116 @@
                 <w:color w:val="183652"/>
                 <w:sz w:val="17"/>
               </w:rPr>
+              <w:t>v1.2 行为修订</w:t>
+            </w:r>
+          </w:p>
+        </w:tc>
+        <w:tc>
+          <w:tcPr>
+            <w:tcW w:type="dxa" w:w="1671"/>
+            <w:vAlign w:val="center"/>
+            <w:tcMar>
+              <w:top w:w="90" w:type="dxa"/>
+              <w:start w:w="90" w:type="dxa"/>
+              <w:bottom w:w="90" w:type="dxa"/>
+              <w:end w:w="90" w:type="dxa"/>
+            </w:tcMar>
+          </w:tcPr>
+          <w:p>
+            <w:pPr>
+              <w:spacing w:after="0" w:line="276" w:lineRule="auto"/>
+            </w:pPr>
+            <w:r>
+              <w:rPr>
+                <w:rFonts w:ascii="Microsoft YaHei" w:hAnsi="Microsoft YaHei" w:eastAsia="Microsoft YaHei" w:cs="Microsoft YaHei"/>
+                <w:b w:val="0"/>
+                <w:color w:val="183652"/>
+                <w:sz w:val="17"/>
+              </w:rPr>
+              <w:t>沿用 10:33–10:36</w:t>
+            </w:r>
+          </w:p>
+        </w:tc>
+        <w:tc>
+          <w:tcPr>
+            <w:tcW w:type="dxa" w:w="2089"/>
+            <w:vAlign w:val="center"/>
+            <w:tcMar>
+              <w:top w:w="90" w:type="dxa"/>
+              <w:start w:w="90" w:type="dxa"/>
+              <w:bottom w:w="90" w:type="dxa"/>
+              <w:end w:w="90" w:type="dxa"/>
+            </w:tcMar>
+          </w:tcPr>
+          <w:p>
+            <w:pPr>
+              <w:spacing w:after="0" w:line="276" w:lineRule="auto"/>
+            </w:pPr>
+            <w:r>
+              <w:rPr>
+                <w:rFonts w:ascii="Microsoft YaHei" w:hAnsi="Microsoft YaHei" w:eastAsia="Microsoft YaHei" w:cs="Microsoft YaHei"/>
+                <w:b w:val="0"/>
+                <w:color w:val="183652"/>
+                <w:sz w:val="17"/>
+              </w:rPr>
+              <w:t>合同已更新</w:t>
+            </w:r>
+          </w:p>
+        </w:tc>
+        <w:tc>
+          <w:tcPr>
+            <w:tcW w:type="dxa" w:w="4714"/>
+            <w:vAlign w:val="center"/>
+            <w:tcMar>
+              <w:top w:w="90" w:type="dxa"/>
+              <w:start w:w="90" w:type="dxa"/>
+              <w:bottom w:w="90" w:type="dxa"/>
+              <w:end w:w="90" w:type="dxa"/>
+            </w:tcMar>
+          </w:tcPr>
+          <w:p>
+            <w:pPr>
+              <w:spacing w:after="0" w:line="276" w:lineRule="auto"/>
+            </w:pPr>
+            <w:r>
+              <w:rPr>
+                <w:rFonts w:ascii="Microsoft YaHei" w:hAnsi="Microsoft YaHei" w:eastAsia="Microsoft YaHei" w:cs="Microsoft YaHei"/>
+                <w:b w:val="0"/>
+                <w:color w:val="183652"/>
+                <w:sz w:val="17"/>
+              </w:rPr>
+              <w:t>不改变品牌和组件基线；新增角色页、列表阵容、战斗类型筛选、指定账号一次提交与全账号强确认状态。</w:t>
+            </w:r>
+          </w:p>
+        </w:tc>
+      </w:tr>
+      <w:tr>
+        <w:trPr>
+          <w:cantSplit/>
+        </w:trPr>
+        <w:tc>
+          <w:tcPr>
+            <w:tcW w:type="dxa" w:w="1731"/>
+            <w:vAlign w:val="center"/>
+            <w:shd w:fill="F8FAFC"/>
+            <w:tcMar>
+              <w:top w:w="90" w:type="dxa"/>
+              <w:start w:w="90" w:type="dxa"/>
+              <w:bottom w:w="90" w:type="dxa"/>
+              <w:end w:w="90" w:type="dxa"/>
+            </w:tcMar>
+          </w:tcPr>
+          <w:p>
+            <w:pPr>
+              <w:spacing w:after="0" w:line="276" w:lineRule="auto"/>
+            </w:pPr>
+            <w:r>
+              <w:rPr>
+                <w:rFonts w:ascii="Microsoft YaHei" w:hAnsi="Microsoft YaHei" w:eastAsia="Microsoft YaHei" w:cs="Microsoft YaHei"/>
+                <w:b/>
+                <w:color w:val="183652"/>
+                <w:sz w:val="17"/>
+              </w:rPr>
               <w:t>任务/权限</w:t>
             </w:r>
           </w:p>
@@ -5667,6 +6087,7 @@
           <w:tcPr>
             <w:tcW w:type="dxa" w:w="1671"/>
             <w:vAlign w:val="center"/>
+            <w:shd w:fill="F8FAFC"/>
             <w:tcMar>
               <w:top w:w="90" w:type="dxa"/>
               <w:start w:w="90" w:type="dxa"/>
@@ -5693,6 +6114,7 @@
           <w:tcPr>
             <w:tcW w:type="dxa" w:w="2089"/>
             <w:vAlign w:val="center"/>
+            <w:shd w:fill="F8FAFC"/>
             <w:tcMar>
               <w:top w:w="90" w:type="dxa"/>
               <w:start w:w="90" w:type="dxa"/>
@@ -5719,6 +6141,7 @@
           <w:tcPr>
             <w:tcW w:type="dxa" w:w="4714"/>
             <w:vAlign w:val="center"/>
+            <w:shd w:fill="F8FAFC"/>
             <w:tcMar>
               <w:top w:w="90" w:type="dxa"/>
               <w:start w:w="90" w:type="dxa"/>
@@ -5760,7 +6183,7 @@
           <w:color w:val="205C8E"/>
           <w:sz w:val="27"/>
         </w:rPr>
-        <w:t>4.8 v1.1.2 视觉风格与排版契约</w:t>
+        <w:t>4.9 v1.2 视觉风格与排版契约</w:t>
       </w:r>
     </w:p>
     <w:p>
@@ -6004,7 +6427,7 @@
                 <w:color w:val="183652"/>
                 <w:sz w:val="17"/>
               </w:rPr>
-              <w:t>桌面端品牌、六页主导航和账号工具同处紧凑顶栏；当前页用暖金文字与下划线表达。</w:t>
+              <w:t>桌面端品牌、七页主导航和账号工具同处紧凑顶栏；当前页用暖金文字与下划线表达。</w:t>
             </w:r>
           </w:p>
         </w:tc>
@@ -6403,7 +6826,601 @@
           <w:color w:val="205C8E"/>
           <w:sz w:val="27"/>
         </w:rPr>
-        <w:t>5.2 动物排名字段</w:t>
+        <w:t>5.2 战斗事实与类型</w:t>
+      </w:r>
+    </w:p>
+    <w:tbl>
+      <w:tblPr>
+        <w:tblStyle w:val="TableGrid"/>
+        <w:tblW w:type="auto" w:w="0"/>
+        <w:jc w:val="center"/>
+        <w:tblLayout w:type="fixed"/>
+        <w:tblLook w:firstColumn="1" w:firstRow="1" w:lastColumn="0" w:lastRow="0" w:noHBand="0" w:noVBand="1" w:val="04A0"/>
+      </w:tblPr>
+      <w:tblGrid>
+        <w:gridCol w:w="2551"/>
+        <w:gridCol w:w="2551"/>
+        <w:gridCol w:w="2551"/>
+        <w:gridCol w:w="2551"/>
+      </w:tblGrid>
+      <w:tr>
+        <w:trPr>
+          <w:tblHeader w:val="true"/>
+        </w:trPr>
+        <w:tc>
+          <w:tcPr>
+            <w:tcW w:type="dxa" w:w="2053"/>
+            <w:vAlign w:val="center"/>
+            <w:shd w:fill="EAF2F8"/>
+            <w:tcMar>
+              <w:top w:w="90" w:type="dxa"/>
+              <w:start w:w="90" w:type="dxa"/>
+              <w:bottom w:w="90" w:type="dxa"/>
+              <w:end w:w="90" w:type="dxa"/>
+            </w:tcMar>
+          </w:tcPr>
+          <w:p>
+            <w:r>
+              <w:rPr>
+                <w:rFonts w:ascii="Microsoft YaHei" w:hAnsi="Microsoft YaHei" w:eastAsia="Microsoft YaHei" w:cs="Microsoft YaHei"/>
+                <w:b/>
+                <w:color w:val="183652"/>
+                <w:sz w:val="18"/>
+              </w:rPr>
+              <w:t>字段/枚举</w:t>
+            </w:r>
+          </w:p>
+        </w:tc>
+        <w:tc>
+          <w:tcPr>
+            <w:tcW w:type="dxa" w:w="2991"/>
+            <w:vAlign w:val="center"/>
+            <w:shd w:fill="EAF2F8"/>
+            <w:tcMar>
+              <w:top w:w="90" w:type="dxa"/>
+              <w:start w:w="90" w:type="dxa"/>
+              <w:bottom w:w="90" w:type="dxa"/>
+              <w:end w:w="90" w:type="dxa"/>
+            </w:tcMar>
+          </w:tcPr>
+          <w:p>
+            <w:r>
+              <w:rPr>
+                <w:rFonts w:ascii="Microsoft YaHei" w:hAnsi="Microsoft YaHei" w:eastAsia="Microsoft YaHei" w:cs="Microsoft YaHei"/>
+                <w:b/>
+                <w:color w:val="183652"/>
+                <w:sz w:val="18"/>
+              </w:rPr>
+              <w:t>定义</w:t>
+            </w:r>
+          </w:p>
+        </w:tc>
+        <w:tc>
+          <w:tcPr>
+            <w:tcW w:type="dxa" w:w="3167"/>
+            <w:vAlign w:val="center"/>
+            <w:shd w:fill="EAF2F8"/>
+            <w:tcMar>
+              <w:top w:w="90" w:type="dxa"/>
+              <w:start w:w="90" w:type="dxa"/>
+              <w:bottom w:w="90" w:type="dxa"/>
+              <w:end w:w="90" w:type="dxa"/>
+            </w:tcMar>
+          </w:tcPr>
+          <w:p>
+            <w:r>
+              <w:rPr>
+                <w:rFonts w:ascii="Microsoft YaHei" w:hAnsi="Microsoft YaHei" w:eastAsia="Microsoft YaHei" w:cs="Microsoft YaHei"/>
+                <w:b/>
+                <w:color w:val="183652"/>
+                <w:sz w:val="18"/>
+              </w:rPr>
+              <w:t>采集边界</w:t>
+            </w:r>
+          </w:p>
+        </w:tc>
+        <w:tc>
+          <w:tcPr>
+            <w:tcW w:type="dxa" w:w="1994"/>
+            <w:vAlign w:val="center"/>
+            <w:shd w:fill="EAF2F8"/>
+            <w:tcMar>
+              <w:top w:w="90" w:type="dxa"/>
+              <w:start w:w="90" w:type="dxa"/>
+              <w:bottom w:w="90" w:type="dxa"/>
+              <w:end w:w="90" w:type="dxa"/>
+            </w:tcMar>
+          </w:tcPr>
+          <w:p>
+            <w:r>
+              <w:rPr>
+                <w:rFonts w:ascii="Microsoft YaHei" w:hAnsi="Microsoft YaHei" w:eastAsia="Microsoft YaHei" w:cs="Microsoft YaHei"/>
+                <w:b/>
+                <w:color w:val="183652"/>
+                <w:sz w:val="18"/>
+              </w:rPr>
+              <w:t>展示/分析</w:t>
+            </w:r>
+          </w:p>
+        </w:tc>
+      </w:tr>
+      <w:tr>
+        <w:trPr>
+          <w:cantSplit/>
+        </w:trPr>
+        <w:tc>
+          <w:tcPr>
+            <w:tcW w:type="dxa" w:w="2053"/>
+            <w:vAlign w:val="center"/>
+            <w:tcMar>
+              <w:top w:w="90" w:type="dxa"/>
+              <w:start w:w="90" w:type="dxa"/>
+              <w:bottom w:w="90" w:type="dxa"/>
+              <w:end w:w="90" w:type="dxa"/>
+            </w:tcMar>
+          </w:tcPr>
+          <w:p>
+            <w:pPr>
+              <w:spacing w:after="0" w:line="276" w:lineRule="auto"/>
+            </w:pPr>
+            <w:r>
+              <w:rPr>
+                <w:rFonts w:ascii="Microsoft YaHei" w:hAnsi="Microsoft YaHei" w:eastAsia="Microsoft YaHei" w:cs="Microsoft YaHei"/>
+                <w:b/>
+                <w:color w:val="183652"/>
+                <w:sz w:val="17"/>
+              </w:rPr>
+              <w:t>battle_type</w:t>
+            </w:r>
+          </w:p>
+        </w:tc>
+        <w:tc>
+          <w:tcPr>
+            <w:tcW w:type="dxa" w:w="2991"/>
+            <w:vAlign w:val="center"/>
+            <w:tcMar>
+              <w:top w:w="90" w:type="dxa"/>
+              <w:start w:w="90" w:type="dxa"/>
+              <w:bottom w:w="90" w:type="dxa"/>
+              <w:end w:w="90" w:type="dxa"/>
+            </w:tcMar>
+          </w:tcPr>
+          <w:p>
+            <w:pPr>
+              <w:spacing w:after="0" w:line="276" w:lineRule="auto"/>
+            </w:pPr>
+            <w:r>
+              <w:rPr>
+                <w:rFonts w:ascii="Microsoft YaHei" w:hAnsi="Microsoft YaHei" w:eastAsia="Microsoft YaHei" w:cs="Microsoft YaHei"/>
+                <w:b w:val="0"/>
+                <w:color w:val="183652"/>
+                <w:sz w:val="17"/>
+              </w:rPr>
+              <w:t>classic_ranked_ai、multiplayer_1v1、multiplayer_2v2、multiplayer_3v3、free_for_all_6、legacy_unknown。</w:t>
+            </w:r>
+          </w:p>
+        </w:tc>
+        <w:tc>
+          <w:tcPr>
+            <w:tcW w:type="dxa" w:w="3167"/>
+            <w:vAlign w:val="center"/>
+            <w:tcMar>
+              <w:top w:w="90" w:type="dxa"/>
+              <w:start w:w="90" w:type="dxa"/>
+              <w:bottom w:w="90" w:type="dxa"/>
+              <w:end w:w="90" w:type="dxa"/>
+            </w:tcMar>
+          </w:tcPr>
+          <w:p>
+            <w:pPr>
+              <w:spacing w:after="0" w:line="276" w:lineRule="auto"/>
+            </w:pPr>
+            <w:r>
+              <w:rPr>
+                <w:rFonts w:ascii="Microsoft YaHei" w:hAnsi="Microsoft YaHei" w:eastAsia="Microsoft YaHei" w:cs="Microsoft YaHei"/>
+                <w:b w:val="0"/>
+                <w:color w:val="183652"/>
+                <w:sz w:val="17"/>
+              </w:rPr>
+              <w:t>新记录必须为受控枚举；历史缺失只标 legacy_unknown。</w:t>
+            </w:r>
+          </w:p>
+        </w:tc>
+        <w:tc>
+          <w:tcPr>
+            <w:tcW w:type="dxa" w:w="1994"/>
+            <w:vAlign w:val="center"/>
+            <w:tcMar>
+              <w:top w:w="90" w:type="dxa"/>
+              <w:start w:w="90" w:type="dxa"/>
+              <w:bottom w:w="90" w:type="dxa"/>
+              <w:end w:w="90" w:type="dxa"/>
+            </w:tcMar>
+          </w:tcPr>
+          <w:p>
+            <w:pPr>
+              <w:spacing w:after="0" w:line="276" w:lineRule="auto"/>
+            </w:pPr>
+            <w:r>
+              <w:rPr>
+                <w:rFonts w:ascii="Microsoft YaHei" w:hAnsi="Microsoft YaHei" w:eastAsia="Microsoft YaHei" w:cs="Microsoft YaHei"/>
+                <w:b w:val="0"/>
+                <w:color w:val="183652"/>
+                <w:sz w:val="17"/>
+              </w:rPr>
+              <w:t>最近战斗与类型汇总必显；动物指标可按类型筛选。</w:t>
+            </w:r>
+          </w:p>
+        </w:tc>
+      </w:tr>
+      <w:tr>
+        <w:trPr>
+          <w:cantSplit/>
+        </w:trPr>
+        <w:tc>
+          <w:tcPr>
+            <w:tcW w:type="dxa" w:w="2053"/>
+            <w:vAlign w:val="center"/>
+            <w:shd w:fill="F8FAFC"/>
+            <w:tcMar>
+              <w:top w:w="90" w:type="dxa"/>
+              <w:start w:w="90" w:type="dxa"/>
+              <w:bottom w:w="90" w:type="dxa"/>
+              <w:end w:w="90" w:type="dxa"/>
+            </w:tcMar>
+          </w:tcPr>
+          <w:p>
+            <w:pPr>
+              <w:spacing w:after="0" w:line="276" w:lineRule="auto"/>
+            </w:pPr>
+            <w:r>
+              <w:rPr>
+                <w:rFonts w:ascii="Microsoft YaHei" w:hAnsi="Microsoft YaHei" w:eastAsia="Microsoft YaHei" w:cs="Microsoft YaHei"/>
+                <w:b/>
+                <w:color w:val="183652"/>
+                <w:sz w:val="17"/>
+              </w:rPr>
+              <w:t>analytics_authority</w:t>
+            </w:r>
+          </w:p>
+        </w:tc>
+        <w:tc>
+          <w:tcPr>
+            <w:tcW w:type="dxa" w:w="2991"/>
+            <w:vAlign w:val="center"/>
+            <w:shd w:fill="F8FAFC"/>
+            <w:tcMar>
+              <w:top w:w="90" w:type="dxa"/>
+              <w:start w:w="90" w:type="dxa"/>
+              <w:bottom w:w="90" w:type="dxa"/>
+              <w:end w:w="90" w:type="dxa"/>
+            </w:tcMar>
+          </w:tcPr>
+          <w:p>
+            <w:pPr>
+              <w:spacing w:after="0" w:line="276" w:lineRule="auto"/>
+            </w:pPr>
+            <w:r>
+              <w:rPr>
+                <w:rFonts w:ascii="Microsoft YaHei" w:hAnsi="Microsoft YaHei" w:eastAsia="Microsoft YaHei" w:cs="Microsoft YaHei"/>
+                <w:b w:val="0"/>
+                <w:color w:val="183652"/>
+                <w:sz w:val="17"/>
+              </w:rPr>
+              <w:t>server_authoritative 或 authenticated_client_reported。</w:t>
+            </w:r>
+          </w:p>
+        </w:tc>
+        <w:tc>
+          <w:tcPr>
+            <w:tcW w:type="dxa" w:w="3167"/>
+            <w:vAlign w:val="center"/>
+            <w:shd w:fill="F8FAFC"/>
+            <w:tcMar>
+              <w:top w:w="90" w:type="dxa"/>
+              <w:start w:w="90" w:type="dxa"/>
+              <w:bottom w:w="90" w:type="dxa"/>
+              <w:end w:w="90" w:type="dxa"/>
+            </w:tcMar>
+          </w:tcPr>
+          <w:p>
+            <w:pPr>
+              <w:spacing w:after="0" w:line="276" w:lineRule="auto"/>
+            </w:pPr>
+            <w:r>
+              <w:rPr>
+                <w:rFonts w:ascii="Microsoft YaHei" w:hAnsi="Microsoft YaHei" w:eastAsia="Microsoft YaHei" w:cs="Microsoft YaHei"/>
+                <w:b w:val="0"/>
+                <w:color w:val="183652"/>
+                <w:sz w:val="17"/>
+              </w:rPr>
+              <w:t>在线房间由服务器结算；经典/本地乱斗由登录会话提交，服务器冻结账号档案并校验结果结构。</w:t>
+            </w:r>
+          </w:p>
+        </w:tc>
+        <w:tc>
+          <w:tcPr>
+            <w:tcW w:type="dxa" w:w="1994"/>
+            <w:vAlign w:val="center"/>
+            <w:shd w:fill="F8FAFC"/>
+            <w:tcMar>
+              <w:top w:w="90" w:type="dxa"/>
+              <w:start w:w="90" w:type="dxa"/>
+              <w:bottom w:w="90" w:type="dxa"/>
+              <w:end w:w="90" w:type="dxa"/>
+            </w:tcMar>
+          </w:tcPr>
+          <w:p>
+            <w:pPr>
+              <w:spacing w:after="0" w:line="276" w:lineRule="auto"/>
+            </w:pPr>
+            <w:r>
+              <w:rPr>
+                <w:rFonts w:ascii="Microsoft YaHei" w:hAnsi="Microsoft YaHei" w:eastAsia="Microsoft YaHei" w:cs="Microsoft YaHei"/>
+                <w:b w:val="0"/>
+                <w:color w:val="183652"/>
+                <w:sz w:val="17"/>
+              </w:rPr>
+              <w:t>两类来源可分辨；客户端回报不得冒充服务器权威。</w:t>
+            </w:r>
+          </w:p>
+        </w:tc>
+      </w:tr>
+      <w:tr>
+        <w:trPr>
+          <w:cantSplit/>
+        </w:trPr>
+        <w:tc>
+          <w:tcPr>
+            <w:tcW w:type="dxa" w:w="2053"/>
+            <w:vAlign w:val="center"/>
+            <w:tcMar>
+              <w:top w:w="90" w:type="dxa"/>
+              <w:start w:w="90" w:type="dxa"/>
+              <w:bottom w:w="90" w:type="dxa"/>
+              <w:end w:w="90" w:type="dxa"/>
+            </w:tcMar>
+          </w:tcPr>
+          <w:p>
+            <w:pPr>
+              <w:spacing w:after="0" w:line="276" w:lineRule="auto"/>
+            </w:pPr>
+            <w:r>
+              <w:rPr>
+                <w:rFonts w:ascii="Microsoft YaHei" w:hAnsi="Microsoft YaHei" w:eastAsia="Microsoft YaHei" w:cs="Microsoft YaHei"/>
+                <w:b/>
+                <w:color w:val="183652"/>
+                <w:sz w:val="17"/>
+              </w:rPr>
+              <w:t>completed battle</w:t>
+            </w:r>
+          </w:p>
+        </w:tc>
+        <w:tc>
+          <w:tcPr>
+            <w:tcW w:type="dxa" w:w="2991"/>
+            <w:vAlign w:val="center"/>
+            <w:tcMar>
+              <w:top w:w="90" w:type="dxa"/>
+              <w:start w:w="90" w:type="dxa"/>
+              <w:bottom w:w="90" w:type="dxa"/>
+              <w:end w:w="90" w:type="dxa"/>
+            </w:tcMar>
+          </w:tcPr>
+          <w:p>
+            <w:pPr>
+              <w:spacing w:after="0" w:line="276" w:lineRule="auto"/>
+            </w:pPr>
+            <w:r>
+              <w:rPr>
+                <w:rFonts w:ascii="Microsoft YaHei" w:hAnsi="Microsoft YaHei" w:eastAsia="Microsoft YaHei" w:cs="Microsoft YaHei"/>
+                <w:b w:val="0"/>
+                <w:color w:val="183652"/>
+                <w:sz w:val="17"/>
+              </w:rPr>
+              <w:t>game_over 且具有完整终局结果的一条战斗事实。</w:t>
+            </w:r>
+          </w:p>
+        </w:tc>
+        <w:tc>
+          <w:tcPr>
+            <w:tcW w:type="dxa" w:w="3167"/>
+            <w:vAlign w:val="center"/>
+            <w:tcMar>
+              <w:top w:w="90" w:type="dxa"/>
+              <w:start w:w="90" w:type="dxa"/>
+              <w:bottom w:w="90" w:type="dxa"/>
+              <w:end w:w="90" w:type="dxa"/>
+            </w:tcMar>
+          </w:tcPr>
+          <w:p>
+            <w:pPr>
+              <w:spacing w:after="0" w:line="276" w:lineRule="auto"/>
+            </w:pPr>
+            <w:r>
+              <w:rPr>
+                <w:rFonts w:ascii="Microsoft YaHei" w:hAnsi="Microsoft YaHei" w:eastAsia="Microsoft YaHei" w:cs="Microsoft YaHei"/>
+                <w:b w:val="0"/>
+                <w:color w:val="183652"/>
+                <w:sz w:val="17"/>
+              </w:rPr>
+              <w:t>同一 match/report ID 幂等；未完成、退出或损坏结果不计。</w:t>
+            </w:r>
+          </w:p>
+        </w:tc>
+        <w:tc>
+          <w:tcPr>
+            <w:tcW w:type="dxa" w:w="1994"/>
+            <w:vAlign w:val="center"/>
+            <w:tcMar>
+              <w:top w:w="90" w:type="dxa"/>
+              <w:start w:w="90" w:type="dxa"/>
+              <w:bottom w:w="90" w:type="dxa"/>
+              <w:end w:w="90" w:type="dxa"/>
+            </w:tcMar>
+          </w:tcPr>
+          <w:p>
+            <w:pPr>
+              <w:spacing w:after="0" w:line="276" w:lineRule="auto"/>
+            </w:pPr>
+            <w:r>
+              <w:rPr>
+                <w:rFonts w:ascii="Microsoft YaHei" w:hAnsi="Microsoft YaHei" w:eastAsia="Microsoft YaHei" w:cs="Microsoft YaHei"/>
+                <w:b w:val="0"/>
+                <w:color w:val="183652"/>
+                <w:sz w:val="17"/>
+              </w:rPr>
+              <w:t>overview.matches 等于所有 battle_type 终局记录之和。</w:t>
+            </w:r>
+          </w:p>
+        </w:tc>
+      </w:tr>
+      <w:tr>
+        <w:trPr>
+          <w:cantSplit/>
+        </w:trPr>
+        <w:tc>
+          <w:tcPr>
+            <w:tcW w:type="dxa" w:w="2053"/>
+            <w:vAlign w:val="center"/>
+            <w:shd w:fill="F8FAFC"/>
+            <w:tcMar>
+              <w:top w:w="90" w:type="dxa"/>
+              <w:start w:w="90" w:type="dxa"/>
+              <w:bottom w:w="90" w:type="dxa"/>
+              <w:end w:w="90" w:type="dxa"/>
+            </w:tcMar>
+          </w:tcPr>
+          <w:p>
+            <w:pPr>
+              <w:spacing w:after="0" w:line="276" w:lineRule="auto"/>
+            </w:pPr>
+            <w:r>
+              <w:rPr>
+                <w:rFonts w:ascii="Microsoft YaHei" w:hAnsi="Microsoft YaHei" w:eastAsia="Microsoft YaHei" w:cs="Microsoft YaHei"/>
+                <w:b/>
+                <w:color w:val="183652"/>
+                <w:sz w:val="17"/>
+              </w:rPr>
+              <w:t>coverage</w:t>
+            </w:r>
+          </w:p>
+        </w:tc>
+        <w:tc>
+          <w:tcPr>
+            <w:tcW w:type="dxa" w:w="2991"/>
+            <w:vAlign w:val="center"/>
+            <w:shd w:fill="F8FAFC"/>
+            <w:tcMar>
+              <w:top w:w="90" w:type="dxa"/>
+              <w:start w:w="90" w:type="dxa"/>
+              <w:bottom w:w="90" w:type="dxa"/>
+              <w:end w:w="90" w:type="dxa"/>
+            </w:tcMar>
+          </w:tcPr>
+          <w:p>
+            <w:pPr>
+              <w:spacing w:after="0" w:line="276" w:lineRule="auto"/>
+            </w:pPr>
+            <w:r>
+              <w:rPr>
+                <w:rFonts w:ascii="Microsoft YaHei" w:hAnsi="Microsoft YaHei" w:eastAsia="Microsoft YaHei" w:cs="Microsoft YaHei"/>
+                <w:b w:val="0"/>
+                <w:color w:val="183652"/>
+                <w:sz w:val="17"/>
+              </w:rPr>
+              <w:t>全部已完成且具有在线认证会话、能够送达阿里云采集端的支持模式。</w:t>
+            </w:r>
+          </w:p>
+        </w:tc>
+        <w:tc>
+          <w:tcPr>
+            <w:tcW w:type="dxa" w:w="3167"/>
+            <w:vAlign w:val="center"/>
+            <w:shd w:fill="F8FAFC"/>
+            <w:tcMar>
+              <w:top w:w="90" w:type="dxa"/>
+              <w:start w:w="90" w:type="dxa"/>
+              <w:bottom w:w="90" w:type="dxa"/>
+              <w:end w:w="90" w:type="dxa"/>
+            </w:tcMar>
+          </w:tcPr>
+          <w:p>
+            <w:pPr>
+              <w:spacing w:after="0" w:line="276" w:lineRule="auto"/>
+            </w:pPr>
+            <w:r>
+              <w:rPr>
+                <w:rFonts w:ascii="Microsoft YaHei" w:hAnsi="Microsoft YaHei" w:eastAsia="Microsoft YaHei" w:cs="Microsoft YaHei"/>
+                <w:b w:val="0"/>
+                <w:color w:val="183652"/>
+                <w:sz w:val="17"/>
+              </w:rPr>
+              <w:t>离线且从未连网的本地战斗无法形成云端事实，必须在覆盖说明中显式排除。</w:t>
+            </w:r>
+          </w:p>
+        </w:tc>
+        <w:tc>
+          <w:tcPr>
+            <w:tcW w:type="dxa" w:w="1994"/>
+            <w:vAlign w:val="center"/>
+            <w:shd w:fill="F8FAFC"/>
+            <w:tcMar>
+              <w:top w:w="90" w:type="dxa"/>
+              <w:start w:w="90" w:type="dxa"/>
+              <w:bottom w:w="90" w:type="dxa"/>
+              <w:end w:w="90" w:type="dxa"/>
+            </w:tcMar>
+          </w:tcPr>
+          <w:p>
+            <w:pPr>
+              <w:spacing w:after="0" w:line="276" w:lineRule="auto"/>
+            </w:pPr>
+            <w:r>
+              <w:rPr>
+                <w:rFonts w:ascii="Microsoft YaHei" w:hAnsi="Microsoft YaHei" w:eastAsia="Microsoft YaHei" w:cs="Microsoft YaHei"/>
+                <w:b w:val="0"/>
+                <w:color w:val="183652"/>
+                <w:sz w:val="17"/>
+              </w:rPr>
+              <w:t>不以零样本或漏采样本伪装为完整覆盖。</w:t>
+            </w:r>
+          </w:p>
+        </w:tc>
+      </w:tr>
+    </w:tbl>
+    <w:p>
+      <w:pPr>
+        <w:spacing w:after="20"/>
+      </w:pPr>
+    </w:p>
+    <w:p>
+      <w:pPr>
+        <w:spacing w:after="100" w:line="307" w:lineRule="auto"/>
+      </w:pPr>
+      <w:r>
+        <w:rPr>
+          <w:rFonts w:ascii="Microsoft YaHei" w:hAnsi="Microsoft YaHei" w:eastAsia="Microsoft YaHei" w:cs="Microsoft YaHei"/>
+          <w:b w:val="0"/>
+          <w:color w:val="183652"/>
+          <w:sz w:val="21"/>
+        </w:rPr>
+        <w:t>服务器房间不再要求满额真人才启动统计；AI 补位房间也记录该战斗，并只对已认证真人阵容累积动物样本。经典与本地六人乱斗通过当前已认证会话提交一次性 report_id；服务器从权威账号档案冻结 user_id、段位和保存阵容，客户端只提供受控战斗类型、地图与终局。所有记录按 battle_type 分组，跨类型总计不得直接触发确定性平衡改数。</w:t>
+      </w:r>
+    </w:p>
+    <w:p>
+      <w:pPr>
+        <w:pStyle w:val="Heading2"/>
+        <w:pageBreakBefore w:val="0"/>
+      </w:pPr>
+      <w:r>
+        <w:rPr>
+          <w:rFonts w:ascii="Microsoft YaHei" w:hAnsi="Microsoft YaHei" w:eastAsia="Microsoft YaHei" w:cs="Microsoft YaHei"/>
+          <w:b/>
+          <w:color w:val="205C8E"/>
+          <w:sz w:val="27"/>
+        </w:rPr>
+        <w:t>5.3 动物排名字段</w:t>
       </w:r>
     </w:p>
     <w:tbl>
@@ -7219,7 +8236,7 @@
           <w:color w:val="205C8E"/>
           <w:sz w:val="27"/>
         </w:rPr>
-        <w:t>5.3 账号投影字段</w:t>
+        <w:t>5.4 账号投影字段</w:t>
       </w:r>
     </w:p>
     <w:tbl>
@@ -8116,7 +9133,7 @@
                 <w:color w:val="183652"/>
                 <w:sz w:val="17"/>
               </w:rPr>
-              <w:t>返回 availability、generated_at_unix、overview、leaderboard、animals、recent_matches；animals 包含六个 v1.1 新字段。</w:t>
+              <w:t>返回 availability、overview、battle_types、leaderboard、animals、animals_by_battle_type、recent_matches；战斗记录含 battle_type/analytics_authority。</w:t>
             </w:r>
           </w:p>
         </w:tc>
@@ -8286,7 +9303,7 @@
                 <w:color w:val="183652"/>
                 <w:sz w:val="17"/>
               </w:rPr>
-              <w:t>POST /api/resource-grants</w:t>
+              <w:t>POST /api/resource-grants/preview</w:t>
             </w:r>
           </w:p>
         </w:tc>
@@ -8312,7 +9329,7 @@
                 <w:color w:val="183652"/>
                 <w:sz w:val="17"/>
               </w:rPr>
-              <w:t>Owner + CSRF + 重新认证</w:t>
+              <w:t>Owner + CSRF</w:t>
             </w:r>
           </w:p>
         </w:tc>
@@ -8338,7 +9355,7 @@
                 <w:color w:val="183652"/>
                 <w:sz w:val="17"/>
               </w:rPr>
-              <w:t>请求见 6.1；响应至少含 command。</w:t>
+              <w:t>接收目标、资源、原因与幂等键；返回绑定会话和冻结目标的短期签名预览。</w:t>
             </w:r>
           </w:p>
         </w:tc>
@@ -8364,7 +9381,7 @@
                 <w:color w:val="183652"/>
                 <w:sz w:val="17"/>
               </w:rPr>
-              <w:t>来源、CSRF、角色、密码、目标、数量、确认文本和幂等均 fail closed。</w:t>
+              <w:t>严格字段白名单；目标、卡牌、原因或快照无效时零入队。</w:t>
             </w:r>
           </w:p>
         </w:tc>
@@ -8396,7 +9413,7 @@
                 <w:color w:val="183652"/>
                 <w:sz w:val="17"/>
               </w:rPr>
-              <w:t>GET /api/resource-grants</w:t>
+              <w:t>POST /api/resource-grants</w:t>
             </w:r>
           </w:p>
         </w:tc>
@@ -8423,7 +9440,7 @@
                 <w:color w:val="183652"/>
                 <w:sz w:val="17"/>
               </w:rPr>
-              <w:t>Owner</w:t>
+              <w:t>Owner + CSRF + 签名预览</w:t>
             </w:r>
           </w:p>
         </w:tc>
@@ -8450,7 +9467,7 @@
                 <w:color w:val="183652"/>
                 <w:sz w:val="17"/>
               </w:rPr>
-              <w:t>返回 entries[] 任务状态。</w:t>
+              <w:t>指定账号仅提交 preview_token 与 idempotency_key；全账号额外提交 password 与 confirmation=SEND TO ALL。</w:t>
             </w:r>
           </w:p>
         </w:tc>
@@ -8477,7 +9494,7 @@
                 <w:color w:val="183652"/>
                 <w:sz w:val="17"/>
               </w:rPr>
-              <w:t>损坏命令不回显原始内容；未知状态不推断成功。</w:t>
+              <w:t>来源、角色、预览会话/时限、冻结目标、全账号重认证与幂等均 fail closed。</w:t>
             </w:r>
           </w:p>
         </w:tc>
@@ -8508,6 +9525,116 @@
                 <w:color w:val="183652"/>
                 <w:sz w:val="17"/>
               </w:rPr>
+              <w:t>GET /api/resource-grants</w:t>
+            </w:r>
+          </w:p>
+        </w:tc>
+        <w:tc>
+          <w:tcPr>
+            <w:tcW w:type="dxa" w:w="1730"/>
+            <w:vAlign w:val="center"/>
+            <w:tcMar>
+              <w:top w:w="90" w:type="dxa"/>
+              <w:start w:w="90" w:type="dxa"/>
+              <w:bottom w:w="90" w:type="dxa"/>
+              <w:end w:w="90" w:type="dxa"/>
+            </w:tcMar>
+          </w:tcPr>
+          <w:p>
+            <w:pPr>
+              <w:spacing w:after="0" w:line="276" w:lineRule="auto"/>
+            </w:pPr>
+            <w:r>
+              <w:rPr>
+                <w:rFonts w:ascii="Microsoft YaHei" w:hAnsi="Microsoft YaHei" w:eastAsia="Microsoft YaHei" w:cs="Microsoft YaHei"/>
+                <w:b w:val="0"/>
+                <w:color w:val="183652"/>
+                <w:sz w:val="17"/>
+              </w:rPr>
+              <w:t>Owner</w:t>
+            </w:r>
+          </w:p>
+        </w:tc>
+        <w:tc>
+          <w:tcPr>
+            <w:tcW w:type="dxa" w:w="3747"/>
+            <w:vAlign w:val="center"/>
+            <w:tcMar>
+              <w:top w:w="90" w:type="dxa"/>
+              <w:start w:w="90" w:type="dxa"/>
+              <w:bottom w:w="90" w:type="dxa"/>
+              <w:end w:w="90" w:type="dxa"/>
+            </w:tcMar>
+          </w:tcPr>
+          <w:p>
+            <w:pPr>
+              <w:spacing w:after="0" w:line="276" w:lineRule="auto"/>
+            </w:pPr>
+            <w:r>
+              <w:rPr>
+                <w:rFonts w:ascii="Microsoft YaHei" w:hAnsi="Microsoft YaHei" w:eastAsia="Microsoft YaHei" w:cs="Microsoft YaHei"/>
+                <w:b w:val="0"/>
+                <w:color w:val="183652"/>
+                <w:sz w:val="17"/>
+              </w:rPr>
+              <w:t>返回 entries[] 任务状态。</w:t>
+            </w:r>
+          </w:p>
+        </w:tc>
+        <w:tc>
+          <w:tcPr>
+            <w:tcW w:type="dxa" w:w="2710"/>
+            <w:vAlign w:val="center"/>
+            <w:tcMar>
+              <w:top w:w="90" w:type="dxa"/>
+              <w:start w:w="90" w:type="dxa"/>
+              <w:bottom w:w="90" w:type="dxa"/>
+              <w:end w:w="90" w:type="dxa"/>
+            </w:tcMar>
+          </w:tcPr>
+          <w:p>
+            <w:pPr>
+              <w:spacing w:after="0" w:line="276" w:lineRule="auto"/>
+            </w:pPr>
+            <w:r>
+              <w:rPr>
+                <w:rFonts w:ascii="Microsoft YaHei" w:hAnsi="Microsoft YaHei" w:eastAsia="Microsoft YaHei" w:cs="Microsoft YaHei"/>
+                <w:b w:val="0"/>
+                <w:color w:val="183652"/>
+                <w:sz w:val="17"/>
+              </w:rPr>
+              <w:t>损坏命令不回显原始内容；未知状态不推断成功。</w:t>
+            </w:r>
+          </w:p>
+        </w:tc>
+      </w:tr>
+      <w:tr>
+        <w:trPr>
+          <w:cantSplit/>
+        </w:trPr>
+        <w:tc>
+          <w:tcPr>
+            <w:tcW w:type="dxa" w:w="2018"/>
+            <w:vAlign w:val="center"/>
+            <w:shd w:fill="F8FAFC"/>
+            <w:tcMar>
+              <w:top w:w="90" w:type="dxa"/>
+              <w:start w:w="90" w:type="dxa"/>
+              <w:bottom w:w="90" w:type="dxa"/>
+              <w:end w:w="90" w:type="dxa"/>
+            </w:tcMar>
+          </w:tcPr>
+          <w:p>
+            <w:pPr>
+              <w:spacing w:after="0" w:line="276" w:lineRule="auto"/>
+            </w:pPr>
+            <w:r>
+              <w:rPr>
+                <w:rFonts w:ascii="Microsoft YaHei" w:hAnsi="Microsoft YaHei" w:eastAsia="Microsoft YaHei" w:cs="Microsoft YaHei"/>
+                <w:b/>
+                <w:color w:val="183652"/>
+                <w:sz w:val="17"/>
+              </w:rPr>
               <w:t>/api/admins 与 /api/audit</w:t>
             </w:r>
           </w:p>
@@ -8516,6 +9643,7 @@
           <w:tcPr>
             <w:tcW w:type="dxa" w:w="1730"/>
             <w:vAlign w:val="center"/>
+            <w:shd w:fill="F8FAFC"/>
             <w:tcMar>
               <w:top w:w="90" w:type="dxa"/>
               <w:start w:w="90" w:type="dxa"/>
@@ -8542,6 +9670,7 @@
           <w:tcPr>
             <w:tcW w:type="dxa" w:w="3747"/>
             <w:vAlign w:val="center"/>
+            <w:shd w:fill="F8FAFC"/>
             <w:tcMar>
               <w:top w:w="90" w:type="dxa"/>
               <w:start w:w="90" w:type="dxa"/>
@@ -8568,6 +9697,7 @@
           <w:tcPr>
             <w:tcW w:type="dxa" w:w="2710"/>
             <w:vAlign w:val="center"/>
+            <w:shd w:fill="F8FAFC"/>
             <w:tcMar>
               <w:top w:w="90" w:type="dxa"/>
               <w:start w:w="90" w:type="dxa"/>
@@ -8625,6 +9755,8 @@
           <w:color w:val="183652"/>
           <w:sz w:val="18"/>
         </w:rPr>
+        <w:t>POST /api/resource-grants/preview</w:t>
+        <w:br/>
         <w:t>{</w:t>
         <w:br/>
         <w:t xml:space="preserve">  "target": { "kind": "user", "user_id": "&lt;目标 user_id&gt;" },</w:t>
@@ -8633,28 +9765,35 @@
         <w:br/>
         <w:t xml:space="preserve">  "reason": "&lt;4–200 字可审计业务原因&gt;",</w:t>
         <w:br/>
-        <w:t xml:space="preserve">  "confirmation": "SEND",</w:t>
-        <w:br/>
-        <w:t xml:space="preserve">  "password": "&lt;仅本次重新认证输入&gt;",</w:t>
-        <w:br/>
         <w:t xml:space="preserve">  "idempotency_key": "&lt;UUID&gt;"</w:t>
         <w:br/>
         <w:t>}</w:t>
         <w:br/>
         <w:br/>
+        <w:t>POST /api/resource-grants</w:t>
+        <w:br/>
         <w:t>{</w:t>
         <w:br/>
-        <w:t xml:space="preserve">  "target": { "kind": "all" },</w:t>
+        <w:t xml:space="preserve">  "preview_token": "&lt;服务器短期签名预览&gt;",</w:t>
         <w:br/>
-        <w:t xml:space="preserve">  "grant": { "type": "card_copies", "amount": 5, "card_id": "&lt;正式卡牌 ID&gt;" },</w:t>
+        <w:t xml:space="preserve">  "idempotency_key": "&lt;同一 UUID&gt;"</w:t>
         <w:br/>
-        <w:t xml:space="preserve">  "reason": "&lt;4–200 字可审计业务原因&gt;",</w:t>
+        <w:t>}</w:t>
         <w:br/>
-        <w:t xml:space="preserve">  "confirmation": "SEND TO ALL",</w:t>
         <w:br/>
-        <w:t xml:space="preserve">  "password": "&lt;仅本次重新认证输入&gt;",</w:t>
+        <w:t>// 仅全账号群发额外要求：</w:t>
         <w:br/>
-        <w:t xml:space="preserve">  "idempotency_key": "&lt;UUID&gt;"</w:t>
+        <w:t>POST /api/resource-grants</w:t>
+        <w:br/>
+        <w:t>{</w:t>
+        <w:br/>
+        <w:t xml:space="preserve">  "preview_token": "&lt;服务器短期签名预览&gt;",</w:t>
+        <w:br/>
+        <w:t xml:space="preserve">  "idempotency_key": "&lt;同一 UUID&gt;",</w:t>
+        <w:br/>
+        <w:t xml:space="preserve">  "password": "&lt;当前 Owner 密码，仅经 HTTPS 请求使用&gt;",</w:t>
+        <w:br/>
+        <w:t xml:space="preserve">  "confirmation": "SEND TO ALL"</w:t>
         <w:br/>
         <w:t>}</w:t>
       </w:r>
@@ -9028,7 +10167,7 @@
                 <w:color w:val="183652"/>
                 <w:sz w:val="17"/>
               </w:rPr>
-              <w:t>confirmation</w:t>
+              <w:t>preview_token</w:t>
             </w:r>
           </w:p>
         </w:tc>
@@ -9055,7 +10194,7 @@
                 <w:color w:val="183652"/>
                 <w:sz w:val="17"/>
               </w:rPr>
-              <w:t>指定账号必须 SEND；全部账号必须精确 SEND TO ALL。</w:t>
+              <w:t>HMAC 签名并绑定当前会话、Owner、目标摘要、资源、原因、幂等键与 2 分钟时限。</w:t>
             </w:r>
           </w:p>
         </w:tc>
@@ -9082,7 +10221,7 @@
                 <w:color w:val="183652"/>
                 <w:sz w:val="17"/>
               </w:rPr>
-              <w:t>只记录确认已通过，不把它当身份凭据。</w:t>
+              <w:t>只在本次提交使用；不得写入任务、审计或日志。</w:t>
             </w:r>
           </w:p>
         </w:tc>
@@ -9113,7 +10252,7 @@
                 <w:color w:val="183652"/>
                 <w:sz w:val="17"/>
               </w:rPr>
-              <w:t>password</w:t>
+              <w:t>idempotency_key</w:t>
             </w:r>
           </w:p>
         </w:tc>
@@ -9139,7 +10278,7 @@
                 <w:color w:val="183652"/>
                 <w:sz w:val="17"/>
               </w:rPr>
-              <w:t>验证当前会话 Owner；失败限流。</w:t>
+              <w:t>UUID；预览后固定。</w:t>
             </w:r>
           </w:p>
         </w:tc>
@@ -9165,7 +10304,7 @@
                 <w:color w:val="183652"/>
                 <w:sz w:val="17"/>
               </w:rPr>
-              <w:t>绝不持久化、回显或写审计。</w:t>
+              <w:t>同时作为命令去重键；重复同请求返回原命令。</w:t>
             </w:r>
           </w:p>
         </w:tc>
@@ -9197,7 +10336,7 @@
                 <w:color w:val="183652"/>
                 <w:sz w:val="17"/>
               </w:rPr>
-              <w:t>idempotency_key</w:t>
+              <w:t>password / confirmation</w:t>
             </w:r>
           </w:p>
         </w:tc>
@@ -9224,7 +10363,7 @@
                 <w:color w:val="183652"/>
                 <w:sz w:val="17"/>
               </w:rPr>
-              <w:t>UUID；预览后固定。</w:t>
+              <w:t>只允许全账号提交；密码必须验证当前 Owner，confirmation 必须精确等于 SEND TO ALL；指定账号夹带这两个字段会被拒绝。</w:t>
             </w:r>
           </w:p>
         </w:tc>
@@ -9251,7 +10390,7 @@
                 <w:color w:val="183652"/>
                 <w:sz w:val="17"/>
               </w:rPr>
-              <w:t>同时作为命令去重键；重复同请求返回原命令。</w:t>
+              <w:t>不得进入命令、审计、日志或前端持久状态。</w:t>
             </w:r>
           </w:p>
         </w:tc>
@@ -9319,7 +10458,7 @@
           <w:color w:val="183652"/>
           <w:sz w:val="21"/>
         </w:rPr>
-        <w:t>服务端完成 Owner、CSRF、来源、重新认证、目标、资源、原因和确认文本校验后，先写不可抵赖的授权审计。</w:t>
+        <w:t>服务端完成 Owner、CSRF、来源、签名预览、冻结目标、资源、原因和幂等校验后，先写不可抵赖的授权审计；全账号还必须完成 Owner 密码和 SEND TO ALL 校验。</w:t>
       </w:r>
     </w:p>
     <w:p>
@@ -9335,6 +10474,21 @@
           <w:sz w:val="21"/>
         </w:rPr>
         <w:t>命令以 no-replace/独占创建方式原子写入 pending；同键竞态只能有一个实体。</w:t>
+      </w:r>
+    </w:p>
+    <w:p>
+      <w:pPr>
+        <w:pStyle w:val="ListNumber"/>
+        <w:spacing w:after="100" w:line="307" w:lineRule="auto"/>
+      </w:pPr>
+      <w:r>
+        <w:rPr>
+          <w:rFonts w:ascii="Microsoft YaHei" w:hAnsi="Microsoft YaHei" w:eastAsia="Microsoft YaHei" w:cs="Microsoft YaHei"/>
+          <w:b w:val="0"/>
+          <w:color w:val="183652"/>
+          <w:sz w:val="21"/>
+        </w:rPr>
+        <w:t>跨服务 pending 文件必须继承 junglelaw-admin-command 组并为 0660；禁止 owner-only 0600 造成执行器永久不可读。全账号内部命令必须由服务器写入 all_confirmation=SEND TO ALL，浏览器不接触该字段。</w:t>
       </w:r>
     </w:p>
     <w:p>
@@ -11835,7 +12989,7 @@
                 <w:color w:val="183652"/>
                 <w:sz w:val="17"/>
               </w:rPr>
-              <w:t>目标数、资源、原因、幂等键、不可撤销</w:t>
+              <w:t>服务器冻结目标、资源、原因、幂等键</w:t>
             </w:r>
           </w:p>
         </w:tc>
@@ -11862,7 +13016,7 @@
                 <w:color w:val="183652"/>
                 <w:sz w:val="17"/>
               </w:rPr>
-              <w:t>返回修改/重新认证</w:t>
+              <w:t>指定账号同一次点击立即提交；全账号完成密码与 SEND TO ALL</w:t>
             </w:r>
           </w:p>
         </w:tc>
@@ -11889,7 +13043,7 @@
                 <w:color w:val="183652"/>
                 <w:sz w:val="17"/>
               </w:rPr>
-              <w:t>draft/reauth</w:t>
+              <w:t>pending 或 error</w:t>
             </w:r>
           </w:p>
         </w:tc>
@@ -11920,7 +13074,7 @@
                 <w:color w:val="183652"/>
                 <w:sz w:val="17"/>
               </w:rPr>
-              <w:t>资源</w:t>
+              <w:t>命令</w:t>
             </w:r>
           </w:p>
         </w:tc>
@@ -11946,7 +13100,7 @@
                 <w:color w:val="183652"/>
                 <w:sz w:val="17"/>
               </w:rPr>
-              <w:t>reauth/confirm</w:t>
+              <w:t>pending</w:t>
             </w:r>
           </w:p>
         </w:tc>
@@ -11972,7 +13126,7 @@
                 <w:color w:val="183652"/>
                 <w:sz w:val="17"/>
               </w:rPr>
-              <w:t>密码与确认文本</w:t>
+              <w:t>单一处理中摘要，未证明到账</w:t>
             </w:r>
           </w:p>
         </w:tc>
@@ -11998,7 +13152,7 @@
                 <w:color w:val="183652"/>
                 <w:sz w:val="17"/>
               </w:rPr>
-              <w:t>提交</w:t>
+              <w:t>自动短轮询/手动刷新</w:t>
             </w:r>
           </w:p>
         </w:tc>
@@ -12024,7 +13178,7 @@
                 <w:color w:val="183652"/>
                 <w:sz w:val="17"/>
               </w:rPr>
-              <w:t>pending 或 error</w:t>
+              <w:t>processed/failed</w:t>
             </w:r>
           </w:p>
         </w:tc>
@@ -12083,7 +13237,7 @@
                 <w:color w:val="183652"/>
                 <w:sz w:val="17"/>
               </w:rPr>
-              <w:t>pending</w:t>
+              <w:t>processed</w:t>
             </w:r>
           </w:p>
         </w:tc>
@@ -12110,7 +13264,7 @@
                 <w:color w:val="183652"/>
                 <w:sz w:val="17"/>
               </w:rPr>
-              <w:t>已登记、未证明到账</w:t>
+              <w:t>成功终态与时间</w:t>
             </w:r>
           </w:p>
         </w:tc>
@@ -12137,7 +13291,7 @@
                 <w:color w:val="183652"/>
                 <w:sz w:val="17"/>
               </w:rPr>
-              <w:t>刷新状态</w:t>
+              <w:t>只读审计</w:t>
             </w:r>
           </w:p>
         </w:tc>
@@ -12164,7 +13318,7 @@
                 <w:color w:val="183652"/>
                 <w:sz w:val="17"/>
               </w:rPr>
-              <w:t>processed/failed</w:t>
+              <w:t>终态</w:t>
             </w:r>
           </w:p>
         </w:tc>
@@ -12221,7 +13375,7 @@
                 <w:color w:val="183652"/>
                 <w:sz w:val="17"/>
               </w:rPr>
-              <w:t>processed</w:t>
+              <w:t>failed</w:t>
             </w:r>
           </w:p>
         </w:tc>
@@ -12247,7 +13401,7 @@
                 <w:color w:val="183652"/>
                 <w:sz w:val="17"/>
               </w:rPr>
-              <w:t>成功终态与时间</w:t>
+              <w:t>失败终态和安全错误码</w:t>
             </w:r>
           </w:p>
         </w:tc>
@@ -12273,7 +13427,7 @@
                 <w:color w:val="183652"/>
                 <w:sz w:val="17"/>
               </w:rPr>
-              <w:t>只读审计</w:t>
+              <w:t>调查；新审批后才可新建命令</w:t>
             </w:r>
           </w:p>
         </w:tc>
@@ -12281,146 +13435,6 @@
           <w:tcPr>
             <w:tcW w:type="dxa" w:w="1850"/>
             <w:vAlign w:val="center"/>
-            <w:tcMar>
-              <w:top w:w="90" w:type="dxa"/>
-              <w:start w:w="90" w:type="dxa"/>
-              <w:bottom w:w="90" w:type="dxa"/>
-              <w:end w:w="90" w:type="dxa"/>
-            </w:tcMar>
-          </w:tcPr>
-          <w:p>
-            <w:pPr>
-              <w:spacing w:after="0" w:line="276" w:lineRule="auto"/>
-            </w:pPr>
-            <w:r>
-              <w:rPr>
-                <w:rFonts w:ascii="Microsoft YaHei" w:hAnsi="Microsoft YaHei" w:eastAsia="Microsoft YaHei" w:cs="Microsoft YaHei"/>
-                <w:b w:val="0"/>
-                <w:color w:val="183652"/>
-                <w:sz w:val="17"/>
-              </w:rPr>
-              <w:t>终态</w:t>
-            </w:r>
-          </w:p>
-        </w:tc>
-      </w:tr>
-      <w:tr>
-        <w:trPr>
-          <w:cantSplit/>
-        </w:trPr>
-        <w:tc>
-          <w:tcPr>
-            <w:tcW w:type="dxa" w:w="1373"/>
-            <w:vAlign w:val="center"/>
-            <w:shd w:fill="F8FAFC"/>
-            <w:tcMar>
-              <w:top w:w="90" w:type="dxa"/>
-              <w:start w:w="90" w:type="dxa"/>
-              <w:bottom w:w="90" w:type="dxa"/>
-              <w:end w:w="90" w:type="dxa"/>
-            </w:tcMar>
-          </w:tcPr>
-          <w:p>
-            <w:pPr>
-              <w:spacing w:after="0" w:line="276" w:lineRule="auto"/>
-            </w:pPr>
-            <w:r>
-              <w:rPr>
-                <w:rFonts w:ascii="Microsoft YaHei" w:hAnsi="Microsoft YaHei" w:eastAsia="Microsoft YaHei" w:cs="Microsoft YaHei"/>
-                <w:b/>
-                <w:color w:val="183652"/>
-                <w:sz w:val="17"/>
-              </w:rPr>
-              <w:t>命令</w:t>
-            </w:r>
-          </w:p>
-        </w:tc>
-        <w:tc>
-          <w:tcPr>
-            <w:tcW w:type="dxa" w:w="1611"/>
-            <w:vAlign w:val="center"/>
-            <w:shd w:fill="F8FAFC"/>
-            <w:tcMar>
-              <w:top w:w="90" w:type="dxa"/>
-              <w:start w:w="90" w:type="dxa"/>
-              <w:bottom w:w="90" w:type="dxa"/>
-              <w:end w:w="90" w:type="dxa"/>
-            </w:tcMar>
-          </w:tcPr>
-          <w:p>
-            <w:pPr>
-              <w:spacing w:after="0" w:line="276" w:lineRule="auto"/>
-            </w:pPr>
-            <w:r>
-              <w:rPr>
-                <w:rFonts w:ascii="Microsoft YaHei" w:hAnsi="Microsoft YaHei" w:eastAsia="Microsoft YaHei" w:cs="Microsoft YaHei"/>
-                <w:b w:val="0"/>
-                <w:color w:val="183652"/>
-                <w:sz w:val="17"/>
-              </w:rPr>
-              <w:t>failed</w:t>
-            </w:r>
-          </w:p>
-        </w:tc>
-        <w:tc>
-          <w:tcPr>
-            <w:tcW w:type="dxa" w:w="2984"/>
-            <w:vAlign w:val="center"/>
-            <w:shd w:fill="F8FAFC"/>
-            <w:tcMar>
-              <w:top w:w="90" w:type="dxa"/>
-              <w:start w:w="90" w:type="dxa"/>
-              <w:bottom w:w="90" w:type="dxa"/>
-              <w:end w:w="90" w:type="dxa"/>
-            </w:tcMar>
-          </w:tcPr>
-          <w:p>
-            <w:pPr>
-              <w:spacing w:after="0" w:line="276" w:lineRule="auto"/>
-            </w:pPr>
-            <w:r>
-              <w:rPr>
-                <w:rFonts w:ascii="Microsoft YaHei" w:hAnsi="Microsoft YaHei" w:eastAsia="Microsoft YaHei" w:cs="Microsoft YaHei"/>
-                <w:b w:val="0"/>
-                <w:color w:val="183652"/>
-                <w:sz w:val="17"/>
-              </w:rPr>
-              <w:t>失败终态和安全错误码</w:t>
-            </w:r>
-          </w:p>
-        </w:tc>
-        <w:tc>
-          <w:tcPr>
-            <w:tcW w:type="dxa" w:w="2387"/>
-            <w:vAlign w:val="center"/>
-            <w:shd w:fill="F8FAFC"/>
-            <w:tcMar>
-              <w:top w:w="90" w:type="dxa"/>
-              <w:start w:w="90" w:type="dxa"/>
-              <w:bottom w:w="90" w:type="dxa"/>
-              <w:end w:w="90" w:type="dxa"/>
-            </w:tcMar>
-          </w:tcPr>
-          <w:p>
-            <w:pPr>
-              <w:spacing w:after="0" w:line="276" w:lineRule="auto"/>
-            </w:pPr>
-            <w:r>
-              <w:rPr>
-                <w:rFonts w:ascii="Microsoft YaHei" w:hAnsi="Microsoft YaHei" w:eastAsia="Microsoft YaHei" w:cs="Microsoft YaHei"/>
-                <w:b w:val="0"/>
-                <w:color w:val="183652"/>
-                <w:sz w:val="17"/>
-              </w:rPr>
-              <w:t>调查；新审批后才可新建命令</w:t>
-            </w:r>
-          </w:p>
-        </w:tc>
-        <w:tc>
-          <w:tcPr>
-            <w:tcW w:type="dxa" w:w="1850"/>
-            <w:vAlign w:val="center"/>
-            <w:shd w:fill="F8FAFC"/>
             <w:tcMar>
               <w:top w:w="90" w:type="dxa"/>
               <w:start w:w="90" w:type="dxa"/>
@@ -13150,7 +14164,7 @@
                 <w:color w:val="183652"/>
                 <w:sz w:val="17"/>
               </w:rPr>
-              <w:t>Owner + same-origin + CSRF + reauth</w:t>
+              <w:t>Owner + same-origin + CSRF + signed preview + idempotency；全账号再加密码与 SEND TO ALL</w:t>
             </w:r>
           </w:p>
         </w:tc>
@@ -14199,7 +15213,7 @@
                 <w:color w:val="183652"/>
                 <w:sz w:val="17"/>
               </w:rPr>
-              <w:t>最后 Owner 被停用/降级</w:t>
+              <w:t>pending 文件不可读</w:t>
             </w:r>
           </w:p>
         </w:tc>
@@ -14226,7 +15240,7 @@
                 <w:color w:val="183652"/>
                 <w:sz w:val="17"/>
               </w:rPr>
-              <w:t>409 last_owner_protected。</w:t>
+              <w:t>入队后游戏服账号必须可读取 0660/group 文件；轮询在有限时间内写 processed/failed。</w:t>
             </w:r>
           </w:p>
         </w:tc>
@@ -14253,7 +15267,7 @@
                 <w:color w:val="183652"/>
                 <w:sz w:val="17"/>
               </w:rPr>
-              <w:t>后台失去可管理 Owner。</w:t>
+              <w:t>静默跳过并永久显示 pending。</w:t>
             </w:r>
           </w:p>
         </w:tc>
@@ -14284,6 +15298,90 @@
                 <w:color w:val="183652"/>
                 <w:sz w:val="17"/>
               </w:rPr>
+              <w:t>最后 Owner 被停用/降级</w:t>
+            </w:r>
+          </w:p>
+        </w:tc>
+        <w:tc>
+          <w:tcPr>
+            <w:tcW w:type="dxa" w:w="4129"/>
+            <w:vAlign w:val="center"/>
+            <w:tcMar>
+              <w:top w:w="90" w:type="dxa"/>
+              <w:start w:w="90" w:type="dxa"/>
+              <w:bottom w:w="90" w:type="dxa"/>
+              <w:end w:w="90" w:type="dxa"/>
+            </w:tcMar>
+          </w:tcPr>
+          <w:p>
+            <w:pPr>
+              <w:spacing w:after="0" w:line="276" w:lineRule="auto"/>
+            </w:pPr>
+            <w:r>
+              <w:rPr>
+                <w:rFonts w:ascii="Microsoft YaHei" w:hAnsi="Microsoft YaHei" w:eastAsia="Microsoft YaHei" w:cs="Microsoft YaHei"/>
+                <w:b w:val="0"/>
+                <w:color w:val="183652"/>
+                <w:sz w:val="17"/>
+              </w:rPr>
+              <w:t>409 last_owner_protected。</w:t>
+            </w:r>
+          </w:p>
+        </w:tc>
+        <w:tc>
+          <w:tcPr>
+            <w:tcW w:type="dxa" w:w="3716"/>
+            <w:vAlign w:val="center"/>
+            <w:tcMar>
+              <w:top w:w="90" w:type="dxa"/>
+              <w:start w:w="90" w:type="dxa"/>
+              <w:bottom w:w="90" w:type="dxa"/>
+              <w:end w:w="90" w:type="dxa"/>
+            </w:tcMar>
+          </w:tcPr>
+          <w:p>
+            <w:pPr>
+              <w:spacing w:after="0" w:line="276" w:lineRule="auto"/>
+            </w:pPr>
+            <w:r>
+              <w:rPr>
+                <w:rFonts w:ascii="Microsoft YaHei" w:hAnsi="Microsoft YaHei" w:eastAsia="Microsoft YaHei" w:cs="Microsoft YaHei"/>
+                <w:b w:val="0"/>
+                <w:color w:val="183652"/>
+                <w:sz w:val="17"/>
+              </w:rPr>
+              <w:t>后台失去可管理 Owner。</w:t>
+            </w:r>
+          </w:p>
+        </w:tc>
+      </w:tr>
+      <w:tr>
+        <w:trPr>
+          <w:cantSplit/>
+        </w:trPr>
+        <w:tc>
+          <w:tcPr>
+            <w:tcW w:type="dxa" w:w="2359"/>
+            <w:vAlign w:val="center"/>
+            <w:shd w:fill="F8FAFC"/>
+            <w:tcMar>
+              <w:top w:w="90" w:type="dxa"/>
+              <w:start w:w="90" w:type="dxa"/>
+              <w:bottom w:w="90" w:type="dxa"/>
+              <w:end w:w="90" w:type="dxa"/>
+            </w:tcMar>
+          </w:tcPr>
+          <w:p>
+            <w:pPr>
+              <w:spacing w:after="0" w:line="276" w:lineRule="auto"/>
+            </w:pPr>
+            <w:r>
+              <w:rPr>
+                <w:rFonts w:ascii="Microsoft YaHei" w:hAnsi="Microsoft YaHei" w:eastAsia="Microsoft YaHei" w:cs="Microsoft YaHei"/>
+                <w:b/>
+                <w:color w:val="183652"/>
+                <w:sz w:val="17"/>
+              </w:rPr>
               <w:t>部分/未知执行结果</w:t>
             </w:r>
           </w:p>
@@ -14292,6 +15390,7 @@
           <w:tcPr>
             <w:tcW w:type="dxa" w:w="4129"/>
             <w:vAlign w:val="center"/>
+            <w:shd w:fill="F8FAFC"/>
             <w:tcMar>
               <w:top w:w="90" w:type="dxa"/>
               <w:start w:w="90" w:type="dxa"/>
@@ -14318,6 +15417,7 @@
           <w:tcPr>
             <w:tcW w:type="dxa" w:w="3716"/>
             <w:vAlign w:val="center"/>
+            <w:shd w:fill="F8FAFC"/>
             <w:tcMar>
               <w:top w:w="90" w:type="dxa"/>
               <w:start w:w="90" w:type="dxa"/>
@@ -16430,7 +17530,7 @@
                 <w:color w:val="183652"/>
                 <w:sz w:val="17"/>
               </w:rPr>
-              <w:t>QA-04</w:t>
+              <w:t>QA-03A</w:t>
             </w:r>
           </w:p>
         </w:tc>
@@ -16457,7 +17557,7 @@
                 <w:color w:val="183652"/>
                 <w:sz w:val="17"/>
               </w:rPr>
-              <w:t>Accounts</w:t>
+              <w:t>Battle types</w:t>
             </w:r>
           </w:p>
         </w:tc>
@@ -16484,7 +17584,7 @@
                 <w:color w:val="183652"/>
                 <w:sz w:val="17"/>
               </w:rPr>
-              <w:t>0、1、13、100000 账号，重复/非法字段、搜索分页。</w:t>
+              <w:t>经典、1v1/2v2/3v3、六人乱斗、AI 补位、历史无类型、重复 report_id。</w:t>
             </w:r>
           </w:p>
         </w:tc>
@@ -16511,7 +17611,7 @@
                 <w:color w:val="183652"/>
                 <w:sz w:val="17"/>
               </w:rPr>
-              <w:t>白名单、去重、稳定排序；窄屏无信息丢失。</w:t>
+              <w:t>每个完成事实恰好一次；battle_type/authority 正确；按类型样本不串线。</w:t>
             </w:r>
           </w:p>
         </w:tc>
@@ -16542,7 +17642,7 @@
                 <w:color w:val="183652"/>
                 <w:sz w:val="17"/>
               </w:rPr>
-              <w:t>QA-05</w:t>
+              <w:t>QA-04</w:t>
             </w:r>
           </w:p>
         </w:tc>
@@ -16568,7 +17668,7 @@
                 <w:color w:val="183652"/>
                 <w:sz w:val="17"/>
               </w:rPr>
-              <w:t>Grant target</w:t>
+              <w:t>Accounts/Decks</w:t>
             </w:r>
           </w:p>
         </w:tc>
@@ -16594,7 +17694,7 @@
                 <w:color w:val="183652"/>
                 <w:sz w:val="17"/>
               </w:rPr>
-              <w:t>指定账号、全服、空投影、确认前目标变化。</w:t>
+              <w:t>0、1、13、100000 账号，搜索、角色行直达发放、段位排序、中文卡名。</w:t>
             </w:r>
           </w:p>
         </w:tc>
@@ -16620,7 +17720,7 @@
                 <w:color w:val="183652"/>
                 <w:sz w:val="17"/>
               </w:rPr>
-              <w:t>目标数准确；变化时要求重新预览；0 目标拒绝。</w:t>
+              <w:t>账号全量、Owner 预选正确；阵容紧凑列表且 rank/stars/elo/user_id 稳定排序。</w:t>
             </w:r>
           </w:p>
         </w:tc>
@@ -16652,7 +17752,7 @@
                 <w:color w:val="183652"/>
                 <w:sz w:val="17"/>
               </w:rPr>
-              <w:t>QA-06</w:t>
+              <w:t>QA-05</w:t>
             </w:r>
           </w:p>
         </w:tc>
@@ -16679,7 +17779,7 @@
                 <w:color w:val="183652"/>
                 <w:sz w:val="17"/>
               </w:rPr>
-              <w:t>Grant validation</w:t>
+              <w:t>Grant target</w:t>
             </w:r>
           </w:p>
         </w:tc>
@@ -16706,7 +17806,7 @@
                 <w:color w:val="183652"/>
                 <w:sz w:val="17"/>
               </w:rPr>
-              <w:t>两种资源、边界数量、未知卡牌、空原因。</w:t>
+              <w:t>指定账号、全服、空投影、发送时目标变化。</w:t>
             </w:r>
           </w:p>
         </w:tc>
@@ -16733,7 +17833,7 @@
                 <w:color w:val="183652"/>
                 <w:sz w:val="17"/>
               </w:rPr>
-              <w:t>无效请求零入队、零审计敏感数据。</w:t>
+              <w:t>指定账号一次点击完成预览+提交；全账号必须密码+SEND TO ALL；目标数准确；变化时拒绝；0 目标拒绝。</w:t>
             </w:r>
           </w:p>
         </w:tc>
@@ -16764,7 +17864,7 @@
                 <w:color w:val="183652"/>
                 <w:sz w:val="17"/>
               </w:rPr>
-              <w:t>QA-07</w:t>
+              <w:t>QA-06</w:t>
             </w:r>
           </w:p>
         </w:tc>
@@ -16790,7 +17890,7 @@
                 <w:color w:val="183652"/>
                 <w:sz w:val="17"/>
               </w:rPr>
-              <w:t>Idempotency</w:t>
+              <w:t>Grant validation</w:t>
             </w:r>
           </w:p>
         </w:tc>
@@ -16816,7 +17916,7 @@
                 <w:color w:val="183652"/>
                 <w:sz w:val="17"/>
               </w:rPr>
-              <w:t>同键串行、并发、超时重试、不同负载。</w:t>
+              <w:t>两种资源、边界数量、未知卡牌、空原因。</w:t>
             </w:r>
           </w:p>
         </w:tc>
@@ -16842,7 +17942,7 @@
                 <w:color w:val="183652"/>
                 <w:sz w:val="17"/>
               </w:rPr>
-              <w:t>只应用一次；冲突明确。</w:t>
+              <w:t>无效请求零入队、零审计敏感数据。</w:t>
             </w:r>
           </w:p>
         </w:tc>
@@ -16874,7 +17974,7 @@
                 <w:color w:val="183652"/>
                 <w:sz w:val="17"/>
               </w:rPr>
-              <w:t>QA-08</w:t>
+              <w:t>QA-07</w:t>
             </w:r>
           </w:p>
         </w:tc>
@@ -16901,7 +18001,7 @@
                 <w:color w:val="183652"/>
                 <w:sz w:val="17"/>
               </w:rPr>
-              <w:t>CAS</w:t>
+              <w:t>Idempotency</w:t>
             </w:r>
           </w:p>
         </w:tc>
@@ -16928,7 +18028,7 @@
                 <w:color w:val="183652"/>
                 <w:sz w:val="17"/>
               </w:rPr>
-              <w:t>revision 竞争、执行器中断/重启、账号缺失。</w:t>
+              <w:t>同键串行、并发、超时重试、不同负载。</w:t>
             </w:r>
           </w:p>
         </w:tc>
@@ -16955,7 +18055,7 @@
                 <w:color w:val="183652"/>
                 <w:sz w:val="17"/>
               </w:rPr>
-              <w:t>不丢更新、不重复加资源、终态可复核。</w:t>
+              <w:t>只应用一次；冲突明确。</w:t>
             </w:r>
           </w:p>
         </w:tc>
@@ -16986,7 +18086,7 @@
                 <w:color w:val="183652"/>
                 <w:sz w:val="17"/>
               </w:rPr>
-              <w:t>QA-09</w:t>
+              <w:t>QA-08</w:t>
             </w:r>
           </w:p>
         </w:tc>
@@ -17012,7 +18112,7 @@
                 <w:color w:val="183652"/>
                 <w:sz w:val="17"/>
               </w:rPr>
-              <w:t>Accessibility</w:t>
+              <w:t>CAS</w:t>
             </w:r>
           </w:p>
         </w:tc>
@@ -17038,7 +18138,7 @@
                 <w:color w:val="183652"/>
                 <w:sz w:val="17"/>
               </w:rPr>
-              <w:t>键盘、读屏、dialog、表格、320px、reduced motion、forced colors。</w:t>
+              <w:t>revision 竞争、执行器中断/重启、账号缺失。</w:t>
             </w:r>
           </w:p>
         </w:tc>
@@ -17064,7 +18164,7 @@
                 <w:color w:val="183652"/>
                 <w:sz w:val="17"/>
               </w:rPr>
-              <w:t>无键盘陷阱；名称/角色/状态完整；核心对比 AA。</w:t>
+              <w:t>不丢更新、不重复加资源、终态可复核。</w:t>
             </w:r>
           </w:p>
         </w:tc>
@@ -17096,7 +18196,7 @@
                 <w:color w:val="183652"/>
                 <w:sz w:val="17"/>
               </w:rPr>
-              <w:t>QA-10</w:t>
+              <w:t>QA-09</w:t>
             </w:r>
           </w:p>
         </w:tc>
@@ -17123,7 +18223,7 @@
                 <w:color w:val="183652"/>
                 <w:sz w:val="17"/>
               </w:rPr>
-              <w:t>Security</w:t>
+              <w:t>Accessibility</w:t>
             </w:r>
           </w:p>
         </w:tc>
@@ -17150,7 +18250,7 @@
                 <w:color w:val="183652"/>
                 <w:sz w:val="17"/>
               </w:rPr>
-              <w:t>CSRF、Origin、Cookie、路径、超大/损坏 JSON、日志脱敏。</w:t>
+              <w:t>键盘、读屏、dialog、表格、320px、reduced motion、forced colors。</w:t>
             </w:r>
           </w:p>
         </w:tc>
@@ -17177,7 +18277,7 @@
                 <w:color w:val="183652"/>
                 <w:sz w:val="17"/>
               </w:rPr>
-              <w:t>全部 fail closed；无秘密、堆栈或物理路径泄露。</w:t>
+              <w:t>无键盘陷阱；名称/角色/状态完整；核心对比 AA。</w:t>
             </w:r>
           </w:p>
         </w:tc>
@@ -17208,7 +18308,7 @@
                 <w:color w:val="183652"/>
                 <w:sz w:val="17"/>
               </w:rPr>
-              <w:t>QA-11</w:t>
+              <w:t>QA-10</w:t>
             </w:r>
           </w:p>
         </w:tc>
@@ -17234,7 +18334,7 @@
                 <w:color w:val="183652"/>
                 <w:sz w:val="17"/>
               </w:rPr>
-              <w:t>Aliyun</w:t>
+              <w:t>Security</w:t>
             </w:r>
           </w:p>
         </w:tc>
@@ -17260,7 +18360,7 @@
                 <w:color w:val="183652"/>
                 <w:sz w:val="17"/>
               </w:rPr>
-              <w:t>部署、TLS、外部访问、健康、日志、持久化、服务重启。</w:t>
+              <w:t>CSRF、Origin、Cookie、路径、超大/损坏 JSON、日志脱敏。</w:t>
             </w:r>
           </w:p>
         </w:tc>
@@ -17286,7 +18386,7 @@
                 <w:color w:val="183652"/>
                 <w:sz w:val="17"/>
               </w:rPr>
-              <w:t>目标环境、版本、端点与证据齐全。</w:t>
+              <w:t>全部 fail closed；无秘密、堆栈或物理路径泄露。</w:t>
             </w:r>
           </w:p>
         </w:tc>
@@ -17318,7 +18418,7 @@
                 <w:color w:val="183652"/>
                 <w:sz w:val="17"/>
               </w:rPr>
-              <w:t>QA-12</w:t>
+              <w:t>QA-11</w:t>
             </w:r>
           </w:p>
         </w:tc>
@@ -17345,7 +18445,7 @@
                 <w:color w:val="183652"/>
                 <w:sz w:val="17"/>
               </w:rPr>
-              <w:t>Rollback</w:t>
+              <w:t>Aliyun</w:t>
             </w:r>
           </w:p>
         </w:tc>
@@ -17372,7 +18472,7 @@
                 <w:color w:val="183652"/>
                 <w:sz w:val="17"/>
               </w:rPr>
-              <w:t>停止入口/执行器、恢复旧构件和数据、pending 隔离。</w:t>
+              <w:t>部署、TLS、外部访问、健康、日志、持久化、服务重启。</w:t>
             </w:r>
           </w:p>
         </w:tc>
@@ -17399,7 +18499,7 @@
                 <w:color w:val="183652"/>
                 <w:sz w:val="17"/>
               </w:rPr>
-              <w:t>已处理命令不重放；恢复后功能与审计一致。</w:t>
+              <w:t>目标环境、版本、端点与证据齐全。</w:t>
             </w:r>
           </w:p>
         </w:tc>
@@ -17430,7 +18530,7 @@
                 <w:color w:val="183652"/>
                 <w:sz w:val="17"/>
               </w:rPr>
-              <w:t>QA-13</w:t>
+              <w:t>QA-12</w:t>
             </w:r>
           </w:p>
         </w:tc>
@@ -17456,7 +18556,7 @@
                 <w:color w:val="183652"/>
                 <w:sz w:val="17"/>
               </w:rPr>
-              <w:t>Authority migration</w:t>
+              <w:t>Rollback</w:t>
             </w:r>
           </w:p>
         </w:tc>
@@ -17482,7 +18582,7 @@
                 <w:color w:val="183652"/>
                 <w:sz w:val="17"/>
               </w:rPr>
-              <w:t>24 个真实形态 v2 合成账号、13 个 installation、已知密码登录、旧客户端首次 CAS、二次加载。</w:t>
+              <w:t>停止入口/执行器、恢复旧构件和数据、pending 隔离。</w:t>
             </w:r>
           </w:p>
         </w:tc>
@@ -17508,7 +18608,7 @@
                 <w:color w:val="183652"/>
                 <w:sz w:val="17"/>
               </w:rPr>
-              <w:t>字段与凭据逐项不变；只新增 v3 字段；二次加载文件字节不变。</w:t>
+              <w:t>已处理命令不重放；恢复后功能与审计一致。</w:t>
             </w:r>
           </w:p>
         </w:tc>
@@ -17540,7 +18640,7 @@
                 <w:color w:val="183652"/>
                 <w:sz w:val="17"/>
               </w:rPr>
-              <w:t>QA-14</w:t>
+              <w:t>QA-13</w:t>
             </w:r>
           </w:p>
         </w:tc>
@@ -17567,7 +18667,7 @@
                 <w:color w:val="183652"/>
                 <w:sz w:val="17"/>
               </w:rPr>
-              <w:t>Authority failure</w:t>
+              <w:t>Authority migration</w:t>
             </w:r>
           </w:p>
         </w:tc>
@@ -17594,7 +18694,7 @@
                 <w:color w:val="183652"/>
                 <w:sz w:val="17"/>
               </w:rPr>
-              <w:t>损坏/不可读/小数或未来版本主文件、父目录权限故障、合法 .previous 恢复、预存/残留生命周期锁、双实例、owner_token 丢失、各阶段写入/rename 故障、后台投影故障。</w:t>
+              <w:t>24 个真实形态 v2 合成账号、13 个 installation、已知密码登录、旧客户端首次 CAS、二次加载。</w:t>
             </w:r>
           </w:p>
         </w:tc>
@@ -17621,7 +18721,7 @@
                 <w:color w:val="183652"/>
                 <w:sz w:val="17"/>
               </w:rPr>
-              <w:t>权威失败均拒绝启动且不覆写；第二实例和陈旧写无法覆盖；只释放自身锁；旧 .previous 可恢复；保存失败回滚内存；投影失败只进入 degraded。</w:t>
+              <w:t>字段与凭据逐项不变；只新增 v3 字段；二次加载文件字节不变。</w:t>
             </w:r>
           </w:p>
         </w:tc>
@@ -17652,7 +18752,7 @@
                 <w:color w:val="183652"/>
                 <w:sz w:val="17"/>
               </w:rPr>
-              <w:t>QA-15</w:t>
+              <w:t>QA-14</w:t>
             </w:r>
           </w:p>
         </w:tc>
@@ -17678,7 +18778,7 @@
                 <w:color w:val="183652"/>
                 <w:sz w:val="17"/>
               </w:rPr>
-              <w:t>Dedicated readiness</w:t>
+              <w:t>Authority failure</w:t>
             </w:r>
           </w:p>
         </w:tc>
@@ -17704,7 +18804,7 @@
                 <w:color w:val="183652"/>
                 <w:sz w:val="17"/>
               </w:rPr>
-              <w:t>authority_storage_ready=false 时启动专用服与 systemd 进程。</w:t>
+              <w:t>损坏/不可读/小数或未来版本主文件、父目录权限故障、合法 .previous 恢复、预存/残留生命周期锁、双实例、owner_token 丢失、各阶段写入/rename 故障、后台投影故障。</w:t>
             </w:r>
           </w:p>
         </w:tc>
@@ -17730,7 +18830,7 @@
                 <w:color w:val="183652"/>
                 <w:sz w:val="17"/>
               </w:rPr>
-              <w:t>不创建 UDP 监听；专用服进程以非零码退出，服务管理器不得显示假 active。</w:t>
+              <w:t>权威失败均拒绝启动且不覆写；第二实例和陈旧写无法覆盖；只释放自身锁；旧 .previous 可恢复；保存失败回滚内存；投影失败只进入 degraded。</w:t>
             </w:r>
           </w:p>
         </w:tc>
@@ -17762,6 +18862,118 @@
                 <w:color w:val="183652"/>
                 <w:sz w:val="17"/>
               </w:rPr>
+              <w:t>QA-15</w:t>
+            </w:r>
+          </w:p>
+        </w:tc>
+        <w:tc>
+          <w:tcPr>
+            <w:tcW w:type="dxa" w:w="1416"/>
+            <w:vAlign w:val="center"/>
+            <w:shd w:fill="F8FAFC"/>
+            <w:tcMar>
+              <w:top w:w="90" w:type="dxa"/>
+              <w:start w:w="90" w:type="dxa"/>
+              <w:bottom w:w="90" w:type="dxa"/>
+              <w:end w:w="90" w:type="dxa"/>
+            </w:tcMar>
+          </w:tcPr>
+          <w:p>
+            <w:pPr>
+              <w:spacing w:after="0" w:line="276" w:lineRule="auto"/>
+            </w:pPr>
+            <w:r>
+              <w:rPr>
+                <w:rFonts w:ascii="Microsoft YaHei" w:hAnsi="Microsoft YaHei" w:eastAsia="Microsoft YaHei" w:cs="Microsoft YaHei"/>
+                <w:b w:val="0"/>
+                <w:color w:val="183652"/>
+                <w:sz w:val="17"/>
+              </w:rPr>
+              <w:t>Dedicated readiness</w:t>
+            </w:r>
+          </w:p>
+        </w:tc>
+        <w:tc>
+          <w:tcPr>
+            <w:tcW w:type="dxa" w:w="3657"/>
+            <w:vAlign w:val="center"/>
+            <w:shd w:fill="F8FAFC"/>
+            <w:tcMar>
+              <w:top w:w="90" w:type="dxa"/>
+              <w:start w:w="90" w:type="dxa"/>
+              <w:bottom w:w="90" w:type="dxa"/>
+              <w:end w:w="90" w:type="dxa"/>
+            </w:tcMar>
+          </w:tcPr>
+          <w:p>
+            <w:pPr>
+              <w:spacing w:after="0" w:line="276" w:lineRule="auto"/>
+            </w:pPr>
+            <w:r>
+              <w:rPr>
+                <w:rFonts w:ascii="Microsoft YaHei" w:hAnsi="Microsoft YaHei" w:eastAsia="Microsoft YaHei" w:cs="Microsoft YaHei"/>
+                <w:b w:val="0"/>
+                <w:color w:val="183652"/>
+                <w:sz w:val="17"/>
+              </w:rPr>
+              <w:t>authority_storage_ready=false 时启动专用服与 systemd 进程。</w:t>
+            </w:r>
+          </w:p>
+        </w:tc>
+        <w:tc>
+          <w:tcPr>
+            <w:tcW w:type="dxa" w:w="4247"/>
+            <w:vAlign w:val="center"/>
+            <w:shd w:fill="F8FAFC"/>
+            <w:tcMar>
+              <w:top w:w="90" w:type="dxa"/>
+              <w:start w:w="90" w:type="dxa"/>
+              <w:bottom w:w="90" w:type="dxa"/>
+              <w:end w:w="90" w:type="dxa"/>
+            </w:tcMar>
+          </w:tcPr>
+          <w:p>
+            <w:pPr>
+              <w:spacing w:after="0" w:line="276" w:lineRule="auto"/>
+            </w:pPr>
+            <w:r>
+              <w:rPr>
+                <w:rFonts w:ascii="Microsoft YaHei" w:hAnsi="Microsoft YaHei" w:eastAsia="Microsoft YaHei" w:cs="Microsoft YaHei"/>
+                <w:b w:val="0"/>
+                <w:color w:val="183652"/>
+                <w:sz w:val="17"/>
+              </w:rPr>
+              <w:t>不创建 UDP 监听；专用服进程以非零码退出，服务管理器不得显示假 active。</w:t>
+            </w:r>
+          </w:p>
+        </w:tc>
+      </w:tr>
+      <w:tr>
+        <w:trPr>
+          <w:cantSplit/>
+        </w:trPr>
+        <w:tc>
+          <w:tcPr>
+            <w:tcW w:type="dxa" w:w="885"/>
+            <w:vAlign w:val="center"/>
+            <w:tcMar>
+              <w:top w:w="90" w:type="dxa"/>
+              <w:start w:w="90" w:type="dxa"/>
+              <w:bottom w:w="90" w:type="dxa"/>
+              <w:end w:w="90" w:type="dxa"/>
+            </w:tcMar>
+          </w:tcPr>
+          <w:p>
+            <w:pPr>
+              <w:spacing w:after="0" w:line="276" w:lineRule="auto"/>
+            </w:pPr>
+            <w:r>
+              <w:rPr>
+                <w:rFonts w:ascii="Microsoft YaHei" w:hAnsi="Microsoft YaHei" w:eastAsia="Microsoft YaHei" w:cs="Microsoft YaHei"/>
+                <w:b/>
+                <w:color w:val="183652"/>
+                <w:sz w:val="17"/>
+              </w:rPr>
               <w:t>QA-16</w:t>
             </w:r>
           </w:p>
@@ -17770,7 +18982,6 @@
           <w:tcPr>
             <w:tcW w:type="dxa" w:w="1416"/>
             <w:vAlign w:val="center"/>
-            <w:shd w:fill="F8FAFC"/>
             <w:tcMar>
               <w:top w:w="90" w:type="dxa"/>
               <w:start w:w="90" w:type="dxa"/>
@@ -17797,7 +19008,6 @@
           <w:tcPr>
             <w:tcW w:type="dxa" w:w="3657"/>
             <w:vAlign w:val="center"/>
-            <w:shd w:fill="F8FAFC"/>
             <w:tcMar>
               <w:top w:w="90" w:type="dxa"/>
               <w:start w:w="90" w:type="dxa"/>
@@ -17824,7 +19034,6 @@
           <w:tcPr>
             <w:tcW w:type="dxa" w:w="4247"/>
             <w:vAlign w:val="center"/>
-            <w:shd w:fill="F8FAFC"/>
             <w:tcMar>
               <w:top w:w="90" w:type="dxa"/>
               <w:start w:w="90" w:type="dxa"/>
@@ -18211,7 +19420,7 @@
                 <w:color w:val="183652"/>
                 <w:sz w:val="17"/>
               </w:rPr>
-              <w:t>六页顺序、三类角色边界、所有 loading/empty/error/success/danger 状态与四步资源流程实现。</w:t>
+              <w:t>七页顺序、角色全量、列表阵容、按类型平衡、指定账号一次提交与全账号强确认流程实现。</w:t>
             </w:r>
           </w:p>
         </w:tc>
@@ -18270,7 +19479,7 @@
                 <w:color w:val="183652"/>
                 <w:sz w:val="17"/>
               </w:rPr>
-              <w:t>两个只读快照与命令目录严格隔离；动物六字段和账号字段契约可由自动测试验证。</w:t>
+              <w:t>全部可上报完成战斗按类型入库；两个只读快照与命令目录严格隔离；跨服务命令在有限时间内终结。</w:t>
             </w:r>
           </w:p>
         </w:tc>
@@ -18327,7 +19536,7 @@
                 <w:color w:val="183652"/>
                 <w:sz w:val="17"/>
               </w:rPr>
-              <w:t>无默认/明文凭据；Owner、CSRF、同源、重新认证、二次确认、幂等、CAS、审计全部 fail closed。</w:t>
+              <w:t>无默认/明文凭据；Owner、CSRF、同源、签名预览、冻结目标、幂等、CAS、审计全部 fail closed。</w:t>
             </w:r>
           </w:p>
         </w:tc>
@@ -18524,7 +19733,7 @@
           <w:color w:val="183652"/>
           <w:sz w:val="21"/>
         </w:rPr>
-        <w:t>只有上述完成定义全部满足，且资源指令在授权阿里云测试环境完成一次指定账号、一次全服小规模受控验证与重启幂等验证，F-ZC-ADMIN-001 v1.1.2 才可从 MATERIAL / IMPLEMENTATION_CONTRACT 进入发布验收。</w:t>
+        <w:t>只有上述完成定义全部满足，且资源指令在授权阿里云 staging 测试账号完成一次真实 processed 到账与重启幂等验证，F-ZC-ADMIN-001 v1.2.0 才可从 MATERIAL / IMPLEMENTATION_CONTRACT 进入发布验收。全账号只验证冻结目标与命令合同，不对真实玩家执行群发。</w:t>
       </w:r>
     </w:p>
     <w:sectPr>
@@ -18617,7 +19826,7 @@
         <w:color w:val="566574"/>
         <w:sz w:val="16"/>
       </w:rPr>
-      <w:t>Jungle Law | F-ZC-ADMIN-001 v1.1.2 | MATERIAL / IMPLEMENTATION_CONTRACT</w:t>
+      <w:t>Jungle Law | F-ZC-ADMIN-001 v1.2.0 | MATERIAL / IMPLEMENTATION_CONTRACT</w:t>
     </w:r>
   </w:p>
 </w:hdr>

</xml_diff>

<commit_message>
feat(admin): add multi-player resource grants
</commit_message>
<xml_diff>
--- a/docs/ADMIN_ANALYTICS_DASHBOARD_DESIGN.docx
+++ b/docs/ADMIN_ANALYTICS_DASHBOARD_DESIGN.docx
@@ -31,7 +31,7 @@
           <w:color w:val="205C8E"/>
           <w:sz w:val="28"/>
         </w:rPr>
-        <w:t>F-ZC-ADMIN-001 · v1.2.0</w:t>
+        <w:t>F-ZC-ADMIN-001 · v1.3.0</w:t>
       </w:r>
     </w:p>
     <w:tbl>
@@ -267,7 +267,7 @@
                 <w:color w:val="183652"/>
                 <w:sz w:val="17"/>
               </w:rPr>
-              <w:t>v1.2.0</w:t>
+              <w:t>v1.3.0</w:t>
             </w:r>
           </w:p>
         </w:tc>
@@ -383,7 +383,7 @@
                 <w:color w:val="183652"/>
                 <w:sz w:val="17"/>
               </w:rPr>
-              <w:t>2026-08-22</w:t>
+              <w:t>2026-08-23</w:t>
             </w:r>
           </w:p>
         </w:tc>
@@ -1417,6 +1417,146 @@
           </w:p>
         </w:tc>
       </w:tr>
+      <w:tr>
+        <w:trPr>
+          <w:cantSplit/>
+        </w:trPr>
+        <w:tc>
+          <w:tcPr>
+            <w:tcW w:type="dxa" w:w="966"/>
+            <w:vAlign w:val="center"/>
+            <w:shd w:fill="F8FAFC"/>
+            <w:tcMar>
+              <w:top w:w="90" w:type="dxa"/>
+              <w:start w:w="90" w:type="dxa"/>
+              <w:bottom w:w="90" w:type="dxa"/>
+              <w:end w:w="90" w:type="dxa"/>
+            </w:tcMar>
+          </w:tcPr>
+          <w:p>
+            <w:pPr>
+              <w:spacing w:after="0" w:line="276" w:lineRule="auto"/>
+            </w:pPr>
+            <w:r>
+              <w:rPr>
+                <w:rFonts w:ascii="Microsoft YaHei" w:hAnsi="Microsoft YaHei" w:eastAsia="Microsoft YaHei" w:cs="Microsoft YaHei"/>
+                <w:b/>
+                <w:color w:val="183652"/>
+                <w:sz w:val="17"/>
+              </w:rPr>
+              <w:t>v1.3.0</w:t>
+            </w:r>
+          </w:p>
+        </w:tc>
+        <w:tc>
+          <w:tcPr>
+            <w:tcW w:type="dxa" w:w="1208"/>
+            <w:vAlign w:val="center"/>
+            <w:shd w:fill="F8FAFC"/>
+            <w:tcMar>
+              <w:top w:w="90" w:type="dxa"/>
+              <w:start w:w="90" w:type="dxa"/>
+              <w:bottom w:w="90" w:type="dxa"/>
+              <w:end w:w="90" w:type="dxa"/>
+            </w:tcMar>
+          </w:tcPr>
+          <w:p>
+            <w:pPr>
+              <w:spacing w:after="0" w:line="276" w:lineRule="auto"/>
+            </w:pPr>
+            <w:r>
+              <w:rPr>
+                <w:rFonts w:ascii="Microsoft YaHei" w:hAnsi="Microsoft YaHei" w:eastAsia="Microsoft YaHei" w:cs="Microsoft YaHei"/>
+                <w:b w:val="0"/>
+                <w:color w:val="183652"/>
+                <w:sz w:val="17"/>
+              </w:rPr>
+              <w:t>2026-08-23</w:t>
+            </w:r>
+          </w:p>
+        </w:tc>
+        <w:tc>
+          <w:tcPr>
+            <w:tcW w:type="dxa" w:w="1751"/>
+            <w:vAlign w:val="center"/>
+            <w:shd w:fill="F8FAFC"/>
+            <w:tcMar>
+              <w:top w:w="90" w:type="dxa"/>
+              <w:start w:w="90" w:type="dxa"/>
+              <w:bottom w:w="90" w:type="dxa"/>
+              <w:end w:w="90" w:type="dxa"/>
+            </w:tcMar>
+          </w:tcPr>
+          <w:p>
+            <w:pPr>
+              <w:spacing w:after="0" w:line="276" w:lineRule="auto"/>
+            </w:pPr>
+            <w:r>
+              <w:rPr>
+                <w:rFonts w:ascii="Microsoft YaHei" w:hAnsi="Microsoft YaHei" w:eastAsia="Microsoft YaHei" w:cs="Microsoft YaHei"/>
+                <w:b w:val="0"/>
+                <w:color w:val="183652"/>
+                <w:sz w:val="17"/>
+              </w:rPr>
+              <w:t>MATERIAL / IMPLEMENTATION_CONTRACT</w:t>
+            </w:r>
+          </w:p>
+        </w:tc>
+        <w:tc>
+          <w:tcPr>
+            <w:tcW w:type="dxa" w:w="3744"/>
+            <w:vAlign w:val="center"/>
+            <w:shd w:fill="F8FAFC"/>
+            <w:tcMar>
+              <w:top w:w="90" w:type="dxa"/>
+              <w:start w:w="90" w:type="dxa"/>
+              <w:bottom w:w="90" w:type="dxa"/>
+              <w:end w:w="90" w:type="dxa"/>
+            </w:tcMar>
+          </w:tcPr>
+          <w:p>
+            <w:pPr>
+              <w:spacing w:after="0" w:line="276" w:lineRule="auto"/>
+            </w:pPr>
+            <w:r>
+              <w:rPr>
+                <w:rFonts w:ascii="Microsoft YaHei" w:hAnsi="Microsoft YaHei" w:eastAsia="Microsoft YaHei" w:cs="Microsoft YaHei"/>
+                <w:b w:val="0"/>
+                <w:color w:val="183652"/>
+                <w:sz w:val="17"/>
+              </w:rPr>
+              <w:t>资源页改为可搜索的玩家明细表，直接展示完整玩家 ID 与脱敏运营数据；支持持续勾选多个玩家并以一条冻结、签名、幂等命令原子发放。</w:t>
+            </w:r>
+          </w:p>
+        </w:tc>
+        <w:tc>
+          <w:tcPr>
+            <w:tcW w:type="dxa" w:w="2536"/>
+            <w:vAlign w:val="center"/>
+            <w:shd w:fill="F8FAFC"/>
+            <w:tcMar>
+              <w:top w:w="90" w:type="dxa"/>
+              <w:start w:w="90" w:type="dxa"/>
+              <w:bottom w:w="90" w:type="dxa"/>
+              <w:end w:w="90" w:type="dxa"/>
+            </w:tcMar>
+          </w:tcPr>
+          <w:p>
+            <w:pPr>
+              <w:spacing w:after="0" w:line="276" w:lineRule="auto"/>
+            </w:pPr>
+            <w:r>
+              <w:rPr>
+                <w:rFonts w:ascii="Microsoft YaHei" w:hAnsi="Microsoft YaHei" w:eastAsia="Microsoft YaHei" w:cs="Microsoft YaHei"/>
+                <w:b w:val="0"/>
+                <w:color w:val="183652"/>
+                <w:sz w:val="17"/>
+              </w:rPr>
+              <w:t>沿用深色暖金组件体系；v1.3 可编辑资源页状态仍为 PENDING，不冒充已同步。</w:t>
+            </w:r>
+          </w:p>
+        </w:tc>
+      </w:tr>
     </w:tbl>
     <w:p>
       <w:pPr>
@@ -1449,7 +1589,7 @@
           <w:color w:val="183652"/>
           <w:sz w:val="21"/>
         </w:rPr>
-        <w:t>本文件是 F-ZC-ADMIN-001 v1.2.0 的 MATERIAL / IMPLEMENTATION_CONTRACT。它约束产品、前端、后台 API、战斗统计采集、资源命令执行器、阿里云部署和 QA；实现与本文件冲突时，必须先完成正式变更评审并同步本文与可编辑设计源。</w:t>
+        <w:t>本文件是 F-ZC-ADMIN-001 v1.3.0 的 MATERIAL / IMPLEMENTATION_CONTRACT。它约束产品、前端、后台 API、战斗统计采集、资源命令执行器、阿里云部署和 QA；实现与本文件冲突时，必须先完成正式变更评审并同步本文与可编辑设计源。</w:t>
       </w:r>
     </w:p>
     <w:p>
@@ -1524,7 +1664,7 @@
           <w:color w:val="183652"/>
           <w:sz w:val="21"/>
         </w:rPr>
-        <w:t>允许 Owner 给指定账号或全部账号创建抽卡券、卡牌副本资源指令。</w:t>
+        <w:t>资源页直接展示每个玩家的完整 user_id、脱敏账号、段位/星数/Elo、阵容卡数、抽卡券、卡牌总份数、更新时间与 profile revision，并支持搜索后勾选一个或多个玩家。</w:t>
       </w:r>
     </w:p>
     <w:p>
@@ -1539,7 +1679,7 @@
           <w:color w:val="183652"/>
           <w:sz w:val="21"/>
         </w:rPr>
-        <w:t>指定账号资源发放只保留一次明确提交；全账号群发仍强制 Owner 密码与 SEND TO ALL，所有发放继续强制同源/CSRF、签名预览、冻结目标、幂等、审计与终态回执。</w:t>
+        <w:t>允许 Owner 给单个、多个选中玩家或全部账号创建抽卡券、卡牌副本资源指令。单个与多选只保留一次明确提交；全账号群发仍强制 Owner 密码与 SEND TO ALL。所有发放继续强制同源/CSRF、签名预览、冻结目标、幂等、审计与终态回执。</w:t>
       </w:r>
     </w:p>
     <w:p>
@@ -2490,7 +2630,7 @@
           <w:color w:val="183652"/>
           <w:sz w:val="21"/>
         </w:rPr>
-        <w:t>Owner 资源发放：指定账号一次提交；全部账号保留密码重认证与 SEND TO ALL；两者均含原因、幂等键与终态回执。</w:t>
+        <w:t>Owner 资源发放：玩家明细表持续勾选，单个/多选玩家一次提交；全部账号保留密码重认证与 SEND TO ALL；三种范围均含原因、幂等键与终态回执。</w:t>
       </w:r>
     </w:p>
     <w:p>
@@ -2960,7 +3100,7 @@
                 <w:color w:val="183652"/>
                 <w:sz w:val="17"/>
               </w:rPr>
-              <w:t>指定账号一次提交；全账号强确认；所有指令有明确目标、原因、幂等键和终态回执。</w:t>
+              <w:t>可见玩家明细并勾选单个/多个目标一次提交；全账号强确认；所有指令有明确目标、原因、幂等键和终态回执。</w:t>
             </w:r>
           </w:p>
         </w:tc>
@@ -3588,7 +3728,7 @@
                 <w:color w:val="183652"/>
                 <w:sz w:val="17"/>
               </w:rPr>
-              <w:t>1 填写</w:t>
+              <w:t>1 选择玩家</w:t>
             </w:r>
           </w:p>
         </w:tc>
@@ -3614,7 +3754,7 @@
                 <w:color w:val="183652"/>
                 <w:sz w:val="17"/>
               </w:rPr>
-              <w:t>从角色行进入指定账号，或在资源页选择指定/全部账号；填写资源、数量和原因。</w:t>
+              <w:t>资源页直接呈现玩家明细表；Owner 可搜索、逐行勾选、全选当前结果或清空选择。</w:t>
             </w:r>
           </w:p>
         </w:tc>
@@ -3640,7 +3780,7 @@
                 <w:color w:val="183652"/>
                 <w:sz w:val="17"/>
               </w:rPr>
-              <w:t>页面明确显示目标与影响范围。</w:t>
+              <w:t>搜索不清除已勾选玩家；页面持续显示“已选择 X / 全部 N”。</w:t>
             </w:r>
           </w:p>
         </w:tc>
@@ -3666,7 +3806,7 @@
                 <w:color w:val="183652"/>
                 <w:sz w:val="17"/>
               </w:rPr>
-              <w:t>不得在字段不完整时请求服务器预览。</w:t>
+              <w:t>不得只显示下拉框、截断完整 user_id，或把隐藏分页当作全选。</w:t>
             </w:r>
           </w:p>
         </w:tc>
@@ -3698,7 +3838,7 @@
                 <w:color w:val="183652"/>
                 <w:sz w:val="17"/>
               </w:rPr>
-              <w:t>2 指定账号</w:t>
+              <w:t>2 单个/多选</w:t>
             </w:r>
           </w:p>
         </w:tc>
@@ -3725,7 +3865,7 @@
                 <w:color w:val="183652"/>
                 <w:sz w:val="17"/>
               </w:rPr>
-              <w:t>点击一次“确认发放”；前端取得服务器签名预览后，用同一幂等键立即提交。</w:t>
+              <w:t>填写资源、数量和原因后点击一次“确认发放”；前端取得服务器签名预览后，用同一幂等键立即提交。</w:t>
             </w:r>
           </w:p>
         </w:tc>
@@ -3752,7 +3892,7 @@
                 <w:color w:val="183652"/>
                 <w:sz w:val="17"/>
               </w:rPr>
-              <w:t>服务器冻结单一 user_id 并返回 command_id；不再要求第二次输入密码或 SEND。</w:t>
+              <w:t>单个冻结一个 user_id；多选冻结排序后的 2..500 个唯一 user_id；服务器以一条 command_id 原子处理。</w:t>
             </w:r>
           </w:p>
         </w:tc>
@@ -3779,7 +3919,7 @@
                 <w:color w:val="183652"/>
                 <w:sz w:val="17"/>
               </w:rPr>
-              <w:t>不得绕过 Owner、同源/CSRF、预览签名、幂等与审计。</w:t>
+              <w:t>不得拆成多条浏览器请求、静默去重重复 ID、夹带密码/SEND 或绕过预览签名。</w:t>
             </w:r>
           </w:p>
         </w:tc>
@@ -3836,7 +3976,7 @@
                 <w:color w:val="183652"/>
                 <w:sz w:val="17"/>
               </w:rPr>
-              <w:t>生成服务器预览后显示冻结目标数；Owner 输入当前密码和 SEND TO ALL 再提交。</w:t>
+              <w:t>当选择覆盖当前全部账号时自动升级为 all；生成预览后显示冻结目标数，Owner 输入当前密码和 SEND TO ALL 再提交。</w:t>
             </w:r>
           </w:p>
         </w:tc>
@@ -3862,7 +4002,7 @@
                 <w:color w:val="183652"/>
                 <w:sz w:val="17"/>
               </w:rPr>
-              <w:t>密码错误、确认文本错误或目标集合变化均拒绝，且不入队。</w:t>
+              <w:t>密码错误、确认文本错误、目标集合变化或用 selected 冒充全服均拒绝，且不入队。</w:t>
             </w:r>
           </w:p>
         </w:tc>
@@ -3888,7 +4028,7 @@
                 <w:color w:val="183652"/>
                 <w:sz w:val="17"/>
               </w:rPr>
-              <w:t>不得把单账号的一次提交规则扩展成无保护群发。</w:t>
+              <w:t>不得把多选一次提交规则扩展成无保护群发。</w:t>
             </w:r>
           </w:p>
         </w:tc>
@@ -4909,7 +5049,35 @@
           <w:color w:val="183652"/>
           <w:sz w:val="21"/>
         </w:rPr>
-        <w:t>资源页首先加载账号投影以得到可选择目标和全服目标数。账号投影不是 ready 或账号数为 0 时，全服和指定发放都 fail closed。指定账号只需一次明确提交，页面内部取得短期签名预览后立即提交冻结负载；全账号预览则必须显示冻结目标数，并要求 Owner 密码重认证和 SEND TO ALL。提交后自动查询同一 command_id：processed 才显示已到账，failed 显示安全错误，pending 只保留单一处理中摘要。</w:t>
+        <w:t>资源页首先加载账号投影并把全部玩家直接呈现在可搜索、可勾选的数据表中，不再用目标范围和账号下拉框遮蔽玩家数据。表格列固定为：勾选、完整 user_id、脱敏账号、段位/星数/Elo、阵容卡数、抽卡券、卡牌总份数、投影更新时间、profile revision。完整 user_id 不做省略；窄屏以 data-label 卡片换行呈现，不引入页面级横向滚动。</w:t>
+      </w:r>
+    </w:p>
+    <w:p>
+      <w:pPr>
+        <w:spacing w:after="100" w:line="307" w:lineRule="auto"/>
+      </w:pPr>
+      <w:r>
+        <w:rPr>
+          <w:rFonts w:ascii="Microsoft YaHei" w:hAnsi="Microsoft YaHei" w:eastAsia="Microsoft YaHei" w:cs="Microsoft YaHei"/>
+          <w:b w:val="0"/>
+          <w:color w:val="183652"/>
+          <w:sz w:val="21"/>
+        </w:rPr>
+        <w:t>选择集合独立于搜索结果：搜索只改变当前可见行，“全选当前结果”并入集合，“清空选择”显式移除全部，投影刷新时只保留仍存在的 user_id。选择 1 人使用 target；选择 2..500 人使用 selected；若选择覆盖当前全部账号，必须自动升级为 all，不允许用 selected 绕过全服强确认。账号投影不是 ready、账号数为 0、选择为空、存在重复/未知 ID、选择超过 500 或签名后目标集合变化时均 fail closed。</w:t>
+      </w:r>
+    </w:p>
+    <w:p>
+      <w:pPr>
+        <w:spacing w:after="100" w:line="307" w:lineRule="auto"/>
+      </w:pPr>
+      <w:r>
+        <w:rPr>
+          <w:rFonts w:ascii="Microsoft YaHei" w:hAnsi="Microsoft YaHei" w:eastAsia="Microsoft YaHei" w:cs="Microsoft YaHei"/>
+          <w:b w:val="0"/>
+          <w:color w:val="183652"/>
+          <w:sz w:val="21"/>
+        </w:rPr>
+        <w:t>target 与 selected 都只需一次明确提交：页面内部取得绑定已排序目标列表和摘要的短期签名预览后立即提交同一冻结负载；all 预览必须显示冻结目标数，并要求 Owner 密码重认证和 SEND TO ALL。提交后自动查询同一 command_id：processed 才显示已到账，failed 显示安全错误，pending 只保留单一处理中摘要。多选是一条命令和一次权威存档提交；任一目标校验或持久化失败时整条命令失败并恢复提交前内存，不得出现部分玩家已到账而页面宣称整体成功。</w:t>
       </w:r>
     </w:p>
     <w:p>
@@ -6079,6 +6247,118 @@
                 <w:color w:val="183652"/>
                 <w:sz w:val="17"/>
               </w:rPr>
+              <w:t>v1.3 多选资源页</w:t>
+            </w:r>
+          </w:p>
+        </w:tc>
+        <w:tc>
+          <w:tcPr>
+            <w:tcW w:type="dxa" w:w="1671"/>
+            <w:vAlign w:val="center"/>
+            <w:shd w:fill="F8FAFC"/>
+            <w:tcMar>
+              <w:top w:w="90" w:type="dxa"/>
+              <w:start w:w="90" w:type="dxa"/>
+              <w:bottom w:w="90" w:type="dxa"/>
+              <w:end w:w="90" w:type="dxa"/>
+            </w:tcMar>
+          </w:tcPr>
+          <w:p>
+            <w:pPr>
+              <w:spacing w:after="0" w:line="276" w:lineRule="auto"/>
+            </w:pPr>
+            <w:r>
+              <w:rPr>
+                <w:rFonts w:ascii="Microsoft YaHei" w:hAnsi="Microsoft YaHei" w:eastAsia="Microsoft YaHei" w:cs="Microsoft YaHei"/>
+                <w:b w:val="0"/>
+                <w:color w:val="183652"/>
+                <w:sz w:val="17"/>
+              </w:rPr>
+              <w:t>待分配</w:t>
+            </w:r>
+          </w:p>
+        </w:tc>
+        <w:tc>
+          <w:tcPr>
+            <w:tcW w:type="dxa" w:w="2089"/>
+            <w:vAlign w:val="center"/>
+            <w:shd w:fill="F8FAFC"/>
+            <w:tcMar>
+              <w:top w:w="90" w:type="dxa"/>
+              <w:start w:w="90" w:type="dxa"/>
+              <w:bottom w:w="90" w:type="dxa"/>
+              <w:end w:w="90" w:type="dxa"/>
+            </w:tcMar>
+          </w:tcPr>
+          <w:p>
+            <w:pPr>
+              <w:spacing w:after="0" w:line="276" w:lineRule="auto"/>
+            </w:pPr>
+            <w:r>
+              <w:rPr>
+                <w:rFonts w:ascii="Microsoft YaHei" w:hAnsi="Microsoft YaHei" w:eastAsia="Microsoft YaHei" w:cs="Microsoft YaHei"/>
+                <w:b w:val="0"/>
+                <w:color w:val="183652"/>
+                <w:sz w:val="17"/>
+              </w:rPr>
+              <w:t>PENDING：可编辑设计未同步</w:t>
+            </w:r>
+          </w:p>
+        </w:tc>
+        <w:tc>
+          <w:tcPr>
+            <w:tcW w:type="dxa" w:w="4714"/>
+            <w:vAlign w:val="center"/>
+            <w:shd w:fill="F8FAFC"/>
+            <w:tcMar>
+              <w:top w:w="90" w:type="dxa"/>
+              <w:start w:w="90" w:type="dxa"/>
+              <w:bottom w:w="90" w:type="dxa"/>
+              <w:end w:w="90" w:type="dxa"/>
+            </w:tcMar>
+          </w:tcPr>
+          <w:p>
+            <w:pPr>
+              <w:spacing w:after="0" w:line="276" w:lineRule="auto"/>
+            </w:pPr>
+            <w:r>
+              <w:rPr>
+                <w:rFonts w:ascii="Microsoft YaHei" w:hAnsi="Microsoft YaHei" w:eastAsia="Microsoft YaHei" w:cs="Microsoft YaHei"/>
+                <w:b w:val="0"/>
+                <w:color w:val="183652"/>
+                <w:sz w:val="17"/>
+              </w:rPr>
+              <w:t>本次按用户明确行为合同实现玩家明细表、持续勾选、多选一次提交与全服升级；不得声称 Figma 已完成。</w:t>
+            </w:r>
+          </w:p>
+        </w:tc>
+      </w:tr>
+      <w:tr>
+        <w:trPr>
+          <w:cantSplit/>
+        </w:trPr>
+        <w:tc>
+          <w:tcPr>
+            <w:tcW w:type="dxa" w:w="1731"/>
+            <w:vAlign w:val="center"/>
+            <w:tcMar>
+              <w:top w:w="90" w:type="dxa"/>
+              <w:start w:w="90" w:type="dxa"/>
+              <w:bottom w:w="90" w:type="dxa"/>
+              <w:end w:w="90" w:type="dxa"/>
+            </w:tcMar>
+          </w:tcPr>
+          <w:p>
+            <w:pPr>
+              <w:spacing w:after="0" w:line="276" w:lineRule="auto"/>
+            </w:pPr>
+            <w:r>
+              <w:rPr>
+                <w:rFonts w:ascii="Microsoft YaHei" w:hAnsi="Microsoft YaHei" w:eastAsia="Microsoft YaHei" w:cs="Microsoft YaHei"/>
+                <w:b/>
+                <w:color w:val="183652"/>
+                <w:sz w:val="17"/>
+              </w:rPr>
               <w:t>任务/权限</w:t>
             </w:r>
           </w:p>
@@ -6087,7 +6367,6 @@
           <w:tcPr>
             <w:tcW w:type="dxa" w:w="1671"/>
             <w:vAlign w:val="center"/>
-            <w:shd w:fill="F8FAFC"/>
             <w:tcMar>
               <w:top w:w="90" w:type="dxa"/>
               <w:start w:w="90" w:type="dxa"/>
@@ -6114,7 +6393,6 @@
           <w:tcPr>
             <w:tcW w:type="dxa" w:w="2089"/>
             <w:vAlign w:val="center"/>
-            <w:shd w:fill="F8FAFC"/>
             <w:tcMar>
               <w:top w:w="90" w:type="dxa"/>
               <w:start w:w="90" w:type="dxa"/>
@@ -6141,7 +6419,6 @@
           <w:tcPr>
             <w:tcW w:type="dxa" w:w="4714"/>
             <w:vAlign w:val="center"/>
-            <w:shd w:fill="F8FAFC"/>
             <w:tcMar>
               <w:top w:w="90" w:type="dxa"/>
               <w:start w:w="90" w:type="dxa"/>
@@ -6183,7 +6460,7 @@
           <w:color w:val="205C8E"/>
           <w:sz w:val="27"/>
         </w:rPr>
-        <w:t>4.9 v1.2 视觉风格与排版契约</w:t>
+        <w:t>4.9 v1.3 视觉风格与排版契约</w:t>
       </w:r>
     </w:p>
     <w:p>
@@ -6654,6 +6931,90 @@
                 <w:color w:val="183652"/>
                 <w:sz w:val="17"/>
               </w:rPr>
+              <w:t>资源玩家表</w:t>
+            </w:r>
+          </w:p>
+        </w:tc>
+        <w:tc>
+          <w:tcPr>
+            <w:tcW w:type="dxa" w:w="4692"/>
+            <w:vAlign w:val="center"/>
+            <w:tcMar>
+              <w:top w:w="90" w:type="dxa"/>
+              <w:start w:w="90" w:type="dxa"/>
+              <w:bottom w:w="90" w:type="dxa"/>
+              <w:end w:w="90" w:type="dxa"/>
+            </w:tcMar>
+          </w:tcPr>
+          <w:p>
+            <w:pPr>
+              <w:spacing w:after="0" w:line="276" w:lineRule="auto"/>
+            </w:pPr>
+            <w:r>
+              <w:rPr>
+                <w:rFonts w:ascii="Microsoft YaHei" w:hAnsi="Microsoft YaHei" w:eastAsia="Microsoft YaHei" w:cs="Microsoft YaHei"/>
+                <w:b w:val="0"/>
+                <w:color w:val="183652"/>
+                <w:sz w:val="17"/>
+              </w:rPr>
+              <w:t>表格优先占满主内容宽度；搜索、选择计数、全选当前结果和清空选择置于同一工具栏；选中行同时用复选框、底色和文字状态表达。</w:t>
+            </w:r>
+          </w:p>
+        </w:tc>
+        <w:tc>
+          <w:tcPr>
+            <w:tcW w:type="dxa" w:w="3988"/>
+            <w:vAlign w:val="center"/>
+            <w:tcMar>
+              <w:top w:w="90" w:type="dxa"/>
+              <w:start w:w="90" w:type="dxa"/>
+              <w:bottom w:w="90" w:type="dxa"/>
+              <w:end w:w="90" w:type="dxa"/>
+            </w:tcMar>
+          </w:tcPr>
+          <w:p>
+            <w:pPr>
+              <w:spacing w:after="0" w:line="276" w:lineRule="auto"/>
+            </w:pPr>
+            <w:r>
+              <w:rPr>
+                <w:rFonts w:ascii="Microsoft YaHei" w:hAnsi="Microsoft YaHei" w:eastAsia="Microsoft YaHei" w:cs="Microsoft YaHei"/>
+                <w:b w:val="0"/>
+                <w:color w:val="183652"/>
+                <w:sz w:val="17"/>
+              </w:rPr>
+              <w:t>把玩家重新藏回下拉框、仅用颜色表示选中、搜索后丢失选择，或省略完整 user_id。</w:t>
+            </w:r>
+          </w:p>
+        </w:tc>
+      </w:tr>
+      <w:tr>
+        <w:trPr>
+          <w:cantSplit/>
+        </w:trPr>
+        <w:tc>
+          <w:tcPr>
+            <w:tcW w:type="dxa" w:w="1525"/>
+            <w:vAlign w:val="center"/>
+            <w:shd w:fill="F8FAFC"/>
+            <w:tcMar>
+              <w:top w:w="90" w:type="dxa"/>
+              <w:start w:w="90" w:type="dxa"/>
+              <w:bottom w:w="90" w:type="dxa"/>
+              <w:end w:w="90" w:type="dxa"/>
+            </w:tcMar>
+          </w:tcPr>
+          <w:p>
+            <w:pPr>
+              <w:spacing w:after="0" w:line="276" w:lineRule="auto"/>
+            </w:pPr>
+            <w:r>
+              <w:rPr>
+                <w:rFonts w:ascii="Microsoft YaHei" w:hAnsi="Microsoft YaHei" w:eastAsia="Microsoft YaHei" w:cs="Microsoft YaHei"/>
+                <w:b/>
+                <w:color w:val="183652"/>
+                <w:sz w:val="17"/>
+              </w:rPr>
               <w:t>响应式</w:t>
             </w:r>
           </w:p>
@@ -6662,6 +7023,7 @@
           <w:tcPr>
             <w:tcW w:type="dxa" w:w="4692"/>
             <w:vAlign w:val="center"/>
+            <w:shd w:fill="F8FAFC"/>
             <w:tcMar>
               <w:top w:w="90" w:type="dxa"/>
               <w:start w:w="90" w:type="dxa"/>
@@ -6688,6 +7050,7 @@
           <w:tcPr>
             <w:tcW w:type="dxa" w:w="3988"/>
             <w:vAlign w:val="center"/>
+            <w:shd w:fill="F8FAFC"/>
             <w:tcMar>
               <w:top w:w="90" w:type="dxa"/>
               <w:start w:w="90" w:type="dxa"/>
@@ -9467,7 +9830,7 @@
                 <w:color w:val="183652"/>
                 <w:sz w:val="17"/>
               </w:rPr>
-              <w:t>指定账号仅提交 preview_token 与 idempotency_key；全账号额外提交 password 与 confirmation=SEND TO ALL。</w:t>
+              <w:t>单个/多选账号仅提交 preview_token 与 idempotency_key；全账号额外提交 password 与 confirmation=SEND TO ALL。</w:t>
             </w:r>
           </w:p>
         </w:tc>
@@ -9494,7 +9857,7 @@
                 <w:color w:val="183652"/>
                 <w:sz w:val="17"/>
               </w:rPr>
-              <w:t>来源、角色、预览会话/时限、冻结目标、全账号重认证与幂等均 fail closed。</w:t>
+              <w:t>来源、角色、预览会话/时限、冻结目标、selected 不得覆盖全服、全账号重认证与幂等均 fail closed。</w:t>
             </w:r>
           </w:p>
         </w:tc>
@@ -9762,6 +10125,23 @@
         <w:t xml:space="preserve">  "target": { "kind": "user", "user_id": "&lt;目标 user_id&gt;" },</w:t>
         <w:br/>
         <w:t xml:space="preserve">  "grant": { "type": "gacha_tickets", "amount": 10 },</w:t>
+        <w:br/>
+        <w:t xml:space="preserve">  "reason": "&lt;4–200 字可审计业务原因&gt;",</w:t>
+        <w:br/>
+        <w:t xml:space="preserve">  "idempotency_key": "&lt;UUID&gt;"</w:t>
+        <w:br/>
+        <w:t>}</w:t>
+        <w:br/>
+        <w:br/>
+        <w:t>// 多选玩家使用同一预览与同一幂等键：</w:t>
+        <w:br/>
+        <w:t>POST /api/resource-grants/preview</w:t>
+        <w:br/>
+        <w:t>{</w:t>
+        <w:br/>
+        <w:t xml:space="preserve">  "target": { "kind": "selected", "user_ids": ["&lt;user_id A&gt;", "&lt;user_id B&gt;"] },</w:t>
+        <w:br/>
+        <w:t xml:space="preserve">  "grant": { "type": "card_copies", "card_id": "&lt;合法卡牌 ID&gt;", "amount": 5 },</w:t>
         <w:br/>
         <w:t xml:space="preserve">  "reason": "&lt;4–200 字可审计业务原因&gt;",</w:t>
         <w:br/>
@@ -9940,7 +10320,7 @@
                 <w:color w:val="183652"/>
                 <w:sz w:val="17"/>
               </w:rPr>
-              <w:t>kind 仅 user/all；user 必须包含存在于最新投影的 user_id；all 必须有非空 ready 投影。</w:t>
+              <w:t>kind 仅 user/selected/all；user 必须包含一个有效 user_id；selected 必须是排序前可验证的 2..500 个唯一有效 user_id，且不得覆盖当前全部账号；all 必须有非空 ready 投影。</w:t>
             </w:r>
           </w:p>
         </w:tc>
@@ -9966,7 +10346,7 @@
                 <w:color w:val="183652"/>
                 <w:sz w:val="17"/>
               </w:rPr>
-              <w:t>命令冻结目标 user_id 列表和 target_count。</w:t>
+              <w:t>命令冻结已排序的 target_user_ids、target_count 和 targets_digest。</w:t>
             </w:r>
           </w:p>
         </w:tc>
@@ -10363,7 +10743,7 @@
                 <w:color w:val="183652"/>
                 <w:sz w:val="17"/>
               </w:rPr>
-              <w:t>只允许全账号提交；密码必须验证当前 Owner，confirmation 必须精确等于 SEND TO ALL；指定账号夹带这两个字段会被拒绝。</w:t>
+              <w:t>只允许全账号提交；密码必须验证当前 Owner，confirmation 必须精确等于 SEND TO ALL；单个或 selected 夹带这两个字段会被拒绝。</w:t>
             </w:r>
           </w:p>
         </w:tc>
@@ -10458,7 +10838,7 @@
           <w:color w:val="183652"/>
           <w:sz w:val="21"/>
         </w:rPr>
-        <w:t>服务端完成 Owner、CSRF、来源、签名预览、冻结目标、资源、原因和幂等校验后，先写不可抵赖的授权审计；全账号还必须完成 Owner 密码和 SEND TO ALL 校验。</w:t>
+        <w:t>服务端完成 Owner、CSRF、来源、签名预览、冻结目标、资源、原因和幂等校验后，先写不可抵赖的授权审计；selected 必须重验目标仍存在且不等于全服集合，全账号还必须完成 Owner 密码和 SEND TO ALL 校验。</w:t>
       </w:r>
     </w:p>
     <w:p>
@@ -11473,7 +11853,7 @@
           <w:color w:val="183652"/>
           <w:sz w:val="21"/>
         </w:rPr>
-        <w:t>执行器是唯一允许写玩家权威存档的组件。它读取账号当前 profile revision，基于命令冻结的目标逐个计算新值，并使用 compare-and-swap 提交；revision 冲突时重新读取并在有限次数内重算。任何账号都必须只有一次成功应用记录。</w:t>
+        <w:t>执行器是唯一允许写玩家权威存档的组件。它读取账号当前 profile revision，基于命令冻结的目标逐个计算新值，在提交前完成全部目标与幂等回执校验，再以一次权威存档事务写入；任一目标、revision 或持久化失败都恢复提交前内存并把整条命令标记为 failed。任何账号都必须只有一次成功应用记录。</w:t>
       </w:r>
     </w:p>
     <w:tbl>
@@ -11676,7 +12056,7 @@
                 <w:color w:val="183652"/>
                 <w:sz w:val="17"/>
               </w:rPr>
-              <w:t>全服全部成功</w:t>
+              <w:t>多选账号成功</w:t>
             </w:r>
           </w:p>
         </w:tc>
@@ -11703,7 +12083,7 @@
                 <w:color w:val="183652"/>
                 <w:sz w:val="17"/>
               </w:rPr>
-              <w:t>每个冻结目标独立 CAS；命令级汇总。</w:t>
+              <w:t>对 2..500 个冻结目标完成全量预检后，一次权威存档事务提交全部资源、revision 与命令回执。</w:t>
             </w:r>
           </w:p>
         </w:tc>
@@ -11730,7 +12110,7 @@
                 <w:color w:val="183652"/>
                 <w:sz w:val="17"/>
               </w:rPr>
-              <w:t>processed；target_count 与结果数一致。</w:t>
+              <w:t>processed；target_count 与 accounts[] 完全一致，不允许部分成功。</w:t>
             </w:r>
           </w:p>
         </w:tc>
@@ -11761,7 +12141,7 @@
                 <w:color w:val="183652"/>
                 <w:sz w:val="17"/>
               </w:rPr>
-              <w:t>revision 冲突</w:t>
+              <w:t>全服全部成功</w:t>
             </w:r>
           </w:p>
         </w:tc>
@@ -11787,7 +12167,7 @@
                 <w:color w:val="183652"/>
                 <w:sz w:val="17"/>
               </w:rPr>
-              <w:t>有限重读/重试，不复用陈旧对象覆盖。</w:t>
+              <w:t>每个冻结目标独立 CAS；命令级汇总。</w:t>
             </w:r>
           </w:p>
         </w:tc>
@@ -11813,7 +12193,7 @@
                 <w:color w:val="183652"/>
                 <w:sz w:val="17"/>
               </w:rPr>
-              <w:t>成功后 processed；耗尽后 failed 并记录安全错误码。</w:t>
+              <w:t>processed；target_count 与结果数一致。</w:t>
             </w:r>
           </w:p>
         </w:tc>
@@ -11845,7 +12225,7 @@
                 <w:color w:val="183652"/>
                 <w:sz w:val="17"/>
               </w:rPr>
-              <w:t>账号不存在/损坏</w:t>
+              <w:t>revision 冲突</w:t>
             </w:r>
           </w:p>
         </w:tc>
@@ -11872,7 +12252,7 @@
                 <w:color w:val="183652"/>
                 <w:sz w:val="17"/>
               </w:rPr>
-              <w:t>不创建影子账号，不跳过后伪称全服成功。</w:t>
+              <w:t>有限重读/重试，不复用陈旧对象覆盖。</w:t>
             </w:r>
           </w:p>
         </w:tc>
@@ -11899,7 +12279,7 @@
                 <w:color w:val="183652"/>
                 <w:sz w:val="17"/>
               </w:rPr>
-              <w:t>failed；记录可审计错误码，不泄露原始存档。</w:t>
+              <w:t>成功后 processed；耗尽后 failed 并记录安全错误码。</w:t>
             </w:r>
           </w:p>
         </w:tc>
@@ -11930,6 +12310,90 @@
                 <w:color w:val="183652"/>
                 <w:sz w:val="17"/>
               </w:rPr>
+              <w:t>账号不存在/损坏</w:t>
+            </w:r>
+          </w:p>
+        </w:tc>
+        <w:tc>
+          <w:tcPr>
+            <w:tcW w:type="dxa" w:w="4093"/>
+            <w:vAlign w:val="center"/>
+            <w:tcMar>
+              <w:top w:w="90" w:type="dxa"/>
+              <w:start w:w="90" w:type="dxa"/>
+              <w:bottom w:w="90" w:type="dxa"/>
+              <w:end w:w="90" w:type="dxa"/>
+            </w:tcMar>
+          </w:tcPr>
+          <w:p>
+            <w:pPr>
+              <w:spacing w:after="0" w:line="276" w:lineRule="auto"/>
+            </w:pPr>
+            <w:r>
+              <w:rPr>
+                <w:rFonts w:ascii="Microsoft YaHei" w:hAnsi="Microsoft YaHei" w:eastAsia="Microsoft YaHei" w:cs="Microsoft YaHei"/>
+                <w:b w:val="0"/>
+                <w:color w:val="183652"/>
+                <w:sz w:val="17"/>
+              </w:rPr>
+              <w:t>不创建影子账号，不跳过后伪称全服成功。</w:t>
+            </w:r>
+          </w:p>
+        </w:tc>
+        <w:tc>
+          <w:tcPr>
+            <w:tcW w:type="dxa" w:w="4036"/>
+            <w:vAlign w:val="center"/>
+            <w:tcMar>
+              <w:top w:w="90" w:type="dxa"/>
+              <w:start w:w="90" w:type="dxa"/>
+              <w:bottom w:w="90" w:type="dxa"/>
+              <w:end w:w="90" w:type="dxa"/>
+            </w:tcMar>
+          </w:tcPr>
+          <w:p>
+            <w:pPr>
+              <w:spacing w:after="0" w:line="276" w:lineRule="auto"/>
+            </w:pPr>
+            <w:r>
+              <w:rPr>
+                <w:rFonts w:ascii="Microsoft YaHei" w:hAnsi="Microsoft YaHei" w:eastAsia="Microsoft YaHei" w:cs="Microsoft YaHei"/>
+                <w:b w:val="0"/>
+                <w:color w:val="183652"/>
+                <w:sz w:val="17"/>
+              </w:rPr>
+              <w:t>failed；记录可审计错误码，不泄露原始存档。</w:t>
+            </w:r>
+          </w:p>
+        </w:tc>
+      </w:tr>
+      <w:tr>
+        <w:trPr>
+          <w:cantSplit/>
+        </w:trPr>
+        <w:tc>
+          <w:tcPr>
+            <w:tcW w:type="dxa" w:w="2076"/>
+            <w:vAlign w:val="center"/>
+            <w:shd w:fill="F8FAFC"/>
+            <w:tcMar>
+              <w:top w:w="90" w:type="dxa"/>
+              <w:start w:w="90" w:type="dxa"/>
+              <w:bottom w:w="90" w:type="dxa"/>
+              <w:end w:w="90" w:type="dxa"/>
+            </w:tcMar>
+          </w:tcPr>
+          <w:p>
+            <w:pPr>
+              <w:spacing w:after="0" w:line="276" w:lineRule="auto"/>
+            </w:pPr>
+            <w:r>
+              <w:rPr>
+                <w:rFonts w:ascii="Microsoft YaHei" w:hAnsi="Microsoft YaHei" w:eastAsia="Microsoft YaHei" w:cs="Microsoft YaHei"/>
+                <w:b/>
+                <w:color w:val="183652"/>
+                <w:sz w:val="17"/>
+              </w:rPr>
               <w:t>执行器崩溃重启</w:t>
             </w:r>
           </w:p>
@@ -11938,6 +12402,7 @@
           <w:tcPr>
             <w:tcW w:type="dxa" w:w="4093"/>
             <w:vAlign w:val="center"/>
+            <w:shd w:fill="F8FAFC"/>
             <w:tcMar>
               <w:top w:w="90" w:type="dxa"/>
               <w:start w:w="90" w:type="dxa"/>
@@ -11964,6 +12429,7 @@
           <w:tcPr>
             <w:tcW w:type="dxa" w:w="4036"/>
             <w:vAlign w:val="center"/>
+            <w:shd w:fill="F8FAFC"/>
             <w:tcMar>
               <w:top w:w="90" w:type="dxa"/>
               <w:start w:w="90" w:type="dxa"/>
@@ -12989,7 +13455,7 @@
                 <w:color w:val="183652"/>
                 <w:sz w:val="17"/>
               </w:rPr>
-              <w:t>服务器冻结目标、资源、原因、幂等键</w:t>
+              <w:t>服务器冻结已排序目标、摘要、资源、原因、幂等键</w:t>
             </w:r>
           </w:p>
         </w:tc>
@@ -13016,7 +13482,7 @@
                 <w:color w:val="183652"/>
                 <w:sz w:val="17"/>
               </w:rPr>
-              <w:t>指定账号同一次点击立即提交；全账号完成密码与 SEND TO ALL</w:t>
+              <w:t>单个/多选同一次点击立即提交；全账号完成密码与 SEND TO ALL</w:t>
             </w:r>
           </w:p>
         </w:tc>
@@ -14164,7 +14630,7 @@
                 <w:color w:val="183652"/>
                 <w:sz w:val="17"/>
               </w:rPr>
-              <w:t>Owner + same-origin + CSRF + signed preview + idempotency；全账号再加密码与 SEND TO ALL</w:t>
+              <w:t>Owner + same-origin + CSRF + signed preview + idempotency；selected 限 2..500 且不得覆盖全服；全账号再加密码与 SEND TO ALL</w:t>
             </w:r>
           </w:p>
         </w:tc>
@@ -14597,6 +15063,21 @@
           <w:color w:val="183652"/>
           <w:sz w:val="21"/>
         </w:rPr>
+        <w:t>资源玩家表的逐行复选框具有包含完整 user_id 的可访问名称；表头全选只作用于当前搜索结果，并通过 indeterminate 表达部分选中；搜索不得清空已选集合。</w:t>
+      </w:r>
+    </w:p>
+    <w:p>
+      <w:pPr>
+        <w:pStyle w:val="ListBullet"/>
+        <w:spacing w:after="100" w:line="307" w:lineRule="auto"/>
+      </w:pPr>
+      <w:r>
+        <w:rPr>
+          <w:rFonts w:ascii="Microsoft YaHei" w:hAnsi="Microsoft YaHei" w:eastAsia="Microsoft YaHei" w:cs="Microsoft YaHei"/>
+          <w:b w:val="0"/>
+          <w:color w:val="183652"/>
+          <w:sz w:val="21"/>
+        </w:rPr>
         <w:t>所有按钮与输入最小高度 44px；focus-visible 清晰；颜色不单独表达成功、危险或平衡信号。</w:t>
       </w:r>
     </w:p>
@@ -17806,7 +18287,7 @@
                 <w:color w:val="183652"/>
                 <w:sz w:val="17"/>
               </w:rPr>
-              <w:t>指定账号、全服、空投影、发送时目标变化。</w:t>
+              <w:t>0/1/2/29/501 选择、搜索后保留选择、全选当前结果、重复/未知 ID、selected 覆盖全服、发送时目标变化。</w:t>
             </w:r>
           </w:p>
         </w:tc>
@@ -17833,7 +18314,7 @@
                 <w:color w:val="183652"/>
                 <w:sz w:val="17"/>
               </w:rPr>
-              <w:t>指定账号一次点击完成预览+提交；全账号必须密码+SEND TO ALL；目标数准确；变化时拒绝；0 目标拒绝。</w:t>
+              <w:t>明细列与投影一致；单个/2..500 多选一次点击完成预览+提交；多选只生成一条命令并原子处理；全账号必须密码+SEND TO ALL；变化时拒绝。</w:t>
             </w:r>
           </w:p>
         </w:tc>
@@ -19420,7 +19901,7 @@
                 <w:color w:val="183652"/>
                 <w:sz w:val="17"/>
               </w:rPr>
-              <w:t>七页顺序、角色全量、列表阵容、按类型平衡、指定账号一次提交与全账号强确认流程实现。</w:t>
+              <w:t>七页顺序、角色全量、列表阵容、按类型平衡、资源页玩家明细表、持续勾选、单个/多选一次提交与全账号强确认流程实现。</w:t>
             </w:r>
           </w:p>
         </w:tc>
@@ -19595,7 +20076,7 @@
                 <w:color w:val="183652"/>
                 <w:sz w:val="17"/>
               </w:rPr>
-              <w:t>Figma v1.1 页面 10:33 与画板 10:34/10:35/10:36 已同步；v1.1.2 可编辑风格帧须在额度恢复后同步并复核；三张 v1.1 PNG 与三张 v1.1.2 本地视觉验收 PNG 保留。</w:t>
+              <w:t>Figma v1.1 页面 10:33 与画板 10:34/10:35/10:36 已同步；v1.1.2 风格帧与 v1.3 多选资源页可编辑状态继续明确为 PENDING，完成同步和逐屏复核前不得冒充设计门禁完成。</w:t>
             </w:r>
           </w:p>
         </w:tc>
@@ -19733,7 +20214,7 @@
           <w:color w:val="183652"/>
           <w:sz w:val="21"/>
         </w:rPr>
-        <w:t>只有上述完成定义全部满足，且资源指令在授权阿里云 staging 测试账号完成一次真实 processed 到账与重启幂等验证，F-ZC-ADMIN-001 v1.2.0 才可从 MATERIAL / IMPLEMENTATION_CONTRACT 进入发布验收。全账号只验证冻结目标与命令合同，不对真实玩家执行群发。</w:t>
+        <w:t>只有上述完成定义全部满足，且资源指令在授权阿里云 staging 的隔离测试账号完成一次真实 processed 到账与重启幂等验证，F-ZC-ADMIN-001 v1.3.0 才可从 MATERIAL / IMPLEMENTATION_CONTRACT 进入发布验收。本次自动验收只使用无效目标或隔离替身验证合同，不对真实玩家执行资源发放；因此在没有专用测试账号授权前，到账验证保持未完成且不得伪称。</w:t>
       </w:r>
     </w:p>
     <w:sectPr>
@@ -19826,7 +20307,7 @@
         <w:color w:val="566574"/>
         <w:sz w:val="16"/>
       </w:rPr>
-      <w:t>Jungle Law | F-ZC-ADMIN-001 v1.2.0 | MATERIAL / IMPLEMENTATION_CONTRACT</w:t>
+      <w:t>Jungle Law | F-ZC-ADMIN-001 v1.3.0 | MATERIAL / IMPLEMENTATION_CONTRACT</w:t>
     </w:r>
   </w:p>
 </w:hdr>

</xml_diff>

<commit_message>
fix(admin): surface resource grants and player names
</commit_message>
<xml_diff>
--- a/docs/ADMIN_ANALYTICS_DASHBOARD_DESIGN.docx
+++ b/docs/ADMIN_ANALYTICS_DASHBOARD_DESIGN.docx
@@ -31,7 +31,7 @@
           <w:color w:val="205C8E"/>
           <w:sz w:val="28"/>
         </w:rPr>
-        <w:t>F-ZC-ADMIN-001 · v1.3.0</w:t>
+        <w:t>F-ZC-ADMIN-001 · v1.3.1</w:t>
       </w:r>
     </w:p>
     <w:tbl>
@@ -267,7 +267,7 @@
                 <w:color w:val="183652"/>
                 <w:sz w:val="17"/>
               </w:rPr>
-              <w:t>v1.3.0</w:t>
+              <w:t>v1.3.1</w:t>
             </w:r>
           </w:p>
         </w:tc>
@@ -1557,6 +1557,141 @@
           </w:p>
         </w:tc>
       </w:tr>
+      <w:tr>
+        <w:trPr>
+          <w:cantSplit/>
+        </w:trPr>
+        <w:tc>
+          <w:tcPr>
+            <w:tcW w:type="dxa" w:w="966"/>
+            <w:vAlign w:val="center"/>
+            <w:tcMar>
+              <w:top w:w="90" w:type="dxa"/>
+              <w:start w:w="90" w:type="dxa"/>
+              <w:bottom w:w="90" w:type="dxa"/>
+              <w:end w:w="90" w:type="dxa"/>
+            </w:tcMar>
+          </w:tcPr>
+          <w:p>
+            <w:pPr>
+              <w:spacing w:after="0" w:line="276" w:lineRule="auto"/>
+            </w:pPr>
+            <w:r>
+              <w:rPr>
+                <w:rFonts w:ascii="Microsoft YaHei" w:hAnsi="Microsoft YaHei" w:eastAsia="Microsoft YaHei" w:cs="Microsoft YaHei"/>
+                <w:b/>
+                <w:color w:val="183652"/>
+                <w:sz w:val="17"/>
+              </w:rPr>
+              <w:t>v1.3.1</w:t>
+            </w:r>
+          </w:p>
+        </w:tc>
+        <w:tc>
+          <w:tcPr>
+            <w:tcW w:type="dxa" w:w="1208"/>
+            <w:vAlign w:val="center"/>
+            <w:tcMar>
+              <w:top w:w="90" w:type="dxa"/>
+              <w:start w:w="90" w:type="dxa"/>
+              <w:bottom w:w="90" w:type="dxa"/>
+              <w:end w:w="90" w:type="dxa"/>
+            </w:tcMar>
+          </w:tcPr>
+          <w:p>
+            <w:pPr>
+              <w:spacing w:after="0" w:line="276" w:lineRule="auto"/>
+            </w:pPr>
+            <w:r>
+              <w:rPr>
+                <w:rFonts w:ascii="Microsoft YaHei" w:hAnsi="Microsoft YaHei" w:eastAsia="Microsoft YaHei" w:cs="Microsoft YaHei"/>
+                <w:b w:val="0"/>
+                <w:color w:val="183652"/>
+                <w:sz w:val="17"/>
+              </w:rPr>
+              <w:t>2026-08-23</w:t>
+            </w:r>
+          </w:p>
+        </w:tc>
+        <w:tc>
+          <w:tcPr>
+            <w:tcW w:type="dxa" w:w="1751"/>
+            <w:vAlign w:val="center"/>
+            <w:tcMar>
+              <w:top w:w="90" w:type="dxa"/>
+              <w:start w:w="90" w:type="dxa"/>
+              <w:bottom w:w="90" w:type="dxa"/>
+              <w:end w:w="90" w:type="dxa"/>
+            </w:tcMar>
+          </w:tcPr>
+          <w:p>
+            <w:pPr>
+              <w:spacing w:after="0" w:line="276" w:lineRule="auto"/>
+            </w:pPr>
+            <w:r>
+              <w:rPr>
+                <w:rFonts w:ascii="Microsoft YaHei" w:hAnsi="Microsoft YaHei" w:eastAsia="Microsoft YaHei" w:cs="Microsoft YaHei"/>
+                <w:b w:val="0"/>
+                <w:color w:val="183652"/>
+                <w:sz w:val="17"/>
+              </w:rPr>
+              <w:t>MATERIAL / IMPLEMENTATION_CONTRACT</w:t>
+            </w:r>
+          </w:p>
+        </w:tc>
+        <w:tc>
+          <w:tcPr>
+            <w:tcW w:type="dxa" w:w="3744"/>
+            <w:vAlign w:val="center"/>
+            <w:tcMar>
+              <w:top w:w="90" w:type="dxa"/>
+              <w:start w:w="90" w:type="dxa"/>
+              <w:bottom w:w="90" w:type="dxa"/>
+              <w:end w:w="90" w:type="dxa"/>
+            </w:tcMar>
+          </w:tcPr>
+          <w:p>
+            <w:pPr>
+              <w:spacing w:after="0" w:line="276" w:lineRule="auto"/>
+            </w:pPr>
+            <w:r>
+              <w:rPr>
+                <w:rFonts w:ascii="Microsoft YaHei" w:hAnsi="Microsoft YaHei" w:eastAsia="Microsoft YaHei" w:cs="Microsoft YaHei"/>
+                <w:b w:val="0"/>
+                <w:color w:val="183652"/>
+                <w:sz w:val="17"/>
+              </w:rPr>
+              <w:t>修复资源主按钮被长玩家表推到首屏以下的问题；玩家、阵容和资源页优先显示/搜索用户名，缺失时显示稳定的系统临时名称。</w:t>
+            </w:r>
+          </w:p>
+        </w:tc>
+        <w:tc>
+          <w:tcPr>
+            <w:tcW w:type="dxa" w:w="2536"/>
+            <w:vAlign w:val="center"/>
+            <w:tcMar>
+              <w:top w:w="90" w:type="dxa"/>
+              <w:start w:w="90" w:type="dxa"/>
+              <w:bottom w:w="90" w:type="dxa"/>
+              <w:end w:w="90" w:type="dxa"/>
+            </w:tcMar>
+          </w:tcPr>
+          <w:p>
+            <w:pPr>
+              <w:spacing w:after="0" w:line="276" w:lineRule="auto"/>
+            </w:pPr>
+            <w:r>
+              <w:rPr>
+                <w:rFonts w:ascii="Microsoft YaHei" w:hAnsi="Microsoft YaHei" w:eastAsia="Microsoft YaHei" w:cs="Microsoft YaHei"/>
+                <w:b w:val="0"/>
+                <w:color w:val="183652"/>
+                <w:sz w:val="17"/>
+              </w:rPr>
+              <w:t>沿用 v1.3 组件；操作卡与玩家表桌面并列、窄屏操作卡在表前；可编辑 v1.3.1 状态仍为 PENDING。</w:t>
+            </w:r>
+          </w:p>
+        </w:tc>
+      </w:tr>
     </w:tbl>
     <w:p>
       <w:pPr>
@@ -1589,7 +1724,7 @@
           <w:color w:val="183652"/>
           <w:sz w:val="21"/>
         </w:rPr>
-        <w:t>本文件是 F-ZC-ADMIN-001 v1.3.0 的 MATERIAL / IMPLEMENTATION_CONTRACT。它约束产品、前端、后台 API、战斗统计采集、资源命令执行器、阿里云部署和 QA；实现与本文件冲突时，必须先完成正式变更评审并同步本文与可编辑设计源。</w:t>
+        <w:t>本文件是 F-ZC-ADMIN-001 v1.3.1 的 MATERIAL / IMPLEMENTATION_CONTRACT。它约束产品、前端、后台 API、战斗统计采集、资源命令执行器、阿里云部署和 QA；实现与本文件冲突时，必须先完成正式变更评审并同步本文与可编辑设计源。</w:t>
       </w:r>
     </w:p>
     <w:p>
@@ -1634,7 +1769,7 @@
           <w:color w:val="183652"/>
           <w:sz w:val="21"/>
         </w:rPr>
-        <w:t>角色页显示当前脱敏投影中的所有账号；Owner 可点击账号直接进入该账号的资源发放。</w:t>
+        <w:t>角色页显示当前脱敏投影中的所有账号，并优先显示允许重名的玩家用户名；缺失用户名时使用新玩家+user_id 后缀的稳定临时名称。Owner 可点击玩家直接进入资源发放。</w:t>
       </w:r>
     </w:p>
     <w:p>
@@ -1664,7 +1799,7 @@
           <w:color w:val="183652"/>
           <w:sz w:val="21"/>
         </w:rPr>
-        <w:t>资源页直接展示每个玩家的完整 user_id、脱敏账号、段位/星数/Elo、阵容卡数、抽卡券、卡牌总份数、更新时间与 profile revision，并支持搜索后勾选一个或多个玩家。</w:t>
+        <w:t>资源页在首屏同时呈现玩家选择与资源操作卡，主按钮不得被长表格推到首屏以下；表格直接展示玩家名称、完整 user_id、段位/星数/Elo、抽卡券和阵容卡数，并支持按名称或 ID 搜索后勾选一个或多个玩家。</w:t>
       </w:r>
     </w:p>
     <w:p>
@@ -2600,7 +2735,7 @@
           <w:color w:val="183652"/>
           <w:sz w:val="21"/>
         </w:rPr>
-        <w:t>角色：当前投影内全部账号、本地搜索和账号行直达发放，不做客户端分页截断。</w:t>
+        <w:t>角色：当前投影内全部账号、玩家名称与完整 ID、本地搜索和账号行直达发放，不做客户端分页截断。</w:t>
       </w:r>
     </w:p>
     <w:p>
@@ -2630,7 +2765,7 @@
           <w:color w:val="183652"/>
           <w:sz w:val="21"/>
         </w:rPr>
-        <w:t>Owner 资源发放：玩家明细表持续勾选，单个/多选玩家一次提交；全部账号保留密码重认证与 SEND TO ALL；三种范围均含原因、幂等键与终态回执。</w:t>
+        <w:t>Owner 资源发放：首屏可见操作卡与主按钮、玩家名称明细表持续勾选，单个/多选玩家一次提交；全部账号保留密码重认证与 SEND TO ALL；三种范围均含原因、幂等键与终态回执。</w:t>
       </w:r>
     </w:p>
     <w:p>
@@ -3754,7 +3889,7 @@
                 <w:color w:val="183652"/>
                 <w:sz w:val="17"/>
               </w:rPr>
-              <w:t>资源页直接呈现玩家明细表；Owner 可搜索、逐行勾选、全选当前结果或清空选择。</w:t>
+              <w:t>资源页首屏同时呈现玩家表与资源操作卡；Owner 可按玩家名称、完整 ID 或脱敏账号搜索、逐行勾选、全选当前结果或清空选择。</w:t>
             </w:r>
           </w:p>
         </w:tc>
@@ -3780,7 +3915,7 @@
                 <w:color w:val="183652"/>
                 <w:sz w:val="17"/>
               </w:rPr>
-              <w:t>搜索不清除已勾选玩家；页面持续显示“已选择 X / 全部 N”。</w:t>
+              <w:t>搜索不清除已勾选玩家；页面持续显示已选择 X / 全部 N；临时名称明确标记。</w:t>
             </w:r>
           </w:p>
         </w:tc>
@@ -3806,7 +3941,7 @@
                 <w:color w:val="183652"/>
                 <w:sz w:val="17"/>
               </w:rPr>
-              <w:t>不得只显示下拉框、截断完整 user_id，或把隐藏分页当作全选。</w:t>
+              <w:t>不得只显示下拉框、截断完整 user_id、把按钮放到长表格之后，或把隐藏分页当作全选。</w:t>
             </w:r>
           </w:p>
         </w:tc>
@@ -3865,7 +4000,7 @@
                 <w:color w:val="183652"/>
                 <w:sz w:val="17"/>
               </w:rPr>
-              <w:t>填写资源、数量和原因后点击一次“确认发放”；前端取得服务器签名预览后，用同一幂等键立即提交。</w:t>
+              <w:t>操作卡填写资源、数量和原因；按钮始终可见，选择为空时明确禁用；选择有效后点击一次发放资源。</w:t>
             </w:r>
           </w:p>
         </w:tc>
@@ -4930,7 +5065,7 @@
           <w:color w:val="183652"/>
           <w:sz w:val="21"/>
         </w:rPr>
-        <w:t>角色页展示 admin_accounts_snapshot.json 中全部脱敏账号，不以是否有战斗样本或是否保存非空阵容作为过滤条件。支持本地搜索且不做客户端分页截断；Owner 可从任一账号行点击“发放资源”，资源页随即预选该 user_id。Analyst 只能查看，服务端仍拒绝其资源写请求。</w:t>
+        <w:t>角色页展示 admin_accounts_snapshot.json 中全部脱敏账号，不以是否有战斗样本或是否保存非空阵容作为过滤条件。身份列优先显示白名单字段 username；字段缺失或非法时显示基于 user_id 后缀生成的稳定新玩家XXXX，并标记系统临时名称，不得回退显示原始登录 account。支持按玩家名称、完整 user_id 或脱敏账号本地搜索且不做客户端分页截断；Owner 可从任一玩家行点击发放资源，资源页随即预选该 user_id。Analyst 只能查看，服务端仍拒绝其资源写请求。</w:t>
       </w:r>
     </w:p>
     <w:p>
@@ -5049,7 +5184,7 @@
           <w:color w:val="183652"/>
           <w:sz w:val="21"/>
         </w:rPr>
-        <w:t>资源页首先加载账号投影并把全部玩家直接呈现在可搜索、可勾选的数据表中，不再用目标范围和账号下拉框遮蔽玩家数据。表格列固定为：勾选、完整 user_id、脱敏账号、段位/星数/Elo、阵容卡数、抽卡券、卡牌总份数、投影更新时间、profile revision。完整 user_id 不做省略；窄屏以 data-label 卡片换行呈现，不引入页面级横向滚动。</w:t>
+        <w:t>资源页首先加载账号投影。桌面端使用左侧玩家表+右侧资源操作卡的主次布局，右侧卡片在当前视口保持可见；窄屏把操作卡放到玩家表之前。主按钮必须始终渲染，未选择玩家或选择超限时明确禁用并给出状态，禁止由表格高度决定按钮是否可见。玩家表固定为决策所需列：勾选、玩家名称、完整 user_id、段位/星数/Elo、抽卡券、阵容卡数；低优先级数据仍保留在角色/详情数据中，不占用发放主流程。</w:t>
       </w:r>
     </w:p>
     <w:p>
@@ -6359,6 +6494,116 @@
                 <w:color w:val="183652"/>
                 <w:sz w:val="17"/>
               </w:rPr>
+              <w:t>v1.3.1 操作卡与玩家名称</w:t>
+            </w:r>
+          </w:p>
+        </w:tc>
+        <w:tc>
+          <w:tcPr>
+            <w:tcW w:type="dxa" w:w="1671"/>
+            <w:vAlign w:val="center"/>
+            <w:tcMar>
+              <w:top w:w="90" w:type="dxa"/>
+              <w:start w:w="90" w:type="dxa"/>
+              <w:bottom w:w="90" w:type="dxa"/>
+              <w:end w:w="90" w:type="dxa"/>
+            </w:tcMar>
+          </w:tcPr>
+          <w:p>
+            <w:pPr>
+              <w:spacing w:after="0" w:line="276" w:lineRule="auto"/>
+            </w:pPr>
+            <w:r>
+              <w:rPr>
+                <w:rFonts w:ascii="Microsoft YaHei" w:hAnsi="Microsoft YaHei" w:eastAsia="Microsoft YaHei" w:cs="Microsoft YaHei"/>
+                <w:b w:val="0"/>
+                <w:color w:val="183652"/>
+                <w:sz w:val="17"/>
+              </w:rPr>
+              <w:t>待分配</w:t>
+            </w:r>
+          </w:p>
+        </w:tc>
+        <w:tc>
+          <w:tcPr>
+            <w:tcW w:type="dxa" w:w="2089"/>
+            <w:vAlign w:val="center"/>
+            <w:tcMar>
+              <w:top w:w="90" w:type="dxa"/>
+              <w:start w:w="90" w:type="dxa"/>
+              <w:bottom w:w="90" w:type="dxa"/>
+              <w:end w:w="90" w:type="dxa"/>
+            </w:tcMar>
+          </w:tcPr>
+          <w:p>
+            <w:pPr>
+              <w:spacing w:after="0" w:line="276" w:lineRule="auto"/>
+            </w:pPr>
+            <w:r>
+              <w:rPr>
+                <w:rFonts w:ascii="Microsoft YaHei" w:hAnsi="Microsoft YaHei" w:eastAsia="Microsoft YaHei" w:cs="Microsoft YaHei"/>
+                <w:b w:val="0"/>
+                <w:color w:val="183652"/>
+                <w:sz w:val="17"/>
+              </w:rPr>
+              <w:t>PENDING：可编辑设计未同步</w:t>
+            </w:r>
+          </w:p>
+        </w:tc>
+        <w:tc>
+          <w:tcPr>
+            <w:tcW w:type="dxa" w:w="4714"/>
+            <w:vAlign w:val="center"/>
+            <w:tcMar>
+              <w:top w:w="90" w:type="dxa"/>
+              <w:start w:w="90" w:type="dxa"/>
+              <w:bottom w:w="90" w:type="dxa"/>
+              <w:end w:w="90" w:type="dxa"/>
+            </w:tcMar>
+          </w:tcPr>
+          <w:p>
+            <w:pPr>
+              <w:spacing w:after="0" w:line="276" w:lineRule="auto"/>
+            </w:pPr>
+            <w:r>
+              <w:rPr>
+                <w:rFonts w:ascii="Microsoft YaHei" w:hAnsi="Microsoft YaHei" w:eastAsia="Microsoft YaHei" w:cs="Microsoft YaHei"/>
+                <w:b w:val="0"/>
+                <w:color w:val="183652"/>
+                <w:sz w:val="17"/>
+              </w:rPr>
+              <w:t>按制作人截图修复首屏主操作层级，并补玩家名称/临时名称状态；浏览器证据不能冒充可编辑设计源。</w:t>
+            </w:r>
+          </w:p>
+        </w:tc>
+      </w:tr>
+      <w:tr>
+        <w:trPr>
+          <w:cantSplit/>
+        </w:trPr>
+        <w:tc>
+          <w:tcPr>
+            <w:tcW w:type="dxa" w:w="1731"/>
+            <w:vAlign w:val="center"/>
+            <w:shd w:fill="F8FAFC"/>
+            <w:tcMar>
+              <w:top w:w="90" w:type="dxa"/>
+              <w:start w:w="90" w:type="dxa"/>
+              <w:bottom w:w="90" w:type="dxa"/>
+              <w:end w:w="90" w:type="dxa"/>
+            </w:tcMar>
+          </w:tcPr>
+          <w:p>
+            <w:pPr>
+              <w:spacing w:after="0" w:line="276" w:lineRule="auto"/>
+            </w:pPr>
+            <w:r>
+              <w:rPr>
+                <w:rFonts w:ascii="Microsoft YaHei" w:hAnsi="Microsoft YaHei" w:eastAsia="Microsoft YaHei" w:cs="Microsoft YaHei"/>
+                <w:b/>
+                <w:color w:val="183652"/>
+                <w:sz w:val="17"/>
+              </w:rPr>
               <w:t>任务/权限</w:t>
             </w:r>
           </w:p>
@@ -6367,6 +6612,7 @@
           <w:tcPr>
             <w:tcW w:type="dxa" w:w="1671"/>
             <w:vAlign w:val="center"/>
+            <w:shd w:fill="F8FAFC"/>
             <w:tcMar>
               <w:top w:w="90" w:type="dxa"/>
               <w:start w:w="90" w:type="dxa"/>
@@ -6393,6 +6639,7 @@
           <w:tcPr>
             <w:tcW w:type="dxa" w:w="2089"/>
             <w:vAlign w:val="center"/>
+            <w:shd w:fill="F8FAFC"/>
             <w:tcMar>
               <w:top w:w="90" w:type="dxa"/>
               <w:start w:w="90" w:type="dxa"/>
@@ -6419,6 +6666,7 @@
           <w:tcPr>
             <w:tcW w:type="dxa" w:w="4714"/>
             <w:vAlign w:val="center"/>
+            <w:shd w:fill="F8FAFC"/>
             <w:tcMar>
               <w:top w:w="90" w:type="dxa"/>
               <w:start w:w="90" w:type="dxa"/>
@@ -6931,7 +7179,7 @@
                 <w:color w:val="183652"/>
                 <w:sz w:val="17"/>
               </w:rPr>
-              <w:t>资源玩家表</w:t>
+              <w:t>资源主流程</w:t>
             </w:r>
           </w:p>
         </w:tc>
@@ -6957,7 +7205,7 @@
                 <w:color w:val="183652"/>
                 <w:sz w:val="17"/>
               </w:rPr>
-              <w:t>表格优先占满主内容宽度；搜索、选择计数、全选当前结果和清空选择置于同一工具栏；选中行同时用复选框、底色和文字状态表达。</w:t>
+              <w:t>桌面左表右操作卡，操作卡可粘附且主按钮首屏可见；窄屏操作卡先于玩家表。玩家表优先显示名称与完整 ID，搜索、选择计数、全选当前结果和清空选择位于同一工具栏。</w:t>
             </w:r>
           </w:p>
         </w:tc>
@@ -6983,7 +7231,7 @@
                 <w:color w:val="183652"/>
                 <w:sz w:val="17"/>
               </w:rPr>
-              <w:t>把玩家重新藏回下拉框、仅用颜色表示选中、搜索后丢失选择，或省略完整 user_id。</w:t>
+              <w:t>把玩家重新藏回下拉框、把主按钮放到长表格后面、仅用颜色表示选中、搜索后丢失选择，或省略完整 user_id。</w:t>
             </w:r>
           </w:p>
         </w:tc>
@@ -8802,7 +9050,7 @@
                 <w:color w:val="183652"/>
                 <w:sz w:val="17"/>
               </w:rPr>
-              <w:t>masked_account</w:t>
+              <w:t>username</w:t>
             </w:r>
           </w:p>
         </w:tc>
@@ -8829,7 +9077,7 @@
                 <w:color w:val="183652"/>
                 <w:sz w:val="17"/>
               </w:rPr>
-              <w:t>脱敏后的账号显示名。</w:t>
+              <w:t>允许重名、可修改的玩家名称。</w:t>
             </w:r>
           </w:p>
         </w:tc>
@@ -8856,7 +9104,7 @@
                 <w:color w:val="183652"/>
                 <w:sz w:val="17"/>
               </w:rPr>
-              <w:t>列表主身份；不可反推出凭据。</w:t>
+              <w:t>仅接受服务端快照白名单值；控制字符与超长值被清洗；不得作为登录键。</w:t>
             </w:r>
           </w:p>
         </w:tc>
@@ -8887,7 +9135,7 @@
                 <w:color w:val="183652"/>
                 <w:sz w:val="17"/>
               </w:rPr>
-              <w:t>updated_at_unix</w:t>
+              <w:t>masked_account</w:t>
             </w:r>
           </w:p>
         </w:tc>
@@ -8913,7 +9161,7 @@
                 <w:color w:val="183652"/>
                 <w:sz w:val="17"/>
               </w:rPr>
-              <w:t>账号投影更新时间。</w:t>
+              <w:t>脱敏后的登录账号摘要。</w:t>
             </w:r>
           </w:p>
         </w:tc>
@@ -8939,7 +9187,7 @@
                 <w:color w:val="183652"/>
                 <w:sz w:val="17"/>
               </w:rPr>
-              <w:t>显示陈旧性；不作为 CAS revision。</w:t>
+              <w:t>只作辅助核对；不可反推出凭据，不再作为列表主身份。</w:t>
             </w:r>
           </w:p>
         </w:tc>
@@ -8971,7 +9219,7 @@
                 <w:color w:val="183652"/>
                 <w:sz w:val="17"/>
               </w:rPr>
-              <w:t>deck / card_levels</w:t>
+              <w:t>updated_at_unix</w:t>
             </w:r>
           </w:p>
         </w:tc>
@@ -8998,7 +9246,7 @@
                 <w:color w:val="183652"/>
                 <w:sz w:val="17"/>
               </w:rPr>
-              <w:t>当前保存阵容与对应卡牌等级。</w:t>
+              <w:t>账号投影更新时间。</w:t>
             </w:r>
           </w:p>
         </w:tc>
@@ -9025,7 +9273,7 @@
                 <w:color w:val="183652"/>
                 <w:sz w:val="17"/>
               </w:rPr>
-              <w:t>卡牌 ID 白名单；等级范围清洗。</w:t>
+              <w:t>显示陈旧性；不作为 CAS revision。</w:t>
             </w:r>
           </w:p>
         </w:tc>
@@ -9056,7 +9304,7 @@
                 <w:color w:val="183652"/>
                 <w:sz w:val="17"/>
               </w:rPr>
-              <w:t>rank_mirrors</w:t>
+              <w:t>deck / card_levels</w:t>
             </w:r>
           </w:p>
         </w:tc>
@@ -9082,7 +9330,7 @@
                 <w:color w:val="183652"/>
                 <w:sz w:val="17"/>
               </w:rPr>
-              <w:t>各段位的镜像阵容集合。</w:t>
+              <w:t>当前保存阵容与对应卡牌等级。</w:t>
             </w:r>
           </w:p>
         </w:tc>
@@ -9108,7 +9356,7 @@
                 <w:color w:val="183652"/>
                 <w:sz w:val="17"/>
               </w:rPr>
-              <w:t>限制每段位数量与字段长度。</w:t>
+              <w:t>卡牌 ID 白名单；等级范围清洗。</w:t>
             </w:r>
           </w:p>
         </w:tc>
@@ -9140,7 +9388,7 @@
                 <w:color w:val="183652"/>
                 <w:sz w:val="17"/>
               </w:rPr>
-              <w:t>rank</w:t>
+              <w:t>rank_mirrors</w:t>
             </w:r>
           </w:p>
         </w:tc>
@@ -9167,7 +9415,7 @@
                 <w:color w:val="183652"/>
                 <w:sz w:val="17"/>
               </w:rPr>
-              <w:t>rank_key、rank_stars、elo。</w:t>
+              <w:t>各段位的镜像阵容集合。</w:t>
             </w:r>
           </w:p>
         </w:tc>
@@ -9194,7 +9442,7 @@
                 <w:color w:val="183652"/>
                 <w:sz w:val="17"/>
               </w:rPr>
-              <w:t>仅运营展示。</w:t>
+              <w:t>限制每段位数量与字段长度。</w:t>
             </w:r>
           </w:p>
         </w:tc>
@@ -9225,6 +9473,90 @@
                 <w:color w:val="183652"/>
                 <w:sz w:val="17"/>
               </w:rPr>
+              <w:t>rank</w:t>
+            </w:r>
+          </w:p>
+        </w:tc>
+        <w:tc>
+          <w:tcPr>
+            <w:tcW w:type="dxa" w:w="3911"/>
+            <w:vAlign w:val="center"/>
+            <w:tcMar>
+              <w:top w:w="90" w:type="dxa"/>
+              <w:start w:w="90" w:type="dxa"/>
+              <w:bottom w:w="90" w:type="dxa"/>
+              <w:end w:w="90" w:type="dxa"/>
+            </w:tcMar>
+          </w:tcPr>
+          <w:p>
+            <w:pPr>
+              <w:spacing w:after="0" w:line="276" w:lineRule="auto"/>
+            </w:pPr>
+            <w:r>
+              <w:rPr>
+                <w:rFonts w:ascii="Microsoft YaHei" w:hAnsi="Microsoft YaHei" w:eastAsia="Microsoft YaHei" w:cs="Microsoft YaHei"/>
+                <w:b w:val="0"/>
+                <w:color w:val="183652"/>
+                <w:sz w:val="17"/>
+              </w:rPr>
+              <w:t>rank_key、rank_stars、elo。</w:t>
+            </w:r>
+          </w:p>
+        </w:tc>
+        <w:tc>
+          <w:tcPr>
+            <w:tcW w:type="dxa" w:w="4216"/>
+            <w:vAlign w:val="center"/>
+            <w:tcMar>
+              <w:top w:w="90" w:type="dxa"/>
+              <w:start w:w="90" w:type="dxa"/>
+              <w:bottom w:w="90" w:type="dxa"/>
+              <w:end w:w="90" w:type="dxa"/>
+            </w:tcMar>
+          </w:tcPr>
+          <w:p>
+            <w:pPr>
+              <w:spacing w:after="0" w:line="276" w:lineRule="auto"/>
+            </w:pPr>
+            <w:r>
+              <w:rPr>
+                <w:rFonts w:ascii="Microsoft YaHei" w:hAnsi="Microsoft YaHei" w:eastAsia="Microsoft YaHei" w:cs="Microsoft YaHei"/>
+                <w:b w:val="0"/>
+                <w:color w:val="183652"/>
+                <w:sz w:val="17"/>
+              </w:rPr>
+              <w:t>仅运营展示。</w:t>
+            </w:r>
+          </w:p>
+        </w:tc>
+      </w:tr>
+      <w:tr>
+        <w:trPr>
+          <w:cantSplit/>
+        </w:trPr>
+        <w:tc>
+          <w:tcPr>
+            <w:tcW w:type="dxa" w:w="2078"/>
+            <w:vAlign w:val="center"/>
+            <w:shd w:fill="F8FAFC"/>
+            <w:tcMar>
+              <w:top w:w="90" w:type="dxa"/>
+              <w:start w:w="90" w:type="dxa"/>
+              <w:bottom w:w="90" w:type="dxa"/>
+              <w:end w:w="90" w:type="dxa"/>
+            </w:tcMar>
+          </w:tcPr>
+          <w:p>
+            <w:pPr>
+              <w:spacing w:after="0" w:line="276" w:lineRule="auto"/>
+            </w:pPr>
+            <w:r>
+              <w:rPr>
+                <w:rFonts w:ascii="Microsoft YaHei" w:hAnsi="Microsoft YaHei" w:eastAsia="Microsoft YaHei" w:cs="Microsoft YaHei"/>
+                <w:b/>
+                <w:color w:val="183652"/>
+                <w:sz w:val="17"/>
+              </w:rPr>
               <w:t>resources</w:t>
             </w:r>
           </w:p>
@@ -9233,6 +9565,7 @@
           <w:tcPr>
             <w:tcW w:type="dxa" w:w="3911"/>
             <w:vAlign w:val="center"/>
+            <w:shd w:fill="F8FAFC"/>
             <w:tcMar>
               <w:top w:w="90" w:type="dxa"/>
               <w:start w:w="90" w:type="dxa"/>
@@ -9259,6 +9592,7 @@
           <w:tcPr>
             <w:tcW w:type="dxa" w:w="4216"/>
             <w:vAlign w:val="center"/>
+            <w:shd w:fill="F8FAFC"/>
             <w:tcMar>
               <w:top w:w="90" w:type="dxa"/>
               <w:start w:w="90" w:type="dxa"/>
@@ -9608,7 +9942,7 @@
                 <w:color w:val="183652"/>
                 <w:sz w:val="17"/>
               </w:rPr>
-              <w:t>返回 availability、generated_at_unix、accounts[]；每项含 user_id、masked_account、updated_at_unix、deck、card_levels、rank_mirrors、rank、resources。</w:t>
+              <w:t>返回 availability、generated_at_unix、accounts[]；每项含 user_id、username、masked_account、updated_at_unix、deck、card_levels、rank_mirrors、rank、resources。</w:t>
             </w:r>
           </w:p>
         </w:tc>
@@ -9635,7 +9969,7 @@
                 <w:color w:val="183652"/>
                 <w:sz w:val="17"/>
               </w:rPr>
-              <w:t>字段白名单、大小限制、去重、稳定排序。</w:t>
+              <w:t>字段白名单、大小限制、控制字符清洗、去重、稳定排序；禁止返回 account/密码材料。</w:t>
             </w:r>
           </w:p>
         </w:tc>
@@ -15063,7 +15397,7 @@
           <w:color w:val="183652"/>
           <w:sz w:val="21"/>
         </w:rPr>
-        <w:t>资源玩家表的逐行复选框具有包含完整 user_id 的可访问名称；表头全选只作用于当前搜索结果，并通过 indeterminate 表达部分选中；搜索不得清空已选集合。</w:t>
+        <w:t>资源玩家表的逐行复选框具有包含玩家名称与完整 user_id 的可访问名称；表头全选只作用于当前搜索结果，并通过 indeterminate 表达部分选中；搜索不得清空已选集合；主按钮的禁用状态和原因可被读屏理解。</w:t>
       </w:r>
     </w:p>
     <w:p>
@@ -18175,7 +18509,7 @@
                 <w:color w:val="183652"/>
                 <w:sz w:val="17"/>
               </w:rPr>
-              <w:t>0、1、13、100000 账号，搜索、角色行直达发放、段位排序、中文卡名。</w:t>
+              <w:t>0、1、13、100000 账号，合法/非法/缺失 username，按名称/ID 搜索、角色行直达发放、段位排序、中文卡名。</w:t>
             </w:r>
           </w:p>
         </w:tc>
@@ -18201,7 +18535,7 @@
                 <w:color w:val="183652"/>
                 <w:sz w:val="17"/>
               </w:rPr>
-              <w:t>账号全量、Owner 预选正确；阵容紧凑列表且 rank/stars/elo/user_id 稳定排序。</w:t>
+              <w:t>名称优先且不泄露 account；缺失时稳定临时名称；账号全量、Owner 预选正确；阵容稳定排序。</w:t>
             </w:r>
           </w:p>
         </w:tc>
@@ -18287,7 +18621,7 @@
                 <w:color w:val="183652"/>
                 <w:sz w:val="17"/>
               </w:rPr>
-              <w:t>0/1/2/29/501 选择、搜索后保留选择、全选当前结果、重复/未知 ID、selected 覆盖全服、发送时目标变化。</w:t>
+              <w:t>首屏按钮可见、0/1/2/29/501 选择、搜索后保留选择、全选当前结果、重复/未知 ID、selected 覆盖全服、发送时目标变化。</w:t>
             </w:r>
           </w:p>
         </w:tc>
@@ -18314,7 +18648,7 @@
                 <w:color w:val="183652"/>
                 <w:sz w:val="17"/>
               </w:rPr>
-              <w:t>明细列与投影一致；单个/2..500 多选一次点击完成预览+提交；多选只生成一条命令并原子处理；全账号必须密码+SEND TO ALL；变化时拒绝。</w:t>
+              <w:t>桌面同屏看到玩家表和操作卡，窄屏操作卡在表前；单个/2..500 多选一次点击完成预览+提交；全账号必须密码+SEND TO ALL；变化时拒绝。</w:t>
             </w:r>
           </w:p>
         </w:tc>
@@ -19901,7 +20235,7 @@
                 <w:color w:val="183652"/>
                 <w:sz w:val="17"/>
               </w:rPr>
-              <w:t>七页顺序、角色全量、列表阵容、按类型平衡、资源页玩家明细表、持续勾选、单个/多选一次提交与全账号强确认流程实现。</w:t>
+              <w:t>七页顺序、角色全量与玩家名称、列表阵容、按类型平衡、资源页首屏可见操作卡与玩家表、持续勾选、单个/多选一次提交与全账号强确认流程实现。</w:t>
             </w:r>
           </w:p>
         </w:tc>
@@ -20214,7 +20548,7 @@
           <w:color w:val="183652"/>
           <w:sz w:val="21"/>
         </w:rPr>
-        <w:t>只有上述完成定义全部满足，且资源指令在授权阿里云 staging 的隔离测试账号完成一次真实 processed 到账与重启幂等验证，F-ZC-ADMIN-001 v1.3.0 才可从 MATERIAL / IMPLEMENTATION_CONTRACT 进入发布验收。本次自动验收只使用无效目标或隔离替身验证合同，不对真实玩家执行资源发放；因此在没有专用测试账号授权前，到账验证保持未完成且不得伪称。</w:t>
+        <w:t>只有上述完成定义全部满足，且资源指令在授权阿里云 staging 的隔离测试账号完成一次真实 processed 到账与重启幂等验证，F-ZC-ADMIN-001 v1.3.1 才可从 MATERIAL / IMPLEMENTATION_CONTRACT 进入发布验收。本次自动验收不对真实玩家执行资源发放；因此在没有专用测试账号授权前，到账验证保持未完成且不得伪称。</w:t>
       </w:r>
     </w:p>
     <w:sectPr>
@@ -20307,7 +20641,7 @@
         <w:color w:val="566574"/>
         <w:sz w:val="16"/>
       </w:rPr>
-      <w:t>Jungle Law | F-ZC-ADMIN-001 v1.3.0 | MATERIAL / IMPLEMENTATION_CONTRACT</w:t>
+      <w:t>Jungle Law | F-ZC-ADMIN-001 v1.3.1 | MATERIAL / IMPLEMENTATION_CONTRACT</w:t>
     </w:r>
   </w:p>
 </w:hdr>

</xml_diff>